<commit_message>
Add UC.md use-case diagram and specs
Create UC.md documenting the system's use-case diagram and specifications (in Vietnamese). Includes a Mermaid flowchart with actors (User, Google/Firebase Auth, AI Gemini) and grouped use-cases for Account, Group, Transactions, Debt Settlement, Savings, and AI Assistant, plus detailed descriptions of key features such as group management, transaction recording, automated debt settlement, savings goals, and AI-powered financial advice. This file serves as design documentation for the expense management system.
</commit_message>
<xml_diff>
--- a/Nhom12_DeTai6_NguyenMinhTri.docx
+++ b/Nhom12_DeTai6_NguyenMinhTri.docx
@@ -7319,6 +7319,7 @@
     <w:p>
       <w:pPr>
         <w:pStyle w:val="Heading3"/>
+        <w:spacing w:before="120" w:after="120" w:line="312" w:lineRule="auto"/>
         <w:jc w:val="both"/>
         <w:rPr>
           <w:sz w:val="28"/>
@@ -7332,12 +7333,104 @@
           <w:szCs w:val="28"/>
           <w:lang w:val="vi-VN"/>
         </w:rPr>
-        <w:t>1.2.2. Đặc tả Quy trình chế biến Viên Nang</w:t>
+        <w:t xml:space="preserve">1.2.2. Đặc tả </w:t>
+      </w:r>
+      <w:r>
+        <w:rPr>
+          <w:sz w:val="28"/>
+          <w:szCs w:val="28"/>
+          <w:lang w:val="vi-VN"/>
+        </w:rPr>
+        <w:t>q</w:t>
+      </w:r>
+      <w:r>
+        <w:rPr>
+          <w:sz w:val="28"/>
+          <w:szCs w:val="28"/>
+          <w:lang w:val="vi-VN"/>
+        </w:rPr>
+        <w:t xml:space="preserve">uy trình </w:t>
       </w:r>
       <w:bookmarkEnd w:id="11"/>
-    </w:p>
-    <w:p>
-      <w:pPr>
+      <w:r>
+        <w:rPr>
+          <w:sz w:val="28"/>
+          <w:szCs w:val="28"/>
+          <w:lang w:val="vi-VN"/>
+        </w:rPr>
+        <w:t>quản lý chi tiêu</w:t>
+      </w:r>
+    </w:p>
+    <w:p>
+      <w:pPr>
+        <w:spacing w:before="120" w:after="120" w:line="312" w:lineRule="auto"/>
+        <w:rPr>
+          <w:sz w:val="26"/>
+          <w:szCs w:val="26"/>
+          <w:lang w:val="vi-VN"/>
+        </w:rPr>
+      </w:pPr>
+      <w:bookmarkStart w:id="12" w:name="_Toc230888306"/>
+      <w:r>
+        <w:rPr>
+          <w:sz w:val="26"/>
+          <w:szCs w:val="26"/>
+          <w:lang w:val="vi-VN"/>
+        </w:rPr>
+        <w:t xml:space="preserve">1. Tổ chức </w:t>
+      </w:r>
+      <w:r>
+        <w:rPr>
+          <w:sz w:val="26"/>
+          <w:szCs w:val="26"/>
+          <w:lang w:val="vi-VN"/>
+        </w:rPr>
+        <w:t>k</w:t>
+      </w:r>
+      <w:r>
+        <w:rPr>
+          <w:sz w:val="26"/>
+          <w:szCs w:val="26"/>
+          <w:lang w:val="vi-VN"/>
+        </w:rPr>
+        <w:t>hông gian làm việc (</w:t>
+      </w:r>
+      <w:r>
+        <w:rPr>
+          <w:sz w:val="26"/>
+          <w:szCs w:val="26"/>
+          <w:lang w:val="vi-VN"/>
+        </w:rPr>
+        <w:t>m</w:t>
+      </w:r>
+      <w:r>
+        <w:rPr>
+          <w:sz w:val="26"/>
+          <w:szCs w:val="26"/>
+          <w:lang w:val="vi-VN"/>
+        </w:rPr>
+        <w:t xml:space="preserve">ô hình </w:t>
+      </w:r>
+      <w:r>
+        <w:rPr>
+          <w:sz w:val="26"/>
+          <w:szCs w:val="26"/>
+          <w:lang w:val="vi-VN"/>
+        </w:rPr>
+        <w:t>b</w:t>
+      </w:r>
+      <w:r>
+        <w:rPr>
+          <w:sz w:val="26"/>
+          <w:szCs w:val="26"/>
+          <w:lang w:val="vi-VN"/>
+        </w:rPr>
+        <w:t>ình đẳng)</w:t>
+      </w:r>
+    </w:p>
+    <w:p>
+      <w:pPr>
+        <w:spacing w:before="120" w:after="120" w:line="312" w:lineRule="auto"/>
         <w:ind w:firstLine="720"/>
         <w:rPr>
           <w:sz w:val="26"/>
@@ -7345,18 +7438,105 @@
           <w:lang w:val="vi-VN"/>
         </w:rPr>
       </w:pPr>
-      <w:bookmarkStart w:id="12" w:name="_Toc230888306"/>
-      <w:r>
-        <w:rPr>
-          <w:sz w:val="26"/>
-          <w:szCs w:val="26"/>
-          <w:lang w:val="vi-VN"/>
-        </w:rPr>
-        <w:t>Quy trình hoạt động của hệ thống được thiết kế tinh gọn, bám sát vào nhu cầu thực tế của các nhóm bạn bè/gia đình, bao gồm các bước nghiệp vụ sau:</w:t>
-      </w:r>
-    </w:p>
-    <w:p>
-      <w:pPr>
+      <w:r>
+        <w:rPr>
+          <w:sz w:val="26"/>
+          <w:szCs w:val="26"/>
+          <w:lang w:val="vi-VN"/>
+        </w:rPr>
+        <w:t>Hệ thống được thiết kế hướng tới sự linh hoạt, không áp dụng cơ chế phân quyền (Admin/Member) khắt khe.</w:t>
+      </w:r>
+    </w:p>
+    <w:p>
+      <w:pPr>
+        <w:pStyle w:val="ListParagraph"/>
+        <w:numPr>
+          <w:ilvl w:val="0"/>
+          <w:numId w:val="41"/>
+        </w:numPr>
+        <w:spacing w:before="120" w:after="120" w:line="312" w:lineRule="auto"/>
+        <w:rPr>
+          <w:sz w:val="26"/>
+          <w:szCs w:val="26"/>
+          <w:lang w:val="vi-VN"/>
+        </w:rPr>
+      </w:pPr>
+      <w:r>
+        <w:rPr>
+          <w:sz w:val="26"/>
+          <w:szCs w:val="26"/>
+          <w:lang w:val="vi-VN"/>
+        </w:rPr>
+        <w:t>Mọi Người dùng (User) đều có quyền hạn bình đẳng.</w:t>
+      </w:r>
+    </w:p>
+    <w:p>
+      <w:pPr>
+        <w:pStyle w:val="ListParagraph"/>
+        <w:numPr>
+          <w:ilvl w:val="0"/>
+          <w:numId w:val="41"/>
+        </w:numPr>
+        <w:spacing w:before="120" w:after="120" w:line="312" w:lineRule="auto"/>
+        <w:rPr>
+          <w:sz w:val="26"/>
+          <w:szCs w:val="26"/>
+          <w:lang w:val="vi-VN"/>
+        </w:rPr>
+      </w:pPr>
+      <w:r>
+        <w:rPr>
+          <w:sz w:val="26"/>
+          <w:szCs w:val="26"/>
+          <w:lang w:val="vi-VN"/>
+        </w:rPr>
+        <w:t>Người dùng có thể khởi tạo các Nhóm (Groups) (Ví dụ: Nhóm du lịch, Nhóm phòng trọ) hoặc sử dụng Ví cá nhân mặc định.</w:t>
+      </w:r>
+    </w:p>
+    <w:p>
+      <w:pPr>
+        <w:pStyle w:val="ListParagraph"/>
+        <w:numPr>
+          <w:ilvl w:val="0"/>
+          <w:numId w:val="41"/>
+        </w:numPr>
+        <w:spacing w:before="120" w:after="120" w:line="312" w:lineRule="auto"/>
+        <w:rPr>
+          <w:sz w:val="26"/>
+          <w:szCs w:val="26"/>
+          <w:lang w:val="vi-VN"/>
+        </w:rPr>
+      </w:pPr>
+      <w:r>
+        <w:rPr>
+          <w:sz w:val="26"/>
+          <w:szCs w:val="26"/>
+          <w:lang w:val="vi-VN"/>
+        </w:rPr>
+        <w:t>Ai cũng có quyền mời thêm thành viên mới vào nhóm và cùng nhau quản lý luồng tài chính chung.</w:t>
+      </w:r>
+    </w:p>
+    <w:p>
+      <w:pPr>
+        <w:spacing w:before="120" w:after="120" w:line="312" w:lineRule="auto"/>
+        <w:rPr>
+          <w:sz w:val="26"/>
+          <w:szCs w:val="26"/>
+          <w:lang w:val="vi-VN"/>
+        </w:rPr>
+      </w:pPr>
+      <w:r>
+        <w:rPr>
+          <w:sz w:val="26"/>
+          <w:szCs w:val="26"/>
+          <w:lang w:val="vi-VN"/>
+        </w:rPr>
+        <w:t>2. Ghi nhận Giao dịch (Expense Tracking)</w:t>
+      </w:r>
+    </w:p>
+    <w:p>
+      <w:pPr>
+        <w:spacing w:before="120" w:after="120" w:line="312" w:lineRule="auto"/>
         <w:ind w:firstLine="720"/>
         <w:rPr>
           <w:sz w:val="26"/>
@@ -7370,11 +7550,123 @@
           <w:szCs w:val="26"/>
           <w:lang w:val="vi-VN"/>
         </w:rPr>
-        <w:t>- Tạo nhóm và mời thành viên: Một người dùng khởi tạo nhóm (ví dụ: "Du lịch Đà Lạt") và chia sẻ nhóm hoặc thêm trực tiếp các thành viên khác vào. Đây là không gian làm việc chung để mọi người cùng theo dõi một luồng chi phí.</w:t>
-      </w:r>
-    </w:p>
-    <w:p>
-      <w:pPr>
+        <w:t>Mỗi khi phát sinh chi phí, bất kỳ thành viên nào trong nhóm cũng có thể ghi nhận lên hệ thống thông qua một form nhập liệu chuẩn:</w:t>
+      </w:r>
+    </w:p>
+    <w:p>
+      <w:pPr>
+        <w:pStyle w:val="ListParagraph"/>
+        <w:numPr>
+          <w:ilvl w:val="0"/>
+          <w:numId w:val="42"/>
+        </w:numPr>
+        <w:spacing w:before="120" w:after="120" w:line="312" w:lineRule="auto"/>
+        <w:rPr>
+          <w:sz w:val="26"/>
+          <w:szCs w:val="26"/>
+          <w:lang w:val="vi-VN"/>
+        </w:rPr>
+      </w:pPr>
+      <w:r>
+        <w:rPr>
+          <w:sz w:val="26"/>
+          <w:szCs w:val="26"/>
+          <w:lang w:val="vi-VN"/>
+        </w:rPr>
+        <w:t>Thông tin cơ bản: Số tiền, Tiêu đề (Nội dung), Danh mục (Category), Ngày giờ.</w:t>
+      </w:r>
+    </w:p>
+    <w:p>
+      <w:pPr>
+        <w:pStyle w:val="ListParagraph"/>
+        <w:numPr>
+          <w:ilvl w:val="0"/>
+          <w:numId w:val="42"/>
+        </w:numPr>
+        <w:spacing w:before="120" w:after="120" w:line="312" w:lineRule="auto"/>
+        <w:rPr>
+          <w:sz w:val="26"/>
+          <w:szCs w:val="26"/>
+          <w:lang w:val="vi-VN"/>
+        </w:rPr>
+      </w:pPr>
+      <w:r>
+        <w:rPr>
+          <w:sz w:val="26"/>
+          <w:szCs w:val="26"/>
+          <w:lang w:val="vi-VN"/>
+        </w:rPr>
+        <w:lastRenderedPageBreak/>
+        <w:t>Người thanh toán (paidBy): Chọn thành viên đã đứng ra "trả tiền hộ" cho khoản chi này (mặc định là người đang thao tác).</w:t>
+      </w:r>
+    </w:p>
+    <w:p>
+      <w:pPr>
+        <w:pStyle w:val="ListParagraph"/>
+        <w:numPr>
+          <w:ilvl w:val="0"/>
+          <w:numId w:val="42"/>
+        </w:numPr>
+        <w:spacing w:before="120" w:after="120" w:line="312" w:lineRule="auto"/>
+        <w:rPr>
+          <w:sz w:val="26"/>
+          <w:szCs w:val="26"/>
+          <w:lang w:val="vi-VN"/>
+        </w:rPr>
+      </w:pPr>
+      <w:r>
+        <w:rPr>
+          <w:sz w:val="26"/>
+          <w:szCs w:val="26"/>
+          <w:lang w:val="vi-VN"/>
+        </w:rPr>
+        <w:t>Chia sẻ chi phí (splitAmong): Xác định những thành viên nào tham gia vào khoản chi này. Hệ thống hỗ trợ chia đều số tiền ra cho các thành viên được chọn.</w:t>
+      </w:r>
+    </w:p>
+    <w:p>
+      <w:pPr>
+        <w:pStyle w:val="ListParagraph"/>
+        <w:numPr>
+          <w:ilvl w:val="0"/>
+          <w:numId w:val="42"/>
+        </w:numPr>
+        <w:spacing w:before="120" w:after="120" w:line="312" w:lineRule="auto"/>
+        <w:rPr>
+          <w:sz w:val="26"/>
+          <w:szCs w:val="26"/>
+          <w:lang w:val="vi-VN"/>
+        </w:rPr>
+      </w:pPr>
+      <w:r>
+        <w:rPr>
+          <w:sz w:val="26"/>
+          <w:szCs w:val="26"/>
+          <w:lang w:val="vi-VN"/>
+        </w:rPr>
+        <w:t>Dữ liệu ngay lập tức được đẩy lên Firebase Firestore, đồng bộ thời gian thực (real-time) tới tất cả các thiết bị của thành viên khác trong nhóm mà không cần tải lại trang.</w:t>
+      </w:r>
+    </w:p>
+    <w:p>
+      <w:pPr>
+        <w:spacing w:before="120" w:after="120" w:line="312" w:lineRule="auto"/>
+        <w:rPr>
+          <w:sz w:val="26"/>
+          <w:szCs w:val="26"/>
+          <w:lang w:val="vi-VN"/>
+        </w:rPr>
+      </w:pPr>
+      <w:r>
+        <w:rPr>
+          <w:sz w:val="26"/>
+          <w:szCs w:val="26"/>
+          <w:lang w:val="vi-VN"/>
+        </w:rPr>
+        <w:t>3. Theo dõi Số dư &amp; Công nợ (Balance Tracking)</w:t>
+      </w:r>
+    </w:p>
+    <w:p>
+      <w:pPr>
+        <w:spacing w:before="120" w:after="120" w:line="312" w:lineRule="auto"/>
         <w:ind w:firstLine="720"/>
         <w:rPr>
           <w:sz w:val="26"/>
@@ -7388,11 +7680,99 @@
           <w:szCs w:val="26"/>
           <w:lang w:val="vi-VN"/>
         </w:rPr>
-        <w:t>- Ghi nhận giao dịch chi tiêu: Khi phát sinh chi phí (ví dụ: ăn uống, đi lại), bất kỳ thành viên nào cũng có thể tạo giao dịch mới. Hệ thống yêu cầu nhập rõ: Số tiền, Nội dung, Người đã trả tiền (Paid By) và Những người cùng chia sẻ khoản chi này.</w:t>
-      </w:r>
-    </w:p>
-    <w:p>
-      <w:pPr>
+        <w:t>Xuyên suốt quá trình hoạt động của nhóm, ứng dụng sẽ chạy ngầm việc tổng hợp dữ liệu tài chính cho từng cá nhân:</w:t>
+      </w:r>
+    </w:p>
+    <w:p>
+      <w:pPr>
+        <w:pStyle w:val="ListParagraph"/>
+        <w:numPr>
+          <w:ilvl w:val="0"/>
+          <w:numId w:val="43"/>
+        </w:numPr>
+        <w:spacing w:before="120" w:after="120" w:line="312" w:lineRule="auto"/>
+        <w:rPr>
+          <w:sz w:val="26"/>
+          <w:szCs w:val="26"/>
+          <w:lang w:val="vi-VN"/>
+        </w:rPr>
+      </w:pPr>
+      <w:r>
+        <w:rPr>
+          <w:sz w:val="26"/>
+          <w:szCs w:val="26"/>
+          <w:lang w:val="vi-VN"/>
+        </w:rPr>
+        <w:t>Tổng tiền đã trả: Tổng các khoản mà thành viên đó đã đứng ra trả (paidBy).</w:t>
+      </w:r>
+    </w:p>
+    <w:p>
+      <w:pPr>
+        <w:pStyle w:val="ListParagraph"/>
+        <w:numPr>
+          <w:ilvl w:val="0"/>
+          <w:numId w:val="43"/>
+        </w:numPr>
+        <w:spacing w:before="120" w:after="120" w:line="312" w:lineRule="auto"/>
+        <w:rPr>
+          <w:sz w:val="26"/>
+          <w:szCs w:val="26"/>
+          <w:lang w:val="vi-VN"/>
+        </w:rPr>
+      </w:pPr>
+      <w:r>
+        <w:rPr>
+          <w:sz w:val="26"/>
+          <w:szCs w:val="26"/>
+          <w:lang w:val="vi-VN"/>
+        </w:rPr>
+        <w:t>Tổng tiền thực tiêu: Tổng các phần tiền mà thành viên đó phải chịu trách nhiệm (được chia trong splitAmong).</w:t>
+      </w:r>
+    </w:p>
+    <w:p>
+      <w:pPr>
+        <w:pStyle w:val="ListParagraph"/>
+        <w:numPr>
+          <w:ilvl w:val="0"/>
+          <w:numId w:val="43"/>
+        </w:numPr>
+        <w:spacing w:before="120" w:after="120" w:line="312" w:lineRule="auto"/>
+        <w:rPr>
+          <w:sz w:val="26"/>
+          <w:szCs w:val="26"/>
+          <w:lang w:val="vi-VN"/>
+        </w:rPr>
+      </w:pPr>
+      <w:r>
+        <w:rPr>
+          <w:sz w:val="26"/>
+          <w:szCs w:val="26"/>
+          <w:lang w:val="vi-VN"/>
+        </w:rPr>
+        <w:t>Từ hai thông số trên, hệ thống tính ra Độ chênh lệch (Net Balance) để xác định trạng thái hiện tại: Thành viên đang "nợ" nhóm hay đang "được nhận lại" tiền từ nhóm.</w:t>
+      </w:r>
+    </w:p>
+    <w:p>
+      <w:pPr>
+        <w:spacing w:before="120" w:after="120" w:line="312" w:lineRule="auto"/>
+        <w:rPr>
+          <w:sz w:val="26"/>
+          <w:szCs w:val="26"/>
+          <w:lang w:val="vi-VN"/>
+        </w:rPr>
+      </w:pPr>
+      <w:r>
+        <w:rPr>
+          <w:sz w:val="26"/>
+          <w:szCs w:val="26"/>
+          <w:lang w:val="vi-VN"/>
+        </w:rPr>
+        <w:t>4. Quyết toán và Cấn trừ tự động (Settlement)</w:t>
+      </w:r>
+    </w:p>
+    <w:p>
+      <w:pPr>
+        <w:spacing w:before="120" w:after="120" w:line="312" w:lineRule="auto"/>
         <w:ind w:firstLine="720"/>
         <w:rPr>
           <w:sz w:val="26"/>
@@ -7406,12 +7786,86 @@
           <w:szCs w:val="26"/>
           <w:lang w:val="vi-VN"/>
         </w:rPr>
-        <w:t>- Theo dõi số dư (Balance): Xuyên suốt quá trình hoạt động, ứng dụng tự động tổng hợp và tính toán số tiền mỗi cá nhân đã trả hộ so với số tiền thực tế họ phải chịu. Từ đó, cập nhật liên tục trạng thái "đang nợ" hay "được nhận lại" của từng người.</w:t>
-      </w:r>
-    </w:p>
-    <w:p>
-      <w:pPr>
-        <w:ind w:firstLine="720"/>
+        <w:t>Khi kết thúc sự kiện (chuyến đi chơi kết thúc, đến kỳ đóng tiền phòng trọ), hệ thống cung cấp tính năng Quyết toán để dứt điểm công nợ:</w:t>
+      </w:r>
+    </w:p>
+    <w:p>
+      <w:pPr>
+        <w:pStyle w:val="ListParagraph"/>
+        <w:numPr>
+          <w:ilvl w:val="0"/>
+          <w:numId w:val="44"/>
+        </w:numPr>
+        <w:spacing w:before="120" w:after="120" w:line="312" w:lineRule="auto"/>
+        <w:rPr>
+          <w:sz w:val="26"/>
+          <w:szCs w:val="26"/>
+          <w:lang w:val="vi-VN"/>
+        </w:rPr>
+      </w:pPr>
+      <w:r>
+        <w:rPr>
+          <w:sz w:val="26"/>
+          <w:szCs w:val="26"/>
+          <w:lang w:val="vi-VN"/>
+        </w:rPr>
+        <w:t>Phân loại: Hệ thống gom các thành viên thành 2 tập hợp: Nhóm Ghi Có (Balance &gt; 0, cần lấy lại tiền) và Nhóm Ghi Nợ (Balance &lt; 0, cần trả tiền).</w:t>
+      </w:r>
+    </w:p>
+    <w:p>
+      <w:pPr>
+        <w:pStyle w:val="ListParagraph"/>
+        <w:numPr>
+          <w:ilvl w:val="0"/>
+          <w:numId w:val="44"/>
+        </w:numPr>
+        <w:spacing w:before="120" w:after="120" w:line="312" w:lineRule="auto"/>
+        <w:rPr>
+          <w:sz w:val="26"/>
+          <w:szCs w:val="26"/>
+          <w:lang w:val="vi-VN"/>
+        </w:rPr>
+      </w:pPr>
+      <w:r>
+        <w:rPr>
+          <w:sz w:val="26"/>
+          <w:szCs w:val="26"/>
+          <w:lang w:val="vi-VN"/>
+        </w:rPr>
+        <w:t>Áp dụng Thuật toán Tham lam (Greedy Algorithm): Thay vì bắt mọi người tự đối soát thủ công (A trả B, B trả C), thuật toán sẽ tìm người nợ nhiều nhất để bù cho người cần nhận nhiều nhất.</w:t>
+      </w:r>
+    </w:p>
+    <w:p>
+      <w:pPr>
+        <w:pStyle w:val="ListParagraph"/>
+        <w:numPr>
+          <w:ilvl w:val="0"/>
+          <w:numId w:val="44"/>
+        </w:numPr>
+        <w:spacing w:before="120" w:after="120" w:line="312" w:lineRule="auto"/>
+        <w:rPr>
+          <w:sz w:val="26"/>
+          <w:szCs w:val="26"/>
+          <w:lang w:val="vi-VN"/>
+        </w:rPr>
+      </w:pPr>
+      <w:r>
+        <w:rPr>
+          <w:sz w:val="26"/>
+          <w:szCs w:val="26"/>
+          <w:lang w:val="vi-VN"/>
+        </w:rPr>
+        <w:t>Sinh giao dịch tối ưu: Rút gọn chuỗi thanh toán thành phương án chuyển khoản cấn trừ tối giản nhất (Ví dụ: Chỉ yêu cầu A trả thẳng cho C).</w:t>
+      </w:r>
+    </w:p>
+    <w:p>
+      <w:pPr>
+        <w:pStyle w:val="ListParagraph"/>
+        <w:numPr>
+          <w:ilvl w:val="0"/>
+          <w:numId w:val="44"/>
+        </w:numPr>
+        <w:spacing w:before="120" w:after="120" w:line="312" w:lineRule="auto"/>
         <w:rPr>
           <w:b/>
           <w:bCs/>
@@ -7426,13 +7880,13 @@
           <w:szCs w:val="26"/>
           <w:lang w:val="vi-VN"/>
         </w:rPr>
-        <w:t>- Quyết toán (Settlement): Khi kết thúc chuyến đi, người dùng sử dụng tính năng quyết toán. Thay vì phải tự đối soát thủ công phức tạp, hệ thống tự động tổng hợp công nợ và đưa ra phương án chuyển khoản cấn trừ tối ưu nhất (ai chuyển cho ai, bao nhiêu tiền) để giải quyết dứt điểm các khoản nợ trong nhóm.</w:t>
+        <w:t>Xác nhận: Các thành viên thực hiện chuyển khoản thực tế và nhấn "Xác nhận đã thanh toán" để hệ thống đóng giao dịch.</w:t>
       </w:r>
     </w:p>
     <w:p>
       <w:pPr>
         <w:pStyle w:val="Heading2"/>
-        <w:spacing w:before="100" w:beforeAutospacing="1" w:after="100" w:afterAutospacing="1"/>
+        <w:spacing w:before="120" w:after="120" w:line="312" w:lineRule="auto"/>
         <w:jc w:val="both"/>
         <w:rPr>
           <w:sz w:val="28"/>
@@ -7467,16 +7921,8 @@
           <w:szCs w:val="26"/>
           <w:lang w:val="vi-VN"/>
         </w:rPr>
-        <w:t xml:space="preserve">Chương 1 đã hoàn thành mục tiêu khảo sát và làm rõ hiện trạng tổ chức cũng như quy trình nghiệp vụ thực tế trong việc quản lý chi tiêu của các đội nhóm. Qua đó, đề tài đã xác định được cấu trúc phân quyền tối giản, hướng tới sự thuận tiện bằng cách trao quyền bình đẳng cho mọi Người dùng (User). Đồng thời, quá trình khảo sát cũng </w:t>
-      </w:r>
-      <w:r>
-        <w:rPr>
-          <w:sz w:val="26"/>
-          <w:szCs w:val="26"/>
-          <w:lang w:val="vi-VN"/>
-        </w:rPr>
         <w:lastRenderedPageBreak/>
-        <w:t>đã đặc tả chi tiết các bước trong quy trình quản lý, từ việc thiết lập nhóm cho đến các công đoạn ghi nhận giao dịch, theo dõi số dư và tự động hóa quyết toán.</w:t>
+        <w:t>Chương 1 đã hoàn thành mục tiêu khảo sát và làm rõ hiện trạng tổ chức cũng như quy trình nghiệp vụ thực tế trong việc quản lý chi tiêu của các đội nhóm. Qua đó, đề tài đã xác định được cấu trúc phân quyền tối giản, hướng tới sự thuận tiện bằng cách trao quyền bình đẳng cho mọi Người dùng (User). Đồng thời, quá trình khảo sát cũng đã đặc tả chi tiết các bước trong quy trình quản lý, từ việc thiết lập nhóm cho đến các công đoạn ghi nhận giao dịch, theo dõi số dư và tự động hóa quyết toán.</w:t>
       </w:r>
     </w:p>
     <w:p>
@@ -7519,6 +7965,168 @@
     </w:p>
     <w:p>
       <w:pPr>
+        <w:spacing w:after="200"/>
+        <w:jc w:val="both"/>
+        <w:rPr>
+          <w:lang w:val="vi-VN"/>
+        </w:rPr>
+      </w:pPr>
+    </w:p>
+    <w:p>
+      <w:pPr>
+        <w:spacing w:after="200"/>
+        <w:jc w:val="both"/>
+        <w:rPr>
+          <w:lang w:val="vi-VN"/>
+        </w:rPr>
+      </w:pPr>
+    </w:p>
+    <w:p>
+      <w:pPr>
+        <w:spacing w:after="200"/>
+        <w:jc w:val="both"/>
+        <w:rPr>
+          <w:lang w:val="vi-VN"/>
+        </w:rPr>
+      </w:pPr>
+    </w:p>
+    <w:p>
+      <w:pPr>
+        <w:spacing w:after="200"/>
+        <w:jc w:val="both"/>
+        <w:rPr>
+          <w:lang w:val="vi-VN"/>
+        </w:rPr>
+      </w:pPr>
+    </w:p>
+    <w:p>
+      <w:pPr>
+        <w:spacing w:after="200"/>
+        <w:jc w:val="both"/>
+        <w:rPr>
+          <w:lang w:val="vi-VN"/>
+        </w:rPr>
+      </w:pPr>
+    </w:p>
+    <w:p>
+      <w:pPr>
+        <w:spacing w:after="200"/>
+        <w:jc w:val="both"/>
+        <w:rPr>
+          <w:lang w:val="vi-VN"/>
+        </w:rPr>
+      </w:pPr>
+    </w:p>
+    <w:p>
+      <w:pPr>
+        <w:spacing w:after="200"/>
+        <w:jc w:val="both"/>
+        <w:rPr>
+          <w:lang w:val="vi-VN"/>
+        </w:rPr>
+      </w:pPr>
+    </w:p>
+    <w:p>
+      <w:pPr>
+        <w:spacing w:after="200"/>
+        <w:jc w:val="both"/>
+        <w:rPr>
+          <w:lang w:val="vi-VN"/>
+        </w:rPr>
+      </w:pPr>
+    </w:p>
+    <w:p>
+      <w:pPr>
+        <w:spacing w:after="200"/>
+        <w:jc w:val="both"/>
+        <w:rPr>
+          <w:lang w:val="vi-VN"/>
+        </w:rPr>
+      </w:pPr>
+    </w:p>
+    <w:p>
+      <w:pPr>
+        <w:spacing w:after="200"/>
+        <w:jc w:val="both"/>
+        <w:rPr>
+          <w:lang w:val="vi-VN"/>
+        </w:rPr>
+      </w:pPr>
+    </w:p>
+    <w:p>
+      <w:pPr>
+        <w:spacing w:after="200"/>
+        <w:jc w:val="both"/>
+        <w:rPr>
+          <w:lang w:val="vi-VN"/>
+        </w:rPr>
+      </w:pPr>
+    </w:p>
+    <w:p>
+      <w:pPr>
+        <w:spacing w:after="200"/>
+        <w:jc w:val="both"/>
+        <w:rPr>
+          <w:lang w:val="vi-VN"/>
+        </w:rPr>
+      </w:pPr>
+    </w:p>
+    <w:p>
+      <w:pPr>
+        <w:spacing w:after="200"/>
+        <w:jc w:val="both"/>
+        <w:rPr>
+          <w:lang w:val="vi-VN"/>
+        </w:rPr>
+      </w:pPr>
+    </w:p>
+    <w:p>
+      <w:pPr>
+        <w:spacing w:after="200"/>
+        <w:jc w:val="both"/>
+        <w:rPr>
+          <w:lang w:val="vi-VN"/>
+        </w:rPr>
+      </w:pPr>
+    </w:p>
+    <w:p>
+      <w:pPr>
+        <w:spacing w:after="200"/>
+        <w:jc w:val="both"/>
+        <w:rPr>
+          <w:lang w:val="vi-VN"/>
+        </w:rPr>
+      </w:pPr>
+    </w:p>
+    <w:p>
+      <w:pPr>
+        <w:spacing w:after="200"/>
+        <w:jc w:val="both"/>
+        <w:rPr>
+          <w:lang w:val="vi-VN"/>
+        </w:rPr>
+      </w:pPr>
+    </w:p>
+    <w:p>
+      <w:pPr>
+        <w:spacing w:after="200"/>
+        <w:jc w:val="both"/>
+        <w:rPr>
+          <w:lang w:val="vi-VN"/>
+        </w:rPr>
+      </w:pPr>
+    </w:p>
+    <w:p>
+      <w:pPr>
+        <w:spacing w:after="200"/>
+        <w:jc w:val="both"/>
+        <w:rPr>
+          <w:lang w:val="vi-VN"/>
+        </w:rPr>
+      </w:pPr>
+    </w:p>
+    <w:p>
+      <w:pPr>
         <w:pStyle w:val="Heading1"/>
         <w:jc w:val="center"/>
         <w:rPr>
@@ -7534,6 +8142,7 @@
           <w:szCs w:val="36"/>
           <w:lang w:val="vi-VN"/>
         </w:rPr>
+        <w:lastRenderedPageBreak/>
         <w:t>CHƯƠNG 2: PHÂN TÍCH HỆ THỐNG</w:t>
       </w:r>
       <w:bookmarkEnd w:id="13"/>
@@ -8551,7 +9160,6 @@
           <w:szCs w:val="26"/>
           <w:lang w:val="vi-VN"/>
         </w:rPr>
-        <w:lastRenderedPageBreak/>
         <w:t>Nhân viên q</w:t>
       </w:r>
       <w:r>
@@ -8746,6 +9354,7 @@
           <w:szCs w:val="26"/>
           <w:lang w:eastAsia="en-US"/>
         </w:rPr>
+        <w:lastRenderedPageBreak/>
         <w:drawing>
           <wp:inline distT="0" distB="0" distL="0" distR="0" wp14:anchorId="5DCF6E98" wp14:editId="79D2AB96">
             <wp:extent cx="3677163" cy="5811061"/>
@@ -8813,7 +9422,6 @@
           <w:szCs w:val="26"/>
           <w:lang w:val="vi-VN"/>
         </w:rPr>
-        <w:lastRenderedPageBreak/>
         <w:t>2: Cấp phát nguyên vật liệu</w:t>
       </w:r>
     </w:p>
@@ -8949,6 +9557,7 @@
           <w:szCs w:val="26"/>
           <w:lang w:val="vi-VN"/>
         </w:rPr>
+        <w:lastRenderedPageBreak/>
         <w:t>Nhân viên kho xem danh sách lệnh sản xuất đang chờ cấp phát và định mức vật tư yêu cầu.</w:t>
       </w:r>
     </w:p>
@@ -9063,7 +9672,6 @@
           <w:szCs w:val="26"/>
           <w:lang w:eastAsia="en-US"/>
         </w:rPr>
-        <w:lastRenderedPageBreak/>
         <w:drawing>
           <wp:inline distT="0" distB="0" distL="0" distR="0" wp14:anchorId="78F4A175" wp14:editId="5BE308DA">
             <wp:extent cx="4734586" cy="5401429"/>
@@ -9181,6 +9789,7 @@
           <w:szCs w:val="26"/>
           <w:lang w:val="vi-VN"/>
         </w:rPr>
+        <w:lastRenderedPageBreak/>
         <w:t>3: Vận hành sản xuất</w:t>
       </w:r>
     </w:p>
@@ -9300,7 +9909,6 @@
           <w:szCs w:val="26"/>
           <w:lang w:val="vi-VN"/>
         </w:rPr>
-        <w:lastRenderedPageBreak/>
         <w:t>Nhân viên sản xuất</w:t>
       </w:r>
       <w:r>
@@ -36726,6 +37334,118 @@
 <file path=word/numbering.xml><?xml version="1.0" encoding="utf-8"?>
 <w:numbering xmlns:wpc="http://schemas.microsoft.com/office/word/2010/wordprocessingCanvas" xmlns:cx="http://schemas.microsoft.com/office/drawing/2014/chartex" xmlns:cx1="http://schemas.microsoft.com/office/drawing/2015/9/8/chartex" xmlns:cx2="http://schemas.microsoft.com/office/drawing/2015/10/21/chartex" xmlns:cx3="http://schemas.microsoft.com/office/drawing/2016/5/9/chartex" xmlns:cx4="http://schemas.microsoft.com/office/drawing/2016/5/10/chartex" xmlns:cx5="http://schemas.microsoft.com/office/drawing/2016/5/11/chartex" xmlns:cx6="http://schemas.microsoft.com/office/drawing/2016/5/12/chartex" xmlns:cx7="http://schemas.microsoft.com/office/drawing/2016/5/13/chartex" xmlns:cx8="http://schemas.microsoft.com/office/drawing/2016/5/14/chartex" xmlns:mc="http://schemas.openxmlformats.org/markup-compatibility/2006" xmlns:aink="http://schemas.microsoft.com/office/drawing/2016/ink" xmlns:am3d="http://schemas.microsoft.com/office/drawing/2017/model3d" xmlns:o="urn:schemas-microsoft-com:office:office" xmlns:r="http://schemas.openxmlformats.org/officeDocument/2006/relationships" xmlns:m="http://schemas.openxmlformats.org/officeDocument/2006/math" xmlns:v="urn:schemas-microsoft-com:vml" xmlns:wp14="http://schemas.microsoft.com/office/word/2010/wordprocessingDrawing" xmlns:wp="http://schemas.openxmlformats.org/drawingml/2006/wordprocessingDrawing" xmlns:w10="urn:schemas-microsoft-com:office:word" xmlns:w="http://schemas.openxmlformats.org/wordprocessingml/2006/main" xmlns:w14="http://schemas.microsoft.com/office/word/2010/wordml" xmlns:w15="http://schemas.microsoft.com/office/word/2012/wordml" xmlns:w16cex="http://schemas.microsoft.com/office/word/2018/wordml/cex" xmlns:w16cid="http://schemas.microsoft.com/office/word/2016/wordml/cid" xmlns:w16="http://schemas.microsoft.com/office/word/2018/wordml" xmlns:w16sdtdh="http://schemas.microsoft.com/office/word/2020/wordml/sdtdatahash" xmlns:w16se="http://schemas.microsoft.com/office/word/2015/wordml/symex" xmlns:wpg="http://schemas.microsoft.com/office/word/2010/wordprocessingGroup" xmlns:wpi="http://schemas.microsoft.com/office/word/2010/wordprocessingInk" xmlns:wne="http://schemas.microsoft.com/office/word/2006/wordml" xmlns:wps="http://schemas.microsoft.com/office/word/2010/wordprocessingShape" mc:Ignorable="w14 w15 w16se w16cid w16 w16cex w16sdtdh wp14">
   <w:abstractNum w:abstractNumId="0" w15:restartNumberingAfterBreak="0">
+    <w:nsid w:val="00E57067"/>
+    <w:multiLevelType w:val="hybridMultilevel"/>
+    <w:tmpl w:val="F84E7900"/>
+    <w:lvl w:ilvl="0" w:tplc="F4002594">
+      <w:numFmt w:val="bullet"/>
+      <w:lvlText w:val="-"/>
+      <w:lvlJc w:val="left"/>
+      <w:pPr>
+        <w:ind w:left="720" w:hanging="360"/>
+      </w:pPr>
+      <w:rPr>
+        <w:rFonts w:ascii="Times New Roman" w:eastAsia="Times New Roman" w:hAnsi="Times New Roman" w:cs="Times New Roman" w:hint="default"/>
+      </w:rPr>
+    </w:lvl>
+    <w:lvl w:ilvl="1" w:tplc="04090003" w:tentative="1">
+      <w:start w:val="1"/>
+      <w:numFmt w:val="bullet"/>
+      <w:lvlText w:val="o"/>
+      <w:lvlJc w:val="left"/>
+      <w:pPr>
+        <w:ind w:left="1440" w:hanging="360"/>
+      </w:pPr>
+      <w:rPr>
+        <w:rFonts w:ascii="Courier New" w:hAnsi="Courier New" w:cs="Courier New" w:hint="default"/>
+      </w:rPr>
+    </w:lvl>
+    <w:lvl w:ilvl="2" w:tplc="04090005" w:tentative="1">
+      <w:start w:val="1"/>
+      <w:numFmt w:val="bullet"/>
+      <w:lvlText w:val=""/>
+      <w:lvlJc w:val="left"/>
+      <w:pPr>
+        <w:ind w:left="2160" w:hanging="360"/>
+      </w:pPr>
+      <w:rPr>
+        <w:rFonts w:ascii="Wingdings" w:hAnsi="Wingdings" w:hint="default"/>
+      </w:rPr>
+    </w:lvl>
+    <w:lvl w:ilvl="3" w:tplc="04090001" w:tentative="1">
+      <w:start w:val="1"/>
+      <w:numFmt w:val="bullet"/>
+      <w:lvlText w:val=""/>
+      <w:lvlJc w:val="left"/>
+      <w:pPr>
+        <w:ind w:left="2880" w:hanging="360"/>
+      </w:pPr>
+      <w:rPr>
+        <w:rFonts w:ascii="Symbol" w:hAnsi="Symbol" w:hint="default"/>
+      </w:rPr>
+    </w:lvl>
+    <w:lvl w:ilvl="4" w:tplc="04090003" w:tentative="1">
+      <w:start w:val="1"/>
+      <w:numFmt w:val="bullet"/>
+      <w:lvlText w:val="o"/>
+      <w:lvlJc w:val="left"/>
+      <w:pPr>
+        <w:ind w:left="3600" w:hanging="360"/>
+      </w:pPr>
+      <w:rPr>
+        <w:rFonts w:ascii="Courier New" w:hAnsi="Courier New" w:cs="Courier New" w:hint="default"/>
+      </w:rPr>
+    </w:lvl>
+    <w:lvl w:ilvl="5" w:tplc="04090005" w:tentative="1">
+      <w:start w:val="1"/>
+      <w:numFmt w:val="bullet"/>
+      <w:lvlText w:val=""/>
+      <w:lvlJc w:val="left"/>
+      <w:pPr>
+        <w:ind w:left="4320" w:hanging="360"/>
+      </w:pPr>
+      <w:rPr>
+        <w:rFonts w:ascii="Wingdings" w:hAnsi="Wingdings" w:hint="default"/>
+      </w:rPr>
+    </w:lvl>
+    <w:lvl w:ilvl="6" w:tplc="04090001" w:tentative="1">
+      <w:start w:val="1"/>
+      <w:numFmt w:val="bullet"/>
+      <w:lvlText w:val=""/>
+      <w:lvlJc w:val="left"/>
+      <w:pPr>
+        <w:ind w:left="5040" w:hanging="360"/>
+      </w:pPr>
+      <w:rPr>
+        <w:rFonts w:ascii="Symbol" w:hAnsi="Symbol" w:hint="default"/>
+      </w:rPr>
+    </w:lvl>
+    <w:lvl w:ilvl="7" w:tplc="04090003" w:tentative="1">
+      <w:start w:val="1"/>
+      <w:numFmt w:val="bullet"/>
+      <w:lvlText w:val="o"/>
+      <w:lvlJc w:val="left"/>
+      <w:pPr>
+        <w:ind w:left="5760" w:hanging="360"/>
+      </w:pPr>
+      <w:rPr>
+        <w:rFonts w:ascii="Courier New" w:hAnsi="Courier New" w:cs="Courier New" w:hint="default"/>
+      </w:rPr>
+    </w:lvl>
+    <w:lvl w:ilvl="8" w:tplc="04090005" w:tentative="1">
+      <w:start w:val="1"/>
+      <w:numFmt w:val="bullet"/>
+      <w:lvlText w:val=""/>
+      <w:lvlJc w:val="left"/>
+      <w:pPr>
+        <w:ind w:left="6480" w:hanging="360"/>
+      </w:pPr>
+      <w:rPr>
+        <w:rFonts w:ascii="Wingdings" w:hAnsi="Wingdings" w:hint="default"/>
+      </w:rPr>
+    </w:lvl>
+  </w:abstractNum>
+  <w:abstractNum w:abstractNumId="1" w15:restartNumberingAfterBreak="0">
     <w:nsid w:val="0C304F20"/>
     <w:multiLevelType w:val="hybridMultilevel"/>
     <w:tmpl w:val="9C6A112E"/>
@@ -36814,7 +37534,7 @@
       </w:pPr>
     </w:lvl>
   </w:abstractNum>
-  <w:abstractNum w:abstractNumId="1" w15:restartNumberingAfterBreak="0">
+  <w:abstractNum w:abstractNumId="2" w15:restartNumberingAfterBreak="0">
     <w:nsid w:val="102C1D4A"/>
     <w:multiLevelType w:val="multilevel"/>
     <w:tmpl w:val="9FF619B4"/>
@@ -36962,7 +37682,119 @@
       </w:rPr>
     </w:lvl>
   </w:abstractNum>
-  <w:abstractNum w:abstractNumId="2" w15:restartNumberingAfterBreak="0">
+  <w:abstractNum w:abstractNumId="3" w15:restartNumberingAfterBreak="0">
+    <w:nsid w:val="117722B9"/>
+    <w:multiLevelType w:val="hybridMultilevel"/>
+    <w:tmpl w:val="B52629FA"/>
+    <w:lvl w:ilvl="0" w:tplc="F4002594">
+      <w:numFmt w:val="bullet"/>
+      <w:lvlText w:val="-"/>
+      <w:lvlJc w:val="left"/>
+      <w:pPr>
+        <w:ind w:left="720" w:hanging="360"/>
+      </w:pPr>
+      <w:rPr>
+        <w:rFonts w:ascii="Times New Roman" w:eastAsia="Times New Roman" w:hAnsi="Times New Roman" w:cs="Times New Roman" w:hint="default"/>
+      </w:rPr>
+    </w:lvl>
+    <w:lvl w:ilvl="1" w:tplc="04090003" w:tentative="1">
+      <w:start w:val="1"/>
+      <w:numFmt w:val="bullet"/>
+      <w:lvlText w:val="o"/>
+      <w:lvlJc w:val="left"/>
+      <w:pPr>
+        <w:ind w:left="1440" w:hanging="360"/>
+      </w:pPr>
+      <w:rPr>
+        <w:rFonts w:ascii="Courier New" w:hAnsi="Courier New" w:cs="Courier New" w:hint="default"/>
+      </w:rPr>
+    </w:lvl>
+    <w:lvl w:ilvl="2" w:tplc="04090005" w:tentative="1">
+      <w:start w:val="1"/>
+      <w:numFmt w:val="bullet"/>
+      <w:lvlText w:val=""/>
+      <w:lvlJc w:val="left"/>
+      <w:pPr>
+        <w:ind w:left="2160" w:hanging="360"/>
+      </w:pPr>
+      <w:rPr>
+        <w:rFonts w:ascii="Wingdings" w:hAnsi="Wingdings" w:hint="default"/>
+      </w:rPr>
+    </w:lvl>
+    <w:lvl w:ilvl="3" w:tplc="04090001" w:tentative="1">
+      <w:start w:val="1"/>
+      <w:numFmt w:val="bullet"/>
+      <w:lvlText w:val=""/>
+      <w:lvlJc w:val="left"/>
+      <w:pPr>
+        <w:ind w:left="2880" w:hanging="360"/>
+      </w:pPr>
+      <w:rPr>
+        <w:rFonts w:ascii="Symbol" w:hAnsi="Symbol" w:hint="default"/>
+      </w:rPr>
+    </w:lvl>
+    <w:lvl w:ilvl="4" w:tplc="04090003" w:tentative="1">
+      <w:start w:val="1"/>
+      <w:numFmt w:val="bullet"/>
+      <w:lvlText w:val="o"/>
+      <w:lvlJc w:val="left"/>
+      <w:pPr>
+        <w:ind w:left="3600" w:hanging="360"/>
+      </w:pPr>
+      <w:rPr>
+        <w:rFonts w:ascii="Courier New" w:hAnsi="Courier New" w:cs="Courier New" w:hint="default"/>
+      </w:rPr>
+    </w:lvl>
+    <w:lvl w:ilvl="5" w:tplc="04090005" w:tentative="1">
+      <w:start w:val="1"/>
+      <w:numFmt w:val="bullet"/>
+      <w:lvlText w:val=""/>
+      <w:lvlJc w:val="left"/>
+      <w:pPr>
+        <w:ind w:left="4320" w:hanging="360"/>
+      </w:pPr>
+      <w:rPr>
+        <w:rFonts w:ascii="Wingdings" w:hAnsi="Wingdings" w:hint="default"/>
+      </w:rPr>
+    </w:lvl>
+    <w:lvl w:ilvl="6" w:tplc="04090001" w:tentative="1">
+      <w:start w:val="1"/>
+      <w:numFmt w:val="bullet"/>
+      <w:lvlText w:val=""/>
+      <w:lvlJc w:val="left"/>
+      <w:pPr>
+        <w:ind w:left="5040" w:hanging="360"/>
+      </w:pPr>
+      <w:rPr>
+        <w:rFonts w:ascii="Symbol" w:hAnsi="Symbol" w:hint="default"/>
+      </w:rPr>
+    </w:lvl>
+    <w:lvl w:ilvl="7" w:tplc="04090003" w:tentative="1">
+      <w:start w:val="1"/>
+      <w:numFmt w:val="bullet"/>
+      <w:lvlText w:val="o"/>
+      <w:lvlJc w:val="left"/>
+      <w:pPr>
+        <w:ind w:left="5760" w:hanging="360"/>
+      </w:pPr>
+      <w:rPr>
+        <w:rFonts w:ascii="Courier New" w:hAnsi="Courier New" w:cs="Courier New" w:hint="default"/>
+      </w:rPr>
+    </w:lvl>
+    <w:lvl w:ilvl="8" w:tplc="04090005" w:tentative="1">
+      <w:start w:val="1"/>
+      <w:numFmt w:val="bullet"/>
+      <w:lvlText w:val=""/>
+      <w:lvlJc w:val="left"/>
+      <w:pPr>
+        <w:ind w:left="6480" w:hanging="360"/>
+      </w:pPr>
+      <w:rPr>
+        <w:rFonts w:ascii="Wingdings" w:hAnsi="Wingdings" w:hint="default"/>
+      </w:rPr>
+    </w:lvl>
+  </w:abstractNum>
+  <w:abstractNum w:abstractNumId="4" w15:restartNumberingAfterBreak="0">
     <w:nsid w:val="12585BEE"/>
     <w:multiLevelType w:val="hybridMultilevel"/>
     <w:tmpl w:val="4B50BC50"/>
@@ -37051,7 +37883,7 @@
       </w:pPr>
     </w:lvl>
   </w:abstractNum>
-  <w:abstractNum w:abstractNumId="3" w15:restartNumberingAfterBreak="0">
+  <w:abstractNum w:abstractNumId="5" w15:restartNumberingAfterBreak="0">
     <w:nsid w:val="12630688"/>
     <w:multiLevelType w:val="hybridMultilevel"/>
     <w:tmpl w:val="882C80EC"/>
@@ -37147,7 +37979,7 @@
       </w:pPr>
     </w:lvl>
   </w:abstractNum>
-  <w:abstractNum w:abstractNumId="4" w15:restartNumberingAfterBreak="0">
+  <w:abstractNum w:abstractNumId="6" w15:restartNumberingAfterBreak="0">
     <w:nsid w:val="16B679E5"/>
     <w:multiLevelType w:val="hybridMultilevel"/>
     <w:tmpl w:val="2334EBEE"/>
@@ -37243,7 +38075,7 @@
       </w:pPr>
     </w:lvl>
   </w:abstractNum>
-  <w:abstractNum w:abstractNumId="5" w15:restartNumberingAfterBreak="0">
+  <w:abstractNum w:abstractNumId="7" w15:restartNumberingAfterBreak="0">
     <w:nsid w:val="16EC06A6"/>
     <w:multiLevelType w:val="hybridMultilevel"/>
     <w:tmpl w:val="91E80AF6"/>
@@ -37332,7 +38164,7 @@
       </w:pPr>
     </w:lvl>
   </w:abstractNum>
-  <w:abstractNum w:abstractNumId="6" w15:restartNumberingAfterBreak="0">
+  <w:abstractNum w:abstractNumId="8" w15:restartNumberingAfterBreak="0">
     <w:nsid w:val="1C260C79"/>
     <w:multiLevelType w:val="hybridMultilevel"/>
     <w:tmpl w:val="E8DCE06C"/>
@@ -37444,7 +38276,7 @@
       </w:rPr>
     </w:lvl>
   </w:abstractNum>
-  <w:abstractNum w:abstractNumId="7" w15:restartNumberingAfterBreak="0">
+  <w:abstractNum w:abstractNumId="9" w15:restartNumberingAfterBreak="0">
     <w:nsid w:val="1C5F1AA0"/>
     <w:multiLevelType w:val="hybridMultilevel"/>
     <w:tmpl w:val="4918B4DC"/>
@@ -37556,7 +38388,7 @@
       </w:rPr>
     </w:lvl>
   </w:abstractNum>
-  <w:abstractNum w:abstractNumId="8" w15:restartNumberingAfterBreak="0">
+  <w:abstractNum w:abstractNumId="10" w15:restartNumberingAfterBreak="0">
     <w:nsid w:val="1D36562B"/>
     <w:multiLevelType w:val="hybridMultilevel"/>
     <w:tmpl w:val="F05455E6"/>
@@ -37668,7 +38500,7 @@
       </w:rPr>
     </w:lvl>
   </w:abstractNum>
-  <w:abstractNum w:abstractNumId="9" w15:restartNumberingAfterBreak="0">
+  <w:abstractNum w:abstractNumId="11" w15:restartNumberingAfterBreak="0">
     <w:nsid w:val="23664461"/>
     <w:multiLevelType w:val="hybridMultilevel"/>
     <w:tmpl w:val="EF4609CA"/>
@@ -37764,7 +38596,7 @@
       </w:pPr>
     </w:lvl>
   </w:abstractNum>
-  <w:abstractNum w:abstractNumId="10" w15:restartNumberingAfterBreak="0">
+  <w:abstractNum w:abstractNumId="12" w15:restartNumberingAfterBreak="0">
     <w:nsid w:val="266C4778"/>
     <w:multiLevelType w:val="hybridMultilevel"/>
     <w:tmpl w:val="189A2072"/>
@@ -37877,7 +38709,7 @@
       </w:rPr>
     </w:lvl>
   </w:abstractNum>
-  <w:abstractNum w:abstractNumId="11" w15:restartNumberingAfterBreak="0">
+  <w:abstractNum w:abstractNumId="13" w15:restartNumberingAfterBreak="0">
     <w:nsid w:val="26DB5D1B"/>
     <w:multiLevelType w:val="hybridMultilevel"/>
     <w:tmpl w:val="602AB47E"/>
@@ -37989,7 +38821,7 @@
       </w:rPr>
     </w:lvl>
   </w:abstractNum>
-  <w:abstractNum w:abstractNumId="12" w15:restartNumberingAfterBreak="0">
+  <w:abstractNum w:abstractNumId="14" w15:restartNumberingAfterBreak="0">
     <w:nsid w:val="275804AE"/>
     <w:multiLevelType w:val="hybridMultilevel"/>
     <w:tmpl w:val="70B415DA"/>
@@ -38101,7 +38933,7 @@
       </w:rPr>
     </w:lvl>
   </w:abstractNum>
-  <w:abstractNum w:abstractNumId="13" w15:restartNumberingAfterBreak="0">
+  <w:abstractNum w:abstractNumId="15" w15:restartNumberingAfterBreak="0">
     <w:nsid w:val="2790734B"/>
     <w:multiLevelType w:val="hybridMultilevel"/>
     <w:tmpl w:val="B4441A7C"/>
@@ -38213,7 +39045,7 @@
       </w:rPr>
     </w:lvl>
   </w:abstractNum>
-  <w:abstractNum w:abstractNumId="14" w15:restartNumberingAfterBreak="0">
+  <w:abstractNum w:abstractNumId="16" w15:restartNumberingAfterBreak="0">
     <w:nsid w:val="27B45752"/>
     <w:multiLevelType w:val="hybridMultilevel"/>
     <w:tmpl w:val="E8EEAD68"/>
@@ -38302,7 +39134,7 @@
       </w:pPr>
     </w:lvl>
   </w:abstractNum>
-  <w:abstractNum w:abstractNumId="15" w15:restartNumberingAfterBreak="0">
+  <w:abstractNum w:abstractNumId="17" w15:restartNumberingAfterBreak="0">
     <w:nsid w:val="29AF64FA"/>
     <w:multiLevelType w:val="hybridMultilevel"/>
     <w:tmpl w:val="2C702C7C"/>
@@ -38414,7 +39246,7 @@
       </w:rPr>
     </w:lvl>
   </w:abstractNum>
-  <w:abstractNum w:abstractNumId="16" w15:restartNumberingAfterBreak="0">
+  <w:abstractNum w:abstractNumId="18" w15:restartNumberingAfterBreak="0">
     <w:nsid w:val="2A2C1CF6"/>
     <w:multiLevelType w:val="hybridMultilevel"/>
     <w:tmpl w:val="4746D32E"/>
@@ -38503,7 +39335,7 @@
       </w:pPr>
     </w:lvl>
   </w:abstractNum>
-  <w:abstractNum w:abstractNumId="17" w15:restartNumberingAfterBreak="0">
+  <w:abstractNum w:abstractNumId="19" w15:restartNumberingAfterBreak="0">
     <w:nsid w:val="342123D3"/>
     <w:multiLevelType w:val="hybridMultilevel"/>
     <w:tmpl w:val="D4A0A786"/>
@@ -38615,7 +39447,7 @@
       </w:rPr>
     </w:lvl>
   </w:abstractNum>
-  <w:abstractNum w:abstractNumId="18" w15:restartNumberingAfterBreak="0">
+  <w:abstractNum w:abstractNumId="20" w15:restartNumberingAfterBreak="0">
     <w:nsid w:val="42F60940"/>
     <w:multiLevelType w:val="hybridMultilevel"/>
     <w:tmpl w:val="2356256A"/>
@@ -38727,7 +39559,119 @@
       </w:rPr>
     </w:lvl>
   </w:abstractNum>
-  <w:abstractNum w:abstractNumId="19" w15:restartNumberingAfterBreak="0">
+  <w:abstractNum w:abstractNumId="21" w15:restartNumberingAfterBreak="0">
+    <w:nsid w:val="43EB4409"/>
+    <w:multiLevelType w:val="hybridMultilevel"/>
+    <w:tmpl w:val="8D7A23D6"/>
+    <w:lvl w:ilvl="0" w:tplc="F4002594">
+      <w:numFmt w:val="bullet"/>
+      <w:lvlText w:val="-"/>
+      <w:lvlJc w:val="left"/>
+      <w:pPr>
+        <w:ind w:left="720" w:hanging="360"/>
+      </w:pPr>
+      <w:rPr>
+        <w:rFonts w:ascii="Times New Roman" w:eastAsia="Times New Roman" w:hAnsi="Times New Roman" w:cs="Times New Roman" w:hint="default"/>
+      </w:rPr>
+    </w:lvl>
+    <w:lvl w:ilvl="1" w:tplc="04090003" w:tentative="1">
+      <w:start w:val="1"/>
+      <w:numFmt w:val="bullet"/>
+      <w:lvlText w:val="o"/>
+      <w:lvlJc w:val="left"/>
+      <w:pPr>
+        <w:ind w:left="1440" w:hanging="360"/>
+      </w:pPr>
+      <w:rPr>
+        <w:rFonts w:ascii="Courier New" w:hAnsi="Courier New" w:cs="Courier New" w:hint="default"/>
+      </w:rPr>
+    </w:lvl>
+    <w:lvl w:ilvl="2" w:tplc="04090005" w:tentative="1">
+      <w:start w:val="1"/>
+      <w:numFmt w:val="bullet"/>
+      <w:lvlText w:val=""/>
+      <w:lvlJc w:val="left"/>
+      <w:pPr>
+        <w:ind w:left="2160" w:hanging="360"/>
+      </w:pPr>
+      <w:rPr>
+        <w:rFonts w:ascii="Wingdings" w:hAnsi="Wingdings" w:hint="default"/>
+      </w:rPr>
+    </w:lvl>
+    <w:lvl w:ilvl="3" w:tplc="04090001" w:tentative="1">
+      <w:start w:val="1"/>
+      <w:numFmt w:val="bullet"/>
+      <w:lvlText w:val=""/>
+      <w:lvlJc w:val="left"/>
+      <w:pPr>
+        <w:ind w:left="2880" w:hanging="360"/>
+      </w:pPr>
+      <w:rPr>
+        <w:rFonts w:ascii="Symbol" w:hAnsi="Symbol" w:hint="default"/>
+      </w:rPr>
+    </w:lvl>
+    <w:lvl w:ilvl="4" w:tplc="04090003" w:tentative="1">
+      <w:start w:val="1"/>
+      <w:numFmt w:val="bullet"/>
+      <w:lvlText w:val="o"/>
+      <w:lvlJc w:val="left"/>
+      <w:pPr>
+        <w:ind w:left="3600" w:hanging="360"/>
+      </w:pPr>
+      <w:rPr>
+        <w:rFonts w:ascii="Courier New" w:hAnsi="Courier New" w:cs="Courier New" w:hint="default"/>
+      </w:rPr>
+    </w:lvl>
+    <w:lvl w:ilvl="5" w:tplc="04090005" w:tentative="1">
+      <w:start w:val="1"/>
+      <w:numFmt w:val="bullet"/>
+      <w:lvlText w:val=""/>
+      <w:lvlJc w:val="left"/>
+      <w:pPr>
+        <w:ind w:left="4320" w:hanging="360"/>
+      </w:pPr>
+      <w:rPr>
+        <w:rFonts w:ascii="Wingdings" w:hAnsi="Wingdings" w:hint="default"/>
+      </w:rPr>
+    </w:lvl>
+    <w:lvl w:ilvl="6" w:tplc="04090001" w:tentative="1">
+      <w:start w:val="1"/>
+      <w:numFmt w:val="bullet"/>
+      <w:lvlText w:val=""/>
+      <w:lvlJc w:val="left"/>
+      <w:pPr>
+        <w:ind w:left="5040" w:hanging="360"/>
+      </w:pPr>
+      <w:rPr>
+        <w:rFonts w:ascii="Symbol" w:hAnsi="Symbol" w:hint="default"/>
+      </w:rPr>
+    </w:lvl>
+    <w:lvl w:ilvl="7" w:tplc="04090003" w:tentative="1">
+      <w:start w:val="1"/>
+      <w:numFmt w:val="bullet"/>
+      <w:lvlText w:val="o"/>
+      <w:lvlJc w:val="left"/>
+      <w:pPr>
+        <w:ind w:left="5760" w:hanging="360"/>
+      </w:pPr>
+      <w:rPr>
+        <w:rFonts w:ascii="Courier New" w:hAnsi="Courier New" w:cs="Courier New" w:hint="default"/>
+      </w:rPr>
+    </w:lvl>
+    <w:lvl w:ilvl="8" w:tplc="04090005" w:tentative="1">
+      <w:start w:val="1"/>
+      <w:numFmt w:val="bullet"/>
+      <w:lvlText w:val=""/>
+      <w:lvlJc w:val="left"/>
+      <w:pPr>
+        <w:ind w:left="6480" w:hanging="360"/>
+      </w:pPr>
+      <w:rPr>
+        <w:rFonts w:ascii="Wingdings" w:hAnsi="Wingdings" w:hint="default"/>
+      </w:rPr>
+    </w:lvl>
+  </w:abstractNum>
+  <w:abstractNum w:abstractNumId="22" w15:restartNumberingAfterBreak="0">
     <w:nsid w:val="46061AF6"/>
     <w:multiLevelType w:val="hybridMultilevel"/>
     <w:tmpl w:val="EED4BEA2"/>
@@ -38823,7 +39767,7 @@
       </w:pPr>
     </w:lvl>
   </w:abstractNum>
-  <w:abstractNum w:abstractNumId="20" w15:restartNumberingAfterBreak="0">
+  <w:abstractNum w:abstractNumId="23" w15:restartNumberingAfterBreak="0">
     <w:nsid w:val="472764C4"/>
     <w:multiLevelType w:val="hybridMultilevel"/>
     <w:tmpl w:val="4C6A11E4"/>
@@ -38912,7 +39856,7 @@
       </w:pPr>
     </w:lvl>
   </w:abstractNum>
-  <w:abstractNum w:abstractNumId="21" w15:restartNumberingAfterBreak="0">
+  <w:abstractNum w:abstractNumId="24" w15:restartNumberingAfterBreak="0">
     <w:nsid w:val="479A356F"/>
     <w:multiLevelType w:val="hybridMultilevel"/>
     <w:tmpl w:val="3D485C62"/>
@@ -39024,7 +39968,7 @@
       </w:rPr>
     </w:lvl>
   </w:abstractNum>
-  <w:abstractNum w:abstractNumId="22" w15:restartNumberingAfterBreak="0">
+  <w:abstractNum w:abstractNumId="25" w15:restartNumberingAfterBreak="0">
     <w:nsid w:val="47FD6DE8"/>
     <w:multiLevelType w:val="hybridMultilevel"/>
     <w:tmpl w:val="5A886FF4"/>
@@ -39136,10 +40080,10 @@
       </w:rPr>
     </w:lvl>
   </w:abstractNum>
-  <w:abstractNum w:abstractNumId="23" w15:restartNumberingAfterBreak="0">
-    <w:nsid w:val="4B0D6C59"/>
+  <w:abstractNum w:abstractNumId="26" w15:restartNumberingAfterBreak="0">
+    <w:nsid w:val="4897098A"/>
     <w:multiLevelType w:val="hybridMultilevel"/>
-    <w:tmpl w:val="AF0A9ECC"/>
+    <w:tmpl w:val="2C6A6250"/>
     <w:lvl w:ilvl="0" w:tplc="F4002594">
       <w:numFmt w:val="bullet"/>
       <w:lvlText w:val="-"/>
@@ -39248,10 +40192,10 @@
       </w:rPr>
     </w:lvl>
   </w:abstractNum>
-  <w:abstractNum w:abstractNumId="24" w15:restartNumberingAfterBreak="0">
-    <w:nsid w:val="4D3A6377"/>
+  <w:abstractNum w:abstractNumId="27" w15:restartNumberingAfterBreak="0">
+    <w:nsid w:val="4B0D6C59"/>
     <w:multiLevelType w:val="hybridMultilevel"/>
-    <w:tmpl w:val="1C7663BA"/>
+    <w:tmpl w:val="AF0A9ECC"/>
     <w:lvl w:ilvl="0" w:tplc="F4002594">
       <w:numFmt w:val="bullet"/>
       <w:lvlText w:val="-"/>
@@ -39360,7 +40304,119 @@
       </w:rPr>
     </w:lvl>
   </w:abstractNum>
-  <w:abstractNum w:abstractNumId="25" w15:restartNumberingAfterBreak="0">
+  <w:abstractNum w:abstractNumId="28" w15:restartNumberingAfterBreak="0">
+    <w:nsid w:val="4D3A6377"/>
+    <w:multiLevelType w:val="hybridMultilevel"/>
+    <w:tmpl w:val="1C7663BA"/>
+    <w:lvl w:ilvl="0" w:tplc="F4002594">
+      <w:numFmt w:val="bullet"/>
+      <w:lvlText w:val="-"/>
+      <w:lvlJc w:val="left"/>
+      <w:pPr>
+        <w:ind w:left="720" w:hanging="360"/>
+      </w:pPr>
+      <w:rPr>
+        <w:rFonts w:ascii="Times New Roman" w:eastAsia="Times New Roman" w:hAnsi="Times New Roman" w:cs="Times New Roman" w:hint="default"/>
+      </w:rPr>
+    </w:lvl>
+    <w:lvl w:ilvl="1" w:tplc="04090003" w:tentative="1">
+      <w:start w:val="1"/>
+      <w:numFmt w:val="bullet"/>
+      <w:lvlText w:val="o"/>
+      <w:lvlJc w:val="left"/>
+      <w:pPr>
+        <w:ind w:left="1440" w:hanging="360"/>
+      </w:pPr>
+      <w:rPr>
+        <w:rFonts w:ascii="Courier New" w:hAnsi="Courier New" w:cs="Courier New" w:hint="default"/>
+      </w:rPr>
+    </w:lvl>
+    <w:lvl w:ilvl="2" w:tplc="04090005" w:tentative="1">
+      <w:start w:val="1"/>
+      <w:numFmt w:val="bullet"/>
+      <w:lvlText w:val=""/>
+      <w:lvlJc w:val="left"/>
+      <w:pPr>
+        <w:ind w:left="2160" w:hanging="360"/>
+      </w:pPr>
+      <w:rPr>
+        <w:rFonts w:ascii="Wingdings" w:hAnsi="Wingdings" w:hint="default"/>
+      </w:rPr>
+    </w:lvl>
+    <w:lvl w:ilvl="3" w:tplc="04090001" w:tentative="1">
+      <w:start w:val="1"/>
+      <w:numFmt w:val="bullet"/>
+      <w:lvlText w:val=""/>
+      <w:lvlJc w:val="left"/>
+      <w:pPr>
+        <w:ind w:left="2880" w:hanging="360"/>
+      </w:pPr>
+      <w:rPr>
+        <w:rFonts w:ascii="Symbol" w:hAnsi="Symbol" w:hint="default"/>
+      </w:rPr>
+    </w:lvl>
+    <w:lvl w:ilvl="4" w:tplc="04090003" w:tentative="1">
+      <w:start w:val="1"/>
+      <w:numFmt w:val="bullet"/>
+      <w:lvlText w:val="o"/>
+      <w:lvlJc w:val="left"/>
+      <w:pPr>
+        <w:ind w:left="3600" w:hanging="360"/>
+      </w:pPr>
+      <w:rPr>
+        <w:rFonts w:ascii="Courier New" w:hAnsi="Courier New" w:cs="Courier New" w:hint="default"/>
+      </w:rPr>
+    </w:lvl>
+    <w:lvl w:ilvl="5" w:tplc="04090005" w:tentative="1">
+      <w:start w:val="1"/>
+      <w:numFmt w:val="bullet"/>
+      <w:lvlText w:val=""/>
+      <w:lvlJc w:val="left"/>
+      <w:pPr>
+        <w:ind w:left="4320" w:hanging="360"/>
+      </w:pPr>
+      <w:rPr>
+        <w:rFonts w:ascii="Wingdings" w:hAnsi="Wingdings" w:hint="default"/>
+      </w:rPr>
+    </w:lvl>
+    <w:lvl w:ilvl="6" w:tplc="04090001" w:tentative="1">
+      <w:start w:val="1"/>
+      <w:numFmt w:val="bullet"/>
+      <w:lvlText w:val=""/>
+      <w:lvlJc w:val="left"/>
+      <w:pPr>
+        <w:ind w:left="5040" w:hanging="360"/>
+      </w:pPr>
+      <w:rPr>
+        <w:rFonts w:ascii="Symbol" w:hAnsi="Symbol" w:hint="default"/>
+      </w:rPr>
+    </w:lvl>
+    <w:lvl w:ilvl="7" w:tplc="04090003" w:tentative="1">
+      <w:start w:val="1"/>
+      <w:numFmt w:val="bullet"/>
+      <w:lvlText w:val="o"/>
+      <w:lvlJc w:val="left"/>
+      <w:pPr>
+        <w:ind w:left="5760" w:hanging="360"/>
+      </w:pPr>
+      <w:rPr>
+        <w:rFonts w:ascii="Courier New" w:hAnsi="Courier New" w:cs="Courier New" w:hint="default"/>
+      </w:rPr>
+    </w:lvl>
+    <w:lvl w:ilvl="8" w:tplc="04090005" w:tentative="1">
+      <w:start w:val="1"/>
+      <w:numFmt w:val="bullet"/>
+      <w:lvlText w:val=""/>
+      <w:lvlJc w:val="left"/>
+      <w:pPr>
+        <w:ind w:left="6480" w:hanging="360"/>
+      </w:pPr>
+      <w:rPr>
+        <w:rFonts w:ascii="Wingdings" w:hAnsi="Wingdings" w:hint="default"/>
+      </w:rPr>
+    </w:lvl>
+  </w:abstractNum>
+  <w:abstractNum w:abstractNumId="29" w15:restartNumberingAfterBreak="0">
     <w:nsid w:val="4EC47473"/>
     <w:multiLevelType w:val="hybridMultilevel"/>
     <w:tmpl w:val="4C82A0AC"/>
@@ -39456,7 +40512,7 @@
       </w:pPr>
     </w:lvl>
   </w:abstractNum>
-  <w:abstractNum w:abstractNumId="26" w15:restartNumberingAfterBreak="0">
+  <w:abstractNum w:abstractNumId="30" w15:restartNumberingAfterBreak="0">
     <w:nsid w:val="52100658"/>
     <w:multiLevelType w:val="hybridMultilevel"/>
     <w:tmpl w:val="30F6C408"/>
@@ -39552,7 +40608,7 @@
       </w:pPr>
     </w:lvl>
   </w:abstractNum>
-  <w:abstractNum w:abstractNumId="27" w15:restartNumberingAfterBreak="0">
+  <w:abstractNum w:abstractNumId="31" w15:restartNumberingAfterBreak="0">
     <w:nsid w:val="57B62A3A"/>
     <w:multiLevelType w:val="hybridMultilevel"/>
     <w:tmpl w:val="5F500448"/>
@@ -39648,7 +40704,7 @@
       </w:pPr>
     </w:lvl>
   </w:abstractNum>
-  <w:abstractNum w:abstractNumId="28" w15:restartNumberingAfterBreak="0">
+  <w:abstractNum w:abstractNumId="32" w15:restartNumberingAfterBreak="0">
     <w:nsid w:val="58E765E0"/>
     <w:multiLevelType w:val="hybridMultilevel"/>
     <w:tmpl w:val="3C1A0076"/>
@@ -39743,7 +40799,7 @@
       </w:pPr>
     </w:lvl>
   </w:abstractNum>
-  <w:abstractNum w:abstractNumId="29" w15:restartNumberingAfterBreak="0">
+  <w:abstractNum w:abstractNumId="33" w15:restartNumberingAfterBreak="0">
     <w:nsid w:val="6050221B"/>
     <w:multiLevelType w:val="hybridMultilevel"/>
     <w:tmpl w:val="1F16F176"/>
@@ -39856,7 +40912,7 @@
       </w:rPr>
     </w:lvl>
   </w:abstractNum>
-  <w:abstractNum w:abstractNumId="30" w15:restartNumberingAfterBreak="0">
+  <w:abstractNum w:abstractNumId="34" w15:restartNumberingAfterBreak="0">
     <w:nsid w:val="617B6B9F"/>
     <w:multiLevelType w:val="hybridMultilevel"/>
     <w:tmpl w:val="F0B04FAA"/>
@@ -39945,7 +41001,7 @@
       </w:pPr>
     </w:lvl>
   </w:abstractNum>
-  <w:abstractNum w:abstractNumId="31" w15:restartNumberingAfterBreak="0">
+  <w:abstractNum w:abstractNumId="35" w15:restartNumberingAfterBreak="0">
     <w:nsid w:val="623F675B"/>
     <w:multiLevelType w:val="hybridMultilevel"/>
     <w:tmpl w:val="CD608CA0"/>
@@ -40057,7 +41113,7 @@
       </w:rPr>
     </w:lvl>
   </w:abstractNum>
-  <w:abstractNum w:abstractNumId="32" w15:restartNumberingAfterBreak="0">
+  <w:abstractNum w:abstractNumId="36" w15:restartNumberingAfterBreak="0">
     <w:nsid w:val="6690742C"/>
     <w:multiLevelType w:val="hybridMultilevel"/>
     <w:tmpl w:val="3A0C2976"/>
@@ -40153,7 +41209,119 @@
       </w:pPr>
     </w:lvl>
   </w:abstractNum>
-  <w:abstractNum w:abstractNumId="33" w15:restartNumberingAfterBreak="0">
+  <w:abstractNum w:abstractNumId="37" w15:restartNumberingAfterBreak="0">
+    <w:nsid w:val="6CAC4A96"/>
+    <w:multiLevelType w:val="hybridMultilevel"/>
+    <w:tmpl w:val="510E094E"/>
+    <w:lvl w:ilvl="0" w:tplc="F4002594">
+      <w:numFmt w:val="bullet"/>
+      <w:lvlText w:val="-"/>
+      <w:lvlJc w:val="left"/>
+      <w:pPr>
+        <w:ind w:left="720" w:hanging="360"/>
+      </w:pPr>
+      <w:rPr>
+        <w:rFonts w:ascii="Times New Roman" w:eastAsia="Times New Roman" w:hAnsi="Times New Roman" w:cs="Times New Roman" w:hint="default"/>
+      </w:rPr>
+    </w:lvl>
+    <w:lvl w:ilvl="1" w:tplc="04090003" w:tentative="1">
+      <w:start w:val="1"/>
+      <w:numFmt w:val="bullet"/>
+      <w:lvlText w:val="o"/>
+      <w:lvlJc w:val="left"/>
+      <w:pPr>
+        <w:ind w:left="1440" w:hanging="360"/>
+      </w:pPr>
+      <w:rPr>
+        <w:rFonts w:ascii="Courier New" w:hAnsi="Courier New" w:cs="Courier New" w:hint="default"/>
+      </w:rPr>
+    </w:lvl>
+    <w:lvl w:ilvl="2" w:tplc="04090005" w:tentative="1">
+      <w:start w:val="1"/>
+      <w:numFmt w:val="bullet"/>
+      <w:lvlText w:val=""/>
+      <w:lvlJc w:val="left"/>
+      <w:pPr>
+        <w:ind w:left="2160" w:hanging="360"/>
+      </w:pPr>
+      <w:rPr>
+        <w:rFonts w:ascii="Wingdings" w:hAnsi="Wingdings" w:hint="default"/>
+      </w:rPr>
+    </w:lvl>
+    <w:lvl w:ilvl="3" w:tplc="04090001" w:tentative="1">
+      <w:start w:val="1"/>
+      <w:numFmt w:val="bullet"/>
+      <w:lvlText w:val=""/>
+      <w:lvlJc w:val="left"/>
+      <w:pPr>
+        <w:ind w:left="2880" w:hanging="360"/>
+      </w:pPr>
+      <w:rPr>
+        <w:rFonts w:ascii="Symbol" w:hAnsi="Symbol" w:hint="default"/>
+      </w:rPr>
+    </w:lvl>
+    <w:lvl w:ilvl="4" w:tplc="04090003" w:tentative="1">
+      <w:start w:val="1"/>
+      <w:numFmt w:val="bullet"/>
+      <w:lvlText w:val="o"/>
+      <w:lvlJc w:val="left"/>
+      <w:pPr>
+        <w:ind w:left="3600" w:hanging="360"/>
+      </w:pPr>
+      <w:rPr>
+        <w:rFonts w:ascii="Courier New" w:hAnsi="Courier New" w:cs="Courier New" w:hint="default"/>
+      </w:rPr>
+    </w:lvl>
+    <w:lvl w:ilvl="5" w:tplc="04090005" w:tentative="1">
+      <w:start w:val="1"/>
+      <w:numFmt w:val="bullet"/>
+      <w:lvlText w:val=""/>
+      <w:lvlJc w:val="left"/>
+      <w:pPr>
+        <w:ind w:left="4320" w:hanging="360"/>
+      </w:pPr>
+      <w:rPr>
+        <w:rFonts w:ascii="Wingdings" w:hAnsi="Wingdings" w:hint="default"/>
+      </w:rPr>
+    </w:lvl>
+    <w:lvl w:ilvl="6" w:tplc="04090001" w:tentative="1">
+      <w:start w:val="1"/>
+      <w:numFmt w:val="bullet"/>
+      <w:lvlText w:val=""/>
+      <w:lvlJc w:val="left"/>
+      <w:pPr>
+        <w:ind w:left="5040" w:hanging="360"/>
+      </w:pPr>
+      <w:rPr>
+        <w:rFonts w:ascii="Symbol" w:hAnsi="Symbol" w:hint="default"/>
+      </w:rPr>
+    </w:lvl>
+    <w:lvl w:ilvl="7" w:tplc="04090003" w:tentative="1">
+      <w:start w:val="1"/>
+      <w:numFmt w:val="bullet"/>
+      <w:lvlText w:val="o"/>
+      <w:lvlJc w:val="left"/>
+      <w:pPr>
+        <w:ind w:left="5760" w:hanging="360"/>
+      </w:pPr>
+      <w:rPr>
+        <w:rFonts w:ascii="Courier New" w:hAnsi="Courier New" w:cs="Courier New" w:hint="default"/>
+      </w:rPr>
+    </w:lvl>
+    <w:lvl w:ilvl="8" w:tplc="04090005" w:tentative="1">
+      <w:start w:val="1"/>
+      <w:numFmt w:val="bullet"/>
+      <w:lvlText w:val=""/>
+      <w:lvlJc w:val="left"/>
+      <w:pPr>
+        <w:ind w:left="6480" w:hanging="360"/>
+      </w:pPr>
+      <w:rPr>
+        <w:rFonts w:ascii="Wingdings" w:hAnsi="Wingdings" w:hint="default"/>
+      </w:rPr>
+    </w:lvl>
+  </w:abstractNum>
+  <w:abstractNum w:abstractNumId="38" w15:restartNumberingAfterBreak="0">
     <w:nsid w:val="71A63C3D"/>
     <w:multiLevelType w:val="hybridMultilevel"/>
     <w:tmpl w:val="42AAE1AC"/>
@@ -40266,7 +41434,7 @@
       </w:rPr>
     </w:lvl>
   </w:abstractNum>
-  <w:abstractNum w:abstractNumId="34" w15:restartNumberingAfterBreak="0">
+  <w:abstractNum w:abstractNumId="39" w15:restartNumberingAfterBreak="0">
     <w:nsid w:val="77B521CA"/>
     <w:multiLevelType w:val="multilevel"/>
     <w:tmpl w:val="E8D25FA6"/>
@@ -40379,10 +41547,10 @@
       </w:pPr>
     </w:lvl>
   </w:abstractNum>
-  <w:abstractNum w:abstractNumId="35" w15:restartNumberingAfterBreak="0">
-    <w:nsid w:val="7C966D3A"/>
+  <w:abstractNum w:abstractNumId="40" w15:restartNumberingAfterBreak="0">
+    <w:nsid w:val="77FC53CA"/>
     <w:multiLevelType w:val="hybridMultilevel"/>
-    <w:tmpl w:val="545E1134"/>
+    <w:tmpl w:val="8BB406EA"/>
     <w:lvl w:ilvl="0" w:tplc="F4002594">
       <w:numFmt w:val="bullet"/>
       <w:lvlText w:val="-"/>
@@ -40491,7 +41659,119 @@
       </w:rPr>
     </w:lvl>
   </w:abstractNum>
-  <w:abstractNum w:abstractNumId="36" w15:restartNumberingAfterBreak="0">
+  <w:abstractNum w:abstractNumId="41" w15:restartNumberingAfterBreak="0">
+    <w:nsid w:val="7C966D3A"/>
+    <w:multiLevelType w:val="hybridMultilevel"/>
+    <w:tmpl w:val="545E1134"/>
+    <w:lvl w:ilvl="0" w:tplc="F4002594">
+      <w:numFmt w:val="bullet"/>
+      <w:lvlText w:val="-"/>
+      <w:lvlJc w:val="left"/>
+      <w:pPr>
+        <w:ind w:left="720" w:hanging="360"/>
+      </w:pPr>
+      <w:rPr>
+        <w:rFonts w:ascii="Times New Roman" w:eastAsia="Times New Roman" w:hAnsi="Times New Roman" w:cs="Times New Roman" w:hint="default"/>
+      </w:rPr>
+    </w:lvl>
+    <w:lvl w:ilvl="1" w:tplc="04090003" w:tentative="1">
+      <w:start w:val="1"/>
+      <w:numFmt w:val="bullet"/>
+      <w:lvlText w:val="o"/>
+      <w:lvlJc w:val="left"/>
+      <w:pPr>
+        <w:ind w:left="1440" w:hanging="360"/>
+      </w:pPr>
+      <w:rPr>
+        <w:rFonts w:ascii="Courier New" w:hAnsi="Courier New" w:cs="Courier New" w:hint="default"/>
+      </w:rPr>
+    </w:lvl>
+    <w:lvl w:ilvl="2" w:tplc="04090005" w:tentative="1">
+      <w:start w:val="1"/>
+      <w:numFmt w:val="bullet"/>
+      <w:lvlText w:val=""/>
+      <w:lvlJc w:val="left"/>
+      <w:pPr>
+        <w:ind w:left="2160" w:hanging="360"/>
+      </w:pPr>
+      <w:rPr>
+        <w:rFonts w:ascii="Wingdings" w:hAnsi="Wingdings" w:hint="default"/>
+      </w:rPr>
+    </w:lvl>
+    <w:lvl w:ilvl="3" w:tplc="04090001" w:tentative="1">
+      <w:start w:val="1"/>
+      <w:numFmt w:val="bullet"/>
+      <w:lvlText w:val=""/>
+      <w:lvlJc w:val="left"/>
+      <w:pPr>
+        <w:ind w:left="2880" w:hanging="360"/>
+      </w:pPr>
+      <w:rPr>
+        <w:rFonts w:ascii="Symbol" w:hAnsi="Symbol" w:hint="default"/>
+      </w:rPr>
+    </w:lvl>
+    <w:lvl w:ilvl="4" w:tplc="04090003" w:tentative="1">
+      <w:start w:val="1"/>
+      <w:numFmt w:val="bullet"/>
+      <w:lvlText w:val="o"/>
+      <w:lvlJc w:val="left"/>
+      <w:pPr>
+        <w:ind w:left="3600" w:hanging="360"/>
+      </w:pPr>
+      <w:rPr>
+        <w:rFonts w:ascii="Courier New" w:hAnsi="Courier New" w:cs="Courier New" w:hint="default"/>
+      </w:rPr>
+    </w:lvl>
+    <w:lvl w:ilvl="5" w:tplc="04090005" w:tentative="1">
+      <w:start w:val="1"/>
+      <w:numFmt w:val="bullet"/>
+      <w:lvlText w:val=""/>
+      <w:lvlJc w:val="left"/>
+      <w:pPr>
+        <w:ind w:left="4320" w:hanging="360"/>
+      </w:pPr>
+      <w:rPr>
+        <w:rFonts w:ascii="Wingdings" w:hAnsi="Wingdings" w:hint="default"/>
+      </w:rPr>
+    </w:lvl>
+    <w:lvl w:ilvl="6" w:tplc="04090001" w:tentative="1">
+      <w:start w:val="1"/>
+      <w:numFmt w:val="bullet"/>
+      <w:lvlText w:val=""/>
+      <w:lvlJc w:val="left"/>
+      <w:pPr>
+        <w:ind w:left="5040" w:hanging="360"/>
+      </w:pPr>
+      <w:rPr>
+        <w:rFonts w:ascii="Symbol" w:hAnsi="Symbol" w:hint="default"/>
+      </w:rPr>
+    </w:lvl>
+    <w:lvl w:ilvl="7" w:tplc="04090003" w:tentative="1">
+      <w:start w:val="1"/>
+      <w:numFmt w:val="bullet"/>
+      <w:lvlText w:val="o"/>
+      <w:lvlJc w:val="left"/>
+      <w:pPr>
+        <w:ind w:left="5760" w:hanging="360"/>
+      </w:pPr>
+      <w:rPr>
+        <w:rFonts w:ascii="Courier New" w:hAnsi="Courier New" w:cs="Courier New" w:hint="default"/>
+      </w:rPr>
+    </w:lvl>
+    <w:lvl w:ilvl="8" w:tplc="04090005" w:tentative="1">
+      <w:start w:val="1"/>
+      <w:numFmt w:val="bullet"/>
+      <w:lvlText w:val=""/>
+      <w:lvlJc w:val="left"/>
+      <w:pPr>
+        <w:ind w:left="6480" w:hanging="360"/>
+      </w:pPr>
+      <w:rPr>
+        <w:rFonts w:ascii="Wingdings" w:hAnsi="Wingdings" w:hint="default"/>
+      </w:rPr>
+    </w:lvl>
+  </w:abstractNum>
+  <w:abstractNum w:abstractNumId="42" w15:restartNumberingAfterBreak="0">
     <w:nsid w:val="7D241863"/>
     <w:multiLevelType w:val="multilevel"/>
     <w:tmpl w:val="6A3AA0FA"/>
@@ -40640,121 +41920,139 @@
     </w:lvl>
   </w:abstractNum>
   <w:num w:numId="1">
-    <w:abstractNumId w:val="28"/>
+    <w:abstractNumId w:val="32"/>
     <w:lvlOverride w:ilvl="0">
       <w:startOverride w:val="1"/>
     </w:lvlOverride>
   </w:num>
   <w:num w:numId="2">
+    <w:abstractNumId w:val="39"/>
+  </w:num>
+  <w:num w:numId="3">
+    <w:abstractNumId w:val="2"/>
+  </w:num>
+  <w:num w:numId="4">
+    <w:abstractNumId w:val="42"/>
+  </w:num>
+  <w:num w:numId="5">
+    <w:abstractNumId w:val="18"/>
+  </w:num>
+  <w:num w:numId="6">
+    <w:abstractNumId w:val="33"/>
+  </w:num>
+  <w:num w:numId="7">
+    <w:abstractNumId w:val="1"/>
+  </w:num>
+  <w:num w:numId="8">
+    <w:abstractNumId w:val="16"/>
+  </w:num>
+  <w:num w:numId="9">
+    <w:abstractNumId w:val="23"/>
+  </w:num>
+  <w:num w:numId="10">
+    <w:abstractNumId w:val="8"/>
+  </w:num>
+  <w:num w:numId="11">
+    <w:abstractNumId w:val="24"/>
+  </w:num>
+  <w:num w:numId="12">
+    <w:abstractNumId w:val="41"/>
+  </w:num>
+  <w:num w:numId="13">
+    <w:abstractNumId w:val="17"/>
+  </w:num>
+  <w:num w:numId="14">
+    <w:abstractNumId w:val="20"/>
+  </w:num>
+  <w:num w:numId="15">
+    <w:abstractNumId w:val="27"/>
+  </w:num>
+  <w:num w:numId="16">
+    <w:abstractNumId w:val="10"/>
+  </w:num>
+  <w:num w:numId="17">
+    <w:abstractNumId w:val="9"/>
+  </w:num>
+  <w:num w:numId="18">
+    <w:abstractNumId w:val="13"/>
+  </w:num>
+  <w:num w:numId="19">
+    <w:abstractNumId w:val="7"/>
+  </w:num>
+  <w:num w:numId="20">
+    <w:abstractNumId w:val="38"/>
+  </w:num>
+  <w:num w:numId="21">
     <w:abstractNumId w:val="34"/>
   </w:num>
-  <w:num w:numId="3">
-    <w:abstractNumId w:val="1"/>
+  <w:num w:numId="22">
+    <w:abstractNumId w:val="35"/>
   </w:num>
-  <w:num w:numId="4">
+  <w:num w:numId="23">
+    <w:abstractNumId w:val="28"/>
+  </w:num>
+  <w:num w:numId="24">
+    <w:abstractNumId w:val="14"/>
+  </w:num>
+  <w:num w:numId="25">
+    <w:abstractNumId w:val="19"/>
+  </w:num>
+  <w:num w:numId="26">
+    <w:abstractNumId w:val="15"/>
+  </w:num>
+  <w:num w:numId="27">
+    <w:abstractNumId w:val="32"/>
+  </w:num>
+  <w:num w:numId="28">
+    <w:abstractNumId w:val="11"/>
+  </w:num>
+  <w:num w:numId="29">
+    <w:abstractNumId w:val="31"/>
+  </w:num>
+  <w:num w:numId="30">
+    <w:abstractNumId w:val="25"/>
+  </w:num>
+  <w:num w:numId="31">
+    <w:abstractNumId w:val="4"/>
+  </w:num>
+  <w:num w:numId="32">
+    <w:abstractNumId w:val="29"/>
+  </w:num>
+  <w:num w:numId="33">
     <w:abstractNumId w:val="36"/>
   </w:num>
-  <w:num w:numId="5">
-    <w:abstractNumId w:val="16"/>
+  <w:num w:numId="34">
+    <w:abstractNumId w:val="6"/>
   </w:num>
-  <w:num w:numId="6">
-    <w:abstractNumId w:val="29"/>
+  <w:num w:numId="35">
+    <w:abstractNumId w:val="30"/>
   </w:num>
-  <w:num w:numId="7">
+  <w:num w:numId="36">
+    <w:abstractNumId w:val="5"/>
+  </w:num>
+  <w:num w:numId="37">
+    <w:abstractNumId w:val="22"/>
+  </w:num>
+  <w:num w:numId="38">
+    <w:abstractNumId w:val="12"/>
+  </w:num>
+  <w:num w:numId="39">
     <w:abstractNumId w:val="0"/>
   </w:num>
-  <w:num w:numId="8">
-    <w:abstractNumId w:val="14"/>
+  <w:num w:numId="40">
+    <w:abstractNumId w:val="40"/>
   </w:num>
-  <w:num w:numId="9">
-    <w:abstractNumId w:val="20"/>
+  <w:num w:numId="41">
+    <w:abstractNumId w:val="26"/>
   </w:num>
-  <w:num w:numId="10">
-    <w:abstractNumId w:val="6"/>
-  </w:num>
-  <w:num w:numId="11">
+  <w:num w:numId="42">
     <w:abstractNumId w:val="21"/>
   </w:num>
-  <w:num w:numId="12">
-    <w:abstractNumId w:val="35"/>
-  </w:num>
-  <w:num w:numId="13">
-    <w:abstractNumId w:val="15"/>
-  </w:num>
-  <w:num w:numId="14">
-    <w:abstractNumId w:val="18"/>
-  </w:num>
-  <w:num w:numId="15">
-    <w:abstractNumId w:val="23"/>
-  </w:num>
-  <w:num w:numId="16">
-    <w:abstractNumId w:val="8"/>
-  </w:num>
-  <w:num w:numId="17">
-    <w:abstractNumId w:val="7"/>
-  </w:num>
-  <w:num w:numId="18">
-    <w:abstractNumId w:val="11"/>
-  </w:num>
-  <w:num w:numId="19">
-    <w:abstractNumId w:val="5"/>
-  </w:num>
-  <w:num w:numId="20">
-    <w:abstractNumId w:val="33"/>
-  </w:num>
-  <w:num w:numId="21">
-    <w:abstractNumId w:val="30"/>
-  </w:num>
-  <w:num w:numId="22">
-    <w:abstractNumId w:val="31"/>
-  </w:num>
-  <w:num w:numId="23">
-    <w:abstractNumId w:val="24"/>
-  </w:num>
-  <w:num w:numId="24">
-    <w:abstractNumId w:val="12"/>
-  </w:num>
-  <w:num w:numId="25">
-    <w:abstractNumId w:val="17"/>
-  </w:num>
-  <w:num w:numId="26">
-    <w:abstractNumId w:val="13"/>
-  </w:num>
-  <w:num w:numId="27">
-    <w:abstractNumId w:val="28"/>
-  </w:num>
-  <w:num w:numId="28">
-    <w:abstractNumId w:val="9"/>
-  </w:num>
-  <w:num w:numId="29">
-    <w:abstractNumId w:val="27"/>
-  </w:num>
-  <w:num w:numId="30">
-    <w:abstractNumId w:val="22"/>
-  </w:num>
-  <w:num w:numId="31">
-    <w:abstractNumId w:val="2"/>
-  </w:num>
-  <w:num w:numId="32">
-    <w:abstractNumId w:val="25"/>
-  </w:num>
-  <w:num w:numId="33">
-    <w:abstractNumId w:val="32"/>
-  </w:num>
-  <w:num w:numId="34">
-    <w:abstractNumId w:val="4"/>
-  </w:num>
-  <w:num w:numId="35">
-    <w:abstractNumId w:val="26"/>
-  </w:num>
-  <w:num w:numId="36">
+  <w:num w:numId="43">
     <w:abstractNumId w:val="3"/>
   </w:num>
-  <w:num w:numId="37">
-    <w:abstractNumId w:val="19"/>
-  </w:num>
-  <w:num w:numId="38">
-    <w:abstractNumId w:val="10"/>
+  <w:num w:numId="44">
+    <w:abstractNumId w:val="37"/>
   </w:num>
   <w:numIdMacAtCleanup w:val="26"/>
 </w:numbering>

</xml_diff>

<commit_message>
refactor: update API endpoint, fix dialog context handling, add error logging, and include build configuration files
</commit_message>
<xml_diff>
--- a/Nhom12_DeTai6_NguyenMinhTri.docx
+++ b/Nhom12_DeTai6_NguyenMinhTri.docx
@@ -669,7 +669,7 @@
     </w:p>
     <w:bookmarkEnd w:id="30"/>
     <w:bookmarkEnd w:id="31"/>
-    <w:bookmarkStart w:id="41" w:name="chương-2-phân-tích-hệ-thống"/>
+    <w:bookmarkStart w:id="50" w:name="chương-2-phân-tích-hệ-thống"/>
     <w:p>
       <w:pPr>
         <w:pStyle w:val="Heading1"/>
@@ -696,7 +696,7 @@
       </w:r>
     </w:p>
     <w:bookmarkEnd w:id="32"/>
-    <w:bookmarkStart w:id="35" w:name="mô-hình-hóa-nghiệp-vụ"/>
+    <w:bookmarkStart w:id="38" w:name="mô-hình-hóa-nghiệp-vụ"/>
     <w:p>
       <w:pPr>
         <w:pStyle w:val="Heading2"/>
@@ -705,7 +705,7 @@
         <w:t xml:space="preserve">2.2. MÔ HÌNH HÓA NGHIỆP VỤ</w:t>
       </w:r>
     </w:p>
-    <w:bookmarkStart w:id="33" w:name="sơ-đồ-use-case-nghiệp-vụ"/>
+    <w:bookmarkStart w:id="36" w:name="sơ-đồ-use-case-nghiệp-vụ"/>
     <w:p>
       <w:pPr>
         <w:pStyle w:val="Heading3"/>
@@ -741,343 +741,128 @@
         <w:t xml:space="preserve"> </w:t>
       </w:r>
       <w:r>
-        <w:t xml:space="preserve">Là đối tượng trung tâm của ứng dụng. Người dùng thực hiện các hành động trực tiếp như đăng nhập, ghi chép giao dịch, xem báo cáo thống kê, tạo nhóm chi tiêu, và tương tác với trợ lý ảo Chatbot AI.</w:t>
-      </w:r>
-    </w:p>
-    <w:p>
-      <w:pPr>
-        <w:numPr>
-          <w:ilvl w:val="0"/>
-          <w:numId w:val="1008"/>
-        </w:numPr>
-        <w:pStyle w:val="Compact"/>
+        <w:t xml:space="preserve">Là đối tượng trung tâm của ứng dụng. Người dùng thực hiện các hành động trực tiếp như đăng nhập, ghi chép giao dịch, xem báo cáo thống kê, tạo/tham gia nhóm chi tiêu, và tương tác với trợ lý ảo Chatbot AI.</w:t>
+      </w:r>
+    </w:p>
+    <w:p>
+      <w:pPr>
+        <w:pStyle w:val="CaptionedFigure"/>
+      </w:pPr>
+      <w:r>
+        <w:drawing>
+          <wp:inline>
+            <wp:extent cx="5397500" cy="6386150"/>
+            <wp:effectExtent b="0" l="0" r="0" t="0"/>
+            <wp:docPr descr="diagram" title="" id="34" name="Picture"/>
+            <a:graphic>
+              <a:graphicData uri="http://schemas.openxmlformats.org/drawingml/2006/picture">
+                <pic:pic>
+                  <pic:nvPicPr>
+                    <pic:cNvPr descr="./thesis_content_with_images-1.png" id="35" name="Picture"/>
+                    <pic:cNvPicPr>
+                      <a:picLocks noChangeArrowheads="1" noChangeAspect="1"/>
+                    </pic:cNvPicPr>
+                  </pic:nvPicPr>
+                  <pic:blipFill>
+                    <a:blip r:embed="rId33"/>
+                    <a:stretch>
+                      <a:fillRect/>
+                    </a:stretch>
+                  </pic:blipFill>
+                  <pic:spPr bwMode="auto">
+                    <a:xfrm>
+                      <a:off x="0" y="0"/>
+                      <a:ext cx="5397500" cy="6386150"/>
+                    </a:xfrm>
+                    <a:prstGeom prst="rect">
+                      <a:avLst/>
+                    </a:prstGeom>
+                    <a:noFill/>
+                    <a:ln w="9525">
+                      <a:noFill/>
+                      <a:headEnd/>
+                      <a:tailEnd/>
+                    </a:ln>
+                  </pic:spPr>
+                </pic:pic>
+              </a:graphicData>
+            </a:graphic>
+          </wp:inline>
+        </w:drawing>
+      </w:r>
+    </w:p>
+    <w:p>
+      <w:pPr>
+        <w:pStyle w:val="ImageCaption"/>
+      </w:pPr>
+      <w:r>
+        <w:t xml:space="preserve">diagram</w:t>
+      </w:r>
+    </w:p>
+    <w:bookmarkEnd w:id="36"/>
+    <w:bookmarkStart w:id="37" w:name="mô-hình-hóa-quy-trình-nghiệp-vụ"/>
+    <w:p>
+      <w:pPr>
+        <w:pStyle w:val="Heading3"/>
+      </w:pPr>
+      <w:r>
+        <w:t xml:space="preserve">2.2.2. Mô hình hóa quy trình nghiệp vụ</w:t>
+      </w:r>
+    </w:p>
+    <w:p>
+      <w:pPr>
+        <w:pStyle w:val="FirstParagraph"/>
       </w:pPr>
       <w:r>
         <w:rPr>
           <w:bCs/>
           <w:b/>
         </w:rPr>
-        <w:t xml:space="preserve">Hệ thống đồng bộ (Sync System):</w:t>
-      </w:r>
-      <w:r>
-        <w:t xml:space="preserve"> </w:t>
-      </w:r>
-      <w:r>
-        <w:t xml:space="preserve">Đóng vai trò xử lý ngầm, đảm bảo tính nhất quán dữ liệu giữa kho lưu trữ cục bộ trên thiết bị di động (Local Storage) và máy chủ trung tâm (SQL Server).</w:t>
-      </w:r>
-    </w:p>
-    <w:bookmarkEnd w:id="33"/>
-    <w:bookmarkStart w:id="34" w:name="mô-hình-hóa-quy-trình-nghiệp-vụ"/>
-    <w:p>
-      <w:pPr>
-        <w:pStyle w:val="Heading3"/>
-      </w:pPr>
-      <w:r>
-        <w:t xml:space="preserve">2.2.2. Mô hình hóa quy trình nghiệp vụ</w:t>
-      </w:r>
-    </w:p>
-    <w:p>
-      <w:pPr>
-        <w:pStyle w:val="FirstParagraph"/>
-      </w:pPr>
+        <w:t xml:space="preserve">1. Ghi nhận giao dịch cá nhân</w:t>
+      </w:r>
+      <w:r>
+        <w:t xml:space="preserve"> </w:t>
+      </w:r>
+      <w:r>
+        <w:t xml:space="preserve">-</w:t>
+      </w:r>
+      <w:r>
+        <w:t xml:space="preserve"> </w:t>
+      </w:r>
       <w:r>
         <w:rPr>
           <w:bCs/>
           <w:b/>
         </w:rPr>
-        <w:t xml:space="preserve">Quy trình quản lý nhóm chi tiêu chung:</w:t>
-      </w:r>
-      <w:r>
-        <w:t xml:space="preserve"> </w:t>
-      </w:r>
-      <w:r>
-        <w:t xml:space="preserve">Khi một người dùng (Admin) tạo nhóm, hệ thống tạo một ID duy nhất cho nhóm đó. Admin tiến hành thêm các thành viên (Member). Bất kỳ thành viên nào trong nhóm khi phát sinh chi phí chung đều tiến hành tạo một Giao dịch (Expense). Quá trình này yêu cầu người nhập liệu chọn đúng nhóm và xác định</w:t>
-      </w:r>
-      <w:r>
-        <w:t xml:space="preserve"> </w:t>
-      </w:r>
-      <w:r>
-        <w:t xml:space="preserve">“</w:t>
-      </w:r>
-      <w:r>
-        <w:t xml:space="preserve">Người đã trả tiền</w:t>
-      </w:r>
-      <w:r>
-        <w:t xml:space="preserve">”</w:t>
-      </w:r>
-      <w:r>
-        <w:t xml:space="preserve"> </w:t>
-      </w:r>
-      <w:r>
-        <w:t xml:space="preserve">(PaidBy). Ngay khi giao dịch được xác nhận, hệ thống tính toán lại tỷ lệ đóng góp của từng cá nhân so với tổng chi phí chung, từ đó hiển thị danh sách các khoản nợ hoặc số tiền cần thu hồi của từng thành viên.</w:t>
-      </w:r>
-    </w:p>
-    <w:bookmarkEnd w:id="34"/>
-    <w:bookmarkEnd w:id="35"/>
-    <w:bookmarkStart w:id="38" w:name="mô-hình-hóa-chức-năng"/>
-    <w:p>
-      <w:pPr>
-        <w:pStyle w:val="Heading2"/>
-      </w:pPr>
-      <w:r>
-        <w:t xml:space="preserve">2.3. MÔ HÌNH HÓA CHỨC NĂNG</w:t>
-      </w:r>
-    </w:p>
-    <w:bookmarkStart w:id="36" w:name="sơ-đồ-use-case-hệ-thống"/>
-    <w:p>
-      <w:pPr>
-        <w:pStyle w:val="Heading3"/>
-      </w:pPr>
-      <w:r>
-        <w:t xml:space="preserve">2.3.1. Sơ đồ Use Case hệ thống</w:t>
-      </w:r>
-    </w:p>
-    <w:p>
-      <w:pPr>
-        <w:pStyle w:val="FirstParagraph"/>
-      </w:pPr>
-      <w:r>
-        <w:t xml:space="preserve">Dựa trên nghiệp vụ, hệ thống bao gồm các Use Case cốt lõi sau:</w:t>
-      </w:r>
-      <w:r>
-        <w:t xml:space="preserve"> </w:t>
-      </w:r>
-      <w:r>
-        <w:t xml:space="preserve">1. Đăng nhập / Đăng ký</w:t>
-      </w:r>
-      <w:r>
-        <w:t xml:space="preserve"> </w:t>
-      </w:r>
-      <w:r>
-        <w:t xml:space="preserve">2. Thêm mới giao dịch thu/chi</w:t>
-      </w:r>
-      <w:r>
-        <w:t xml:space="preserve"> </w:t>
-      </w:r>
-      <w:r>
-        <w:t xml:space="preserve">3. Chỉnh sửa / Xóa giao dịch</w:t>
-      </w:r>
-      <w:r>
-        <w:t xml:space="preserve"> </w:t>
-      </w:r>
-      <w:r>
-        <w:t xml:space="preserve">4. Quản lý mục tiêu tiết kiệm</w:t>
-      </w:r>
-      <w:r>
-        <w:t xml:space="preserve"> </w:t>
-      </w:r>
-      <w:r>
-        <w:t xml:space="preserve">5. Quản lý Nhóm (Tạo, Thêm/Xóa thành viên)</w:t>
-      </w:r>
-      <w:r>
-        <w:t xml:space="preserve"> </w:t>
-      </w:r>
-      <w:r>
-        <w:t xml:space="preserve">6. Trợ lý ảo Chatbot AI</w:t>
-      </w:r>
-    </w:p>
-    <w:p>
-      <w:pPr>
-        <w:pStyle w:val="SourceCode"/>
-      </w:pPr>
-      <w:r>
-        <w:rPr>
-          <w:rStyle w:val="VerbatimChar"/>
-        </w:rPr>
-        <w:t xml:space="preserve">flowchart LR</w:t>
-      </w:r>
-      <w:r>
-        <w:br/>
-      </w:r>
-      <w:r>
-        <w:rPr>
-          <w:rStyle w:val="VerbatimChar"/>
-        </w:rPr>
-        <w:t xml:space="preserve">    User([Người dùng])</w:t>
-      </w:r>
-      <w:r>
-        <w:br/>
-      </w:r>
-      <w:r>
-        <w:rPr>
-          <w:rStyle w:val="VerbatimChar"/>
-        </w:rPr>
-        <w:t xml:space="preserve">    Sync([Hệ thống đồng bộ])</w:t>
-      </w:r>
-      <w:r>
-        <w:br/>
-      </w:r>
-      <w:r>
-        <w:br/>
-      </w:r>
-      <w:r>
-        <w:rPr>
-          <w:rStyle w:val="VerbatimChar"/>
-        </w:rPr>
-        <w:t xml:space="preserve">    UC1(UC-01: Đăng nhập / Đăng ký)</w:t>
-      </w:r>
-      <w:r>
-        <w:br/>
-      </w:r>
-      <w:r>
-        <w:rPr>
-          <w:rStyle w:val="VerbatimChar"/>
-        </w:rPr>
-        <w:t xml:space="preserve">    UC2(UC-02: Thêm mới giao dịch)</w:t>
-      </w:r>
-      <w:r>
-        <w:br/>
-      </w:r>
-      <w:r>
-        <w:rPr>
-          <w:rStyle w:val="VerbatimChar"/>
-        </w:rPr>
-        <w:t xml:space="preserve">    UC3(UC-03: Trợ lý ảo Chatbot AI)</w:t>
-      </w:r>
-      <w:r>
-        <w:br/>
-      </w:r>
-      <w:r>
-        <w:rPr>
-          <w:rStyle w:val="VerbatimChar"/>
-        </w:rPr>
-        <w:t xml:space="preserve">    UC4(UC-04: Quản lý nhóm chi tiêu)</w:t>
-      </w:r>
-      <w:r>
-        <w:br/>
-      </w:r>
-      <w:r>
-        <w:rPr>
-          <w:rStyle w:val="VerbatimChar"/>
-        </w:rPr>
-        <w:t xml:space="preserve">    UC5(UC-05: Quản lý mục tiêu tiết kiệm)</w:t>
-      </w:r>
-      <w:r>
-        <w:br/>
-      </w:r>
-      <w:r>
-        <w:rPr>
-          <w:rStyle w:val="VerbatimChar"/>
-        </w:rPr>
-        <w:t xml:space="preserve">    UC6(UC-06: Chỉnh sửa / Xóa giao dịch)</w:t>
-      </w:r>
-      <w:r>
-        <w:br/>
-      </w:r>
-      <w:r>
-        <w:br/>
-      </w:r>
-      <w:r>
-        <w:rPr>
-          <w:rStyle w:val="VerbatimChar"/>
-        </w:rPr>
-        <w:t xml:space="preserve">    User --&gt; UC1</w:t>
-      </w:r>
-      <w:r>
-        <w:br/>
-      </w:r>
-      <w:r>
-        <w:rPr>
-          <w:rStyle w:val="VerbatimChar"/>
-        </w:rPr>
-        <w:t xml:space="preserve">    User --&gt; UC2</w:t>
-      </w:r>
-      <w:r>
-        <w:br/>
-      </w:r>
-      <w:r>
-        <w:rPr>
-          <w:rStyle w:val="VerbatimChar"/>
-        </w:rPr>
-        <w:t xml:space="preserve">    User --&gt; UC3</w:t>
-      </w:r>
-      <w:r>
-        <w:br/>
-      </w:r>
-      <w:r>
-        <w:rPr>
-          <w:rStyle w:val="VerbatimChar"/>
-        </w:rPr>
-        <w:t xml:space="preserve">    User --&gt; UC4</w:t>
-      </w:r>
-      <w:r>
-        <w:br/>
-      </w:r>
-      <w:r>
-        <w:rPr>
-          <w:rStyle w:val="VerbatimChar"/>
-        </w:rPr>
-        <w:t xml:space="preserve">    User --&gt; UC5</w:t>
-      </w:r>
-      <w:r>
-        <w:br/>
-      </w:r>
-      <w:r>
-        <w:rPr>
-          <w:rStyle w:val="VerbatimChar"/>
-        </w:rPr>
-        <w:t xml:space="preserve">    User --&gt; UC6</w:t>
-      </w:r>
-      <w:r>
-        <w:br/>
-      </w:r>
-      <w:r>
-        <w:br/>
-      </w:r>
-      <w:r>
-        <w:rPr>
-          <w:rStyle w:val="VerbatimChar"/>
-        </w:rPr>
-        <w:t xml:space="preserve">    UC1 -.-&gt;|include| Sync</w:t>
-      </w:r>
-      <w:r>
-        <w:br/>
-      </w:r>
-      <w:r>
-        <w:rPr>
-          <w:rStyle w:val="VerbatimChar"/>
-        </w:rPr>
-        <w:t xml:space="preserve">    UC2 -.-&gt;|include| Sync</w:t>
-      </w:r>
-      <w:r>
-        <w:br/>
-      </w:r>
-      <w:r>
-        <w:rPr>
-          <w:rStyle w:val="VerbatimChar"/>
-        </w:rPr>
-        <w:t xml:space="preserve">    UC4 -.-&gt;|include| Sync</w:t>
-      </w:r>
-      <w:r>
-        <w:br/>
-      </w:r>
-      <w:r>
-        <w:rPr>
-          <w:rStyle w:val="VerbatimChar"/>
-        </w:rPr>
-        <w:t xml:space="preserve">    UC6 -.-&gt;|include| Sync</w:t>
-      </w:r>
-    </w:p>
-    <w:bookmarkEnd w:id="36"/>
-    <w:bookmarkStart w:id="37" w:name="đặc-tả-use-case-hệ-thống"/>
-    <w:p>
-      <w:pPr>
-        <w:pStyle w:val="Heading3"/>
-      </w:pPr>
-      <w:r>
-        <w:t xml:space="preserve">2.3.2. Đặc tả Use Case hệ thống</w:t>
-      </w:r>
-    </w:p>
-    <w:p>
-      <w:pPr>
-        <w:pStyle w:val="FirstParagraph"/>
-      </w:pPr>
+        <w:t xml:space="preserve">Use case nghiệp vụ:</w:t>
+      </w:r>
+      <w:r>
+        <w:t xml:space="preserve"> </w:t>
+      </w:r>
+      <w:r>
+        <w:t xml:space="preserve">Ghi nhận giao dịch cá nhân</w:t>
+      </w:r>
+      <w:r>
+        <w:t xml:space="preserve"> </w:t>
+      </w:r>
+      <w:r>
+        <w:t xml:space="preserve">-</w:t>
+      </w:r>
+      <w:r>
+        <w:t xml:space="preserve"> </w:t>
+      </w:r>
       <w:r>
         <w:rPr>
           <w:bCs/>
           <w:b/>
         </w:rPr>
-        <w:t xml:space="preserve">Đặc tả UC-01: Đăng nhập bằng Google (Hybrid Auth)</w:t>
+        <w:t xml:space="preserve">Use case bắt đầu khi:</w:t>
+      </w:r>
+      <w:r>
+        <w:t xml:space="preserve"> </w:t>
+      </w:r>
+      <w:r>
+        <w:t xml:space="preserve">Người dùng có nhu cầu lưu lại một khoản thu hoặc chi vừa phát sinh trong thực tế.</w:t>
       </w:r>
       <w:r>
         <w:t xml:space="preserve"> </w:t>
@@ -1093,13 +878,13 @@
           <w:bCs/>
           <w:b/>
         </w:rPr>
-        <w:t xml:space="preserve">Mô tả:</w:t>
-      </w:r>
-      <w:r>
-        <w:t xml:space="preserve"> </w:t>
-      </w:r>
-      <w:r>
-        <w:t xml:space="preserve">Cho phép người dùng sử dụng tài khoản Google để đăng nhập, hệ thống sẽ đồng bộ thông tin xác thực xuống SQL Server.</w:t>
+        <w:t xml:space="preserve">Mục tiêu của use case là:</w:t>
+      </w:r>
+      <w:r>
+        <w:t xml:space="preserve"> </w:t>
+      </w:r>
+      <w:r>
+        <w:t xml:space="preserve">Lưu vết dòng tiền cá nhân một cách chính xác để hệ thống có dữ liệu phân tích thống kê.</w:t>
       </w:r>
       <w:r>
         <w:t xml:space="preserve"> </w:t>
@@ -1115,13 +900,31 @@
           <w:bCs/>
           <w:b/>
         </w:rPr>
-        <w:t xml:space="preserve">Tác nhân:</w:t>
-      </w:r>
-      <w:r>
-        <w:t xml:space="preserve"> </w:t>
-      </w:r>
-      <w:r>
-        <w:t xml:space="preserve">Người dùng.</w:t>
+        <w:t xml:space="preserve">Các bước cơ bản:</w:t>
+      </w:r>
+      <w:r>
+        <w:t xml:space="preserve"> </w:t>
+      </w:r>
+      <w:r>
+        <w:t xml:space="preserve">1. Người dùng truy cập ứng dụng và vào màn hình Thêm giao dịch.</w:t>
+      </w:r>
+      <w:r>
+        <w:t xml:space="preserve"> </w:t>
+      </w:r>
+      <w:r>
+        <w:t xml:space="preserve">2. Người dùng nhập các thông số: Số tiền, Danh mục, Ngày tháng và Ghi chú (nếu có).</w:t>
+      </w:r>
+      <w:r>
+        <w:t xml:space="preserve"> </w:t>
+      </w:r>
+      <w:r>
+        <w:t xml:space="preserve">3. Người dùng xác nhận lưu giao dịch.</w:t>
+      </w:r>
+      <w:r>
+        <w:t xml:space="preserve"> </w:t>
+      </w:r>
+      <w:r>
+        <w:t xml:space="preserve">4. Hệ thống ghi nhận dữ liệu vào cơ sở dữ liệu và tự động cập nhật lại tổng số dư cũng như biểu đồ thống kê.</w:t>
       </w:r>
       <w:r>
         <w:t xml:space="preserve"> </w:t>
@@ -1137,13 +940,7 @@
           <w:bCs/>
           <w:b/>
         </w:rPr>
-        <w:t xml:space="preserve">Tiền điều kiện:</w:t>
-      </w:r>
-      <w:r>
-        <w:t xml:space="preserve"> </w:t>
-      </w:r>
-      <w:r>
-        <w:t xml:space="preserve">Thiết bị có kết nối mạng internet.</w:t>
+        <w:t xml:space="preserve">Các dòng thay thế:</w:t>
       </w:r>
       <w:r>
         <w:t xml:space="preserve"> </w:t>
@@ -1154,99 +951,52 @@
       <w:r>
         <w:t xml:space="preserve"> </w:t>
       </w:r>
+      <w:r>
+        <w:rPr>
+          <w:iCs/>
+          <w:i/>
+        </w:rPr>
+        <w:t xml:space="preserve">Tại bước 2:</w:t>
+      </w:r>
+      <w:r>
+        <w:t xml:space="preserve"> </w:t>
+      </w:r>
+      <w:r>
+        <w:t xml:space="preserve">Nếu người dùng nhập sai định dạng số tiền (hoặc số tiền &lt;= 0), hệ thống sẽ cảnh báo đỏ và yêu cầu nhập lại, không cho phép lưu.</w:t>
+      </w:r>
+    </w:p>
+    <w:p>
+      <w:pPr>
+        <w:pStyle w:val="BodyText"/>
+      </w:pPr>
       <w:r>
         <w:rPr>
           <w:bCs/>
           <w:b/>
         </w:rPr>
-        <w:t xml:space="preserve">Luồng sự kiện chính:</w:t>
-      </w:r>
-      <w:r>
-        <w:t xml:space="preserve"> </w:t>
-      </w:r>
-      <w:r>
-        <w:t xml:space="preserve">1. Người dùng bấm nút</w:t>
-      </w:r>
-      <w:r>
-        <w:t xml:space="preserve"> </w:t>
-      </w:r>
-      <w:r>
-        <w:t xml:space="preserve">“</w:t>
-      </w:r>
-      <w:r>
-        <w:t xml:space="preserve">Đăng nhập với Google</w:t>
-      </w:r>
-      <w:r>
-        <w:t xml:space="preserve">”</w:t>
-      </w:r>
-      <w:r>
-        <w:t xml:space="preserve">.</w:t>
-      </w:r>
-      <w:r>
-        <w:t xml:space="preserve"> </w:t>
-      </w:r>
-      <w:r>
-        <w:t xml:space="preserve">2. Ứng dụng chuyển hướng sang giao diện xác thực của Google Firebase.</w:t>
-      </w:r>
-      <w:r>
-        <w:t xml:space="preserve"> </w:t>
-      </w:r>
-      <w:r>
-        <w:t xml:space="preserve">3. Người dùng chọn tài khoản và cấp quyền.</w:t>
-      </w:r>
-      <w:r>
-        <w:t xml:space="preserve"> </w:t>
-      </w:r>
-      <w:r>
-        <w:t xml:space="preserve">4. Firebase trả về UID và thông tin (Email, Tên, Ảnh đại diện).</w:t>
-      </w:r>
-      <w:r>
-        <w:t xml:space="preserve"> </w:t>
-      </w:r>
-      <w:r>
-        <w:t xml:space="preserve">5. Ứng dụng gọi dịch vụ SQL Server (hàm</w:t>
-      </w:r>
-      <w:r>
-        <w:t xml:space="preserve"> </w:t>
-      </w:r>
-      <w:r>
-        <w:rPr>
-          <w:rStyle w:val="VerbatimChar"/>
-        </w:rPr>
-        <w:t xml:space="preserve">_syncUserToSql</w:t>
-      </w:r>
-      <w:r>
-        <w:t xml:space="preserve">) để kiểm tra. Nếu UID chưa tồn tại, thêm mới vào bảng</w:t>
-      </w:r>
-      <w:r>
-        <w:t xml:space="preserve"> </w:t>
-      </w:r>
-      <w:r>
-        <w:rPr>
-          <w:rStyle w:val="VerbatimChar"/>
-        </w:rPr>
-        <w:t xml:space="preserve">Users</w:t>
-      </w:r>
-      <w:r>
-        <w:t xml:space="preserve">; nếu đã có, tiến hành cập nhật thông tin mới nhất.</w:t>
-      </w:r>
-      <w:r>
-        <w:t xml:space="preserve"> </w:t>
-      </w:r>
-      <w:r>
-        <w:t xml:space="preserve">6. Hệ thống chuyển hướng người dùng vào màn hình chính (Dashboard).</w:t>
-      </w:r>
-    </w:p>
-    <w:p>
-      <w:pPr>
-        <w:pStyle w:val="BodyText"/>
-      </w:pPr>
+        <w:t xml:space="preserve">2. Quản lý chia sẻ chi phí nhóm</w:t>
+      </w:r>
+      <w:r>
+        <w:t xml:space="preserve"> </w:t>
+      </w:r>
+      <w:r>
+        <w:t xml:space="preserve">-</w:t>
+      </w:r>
+      <w:r>
+        <w:t xml:space="preserve"> </w:t>
+      </w:r>
       <w:r>
         <w:rPr>
           <w:bCs/>
           <w:b/>
         </w:rPr>
-        <w:t xml:space="preserve">Đặc tả UC-02: Thêm mới giao dịch chi tiêu</w:t>
+        <w:t xml:space="preserve">Use case nghiệp vụ:</w:t>
+      </w:r>
+      <w:r>
+        <w:t xml:space="preserve"> </w:t>
+      </w:r>
+      <w:r>
+        <w:t xml:space="preserve">Quản lý chia sẻ chi phí nhóm</w:t>
       </w:r>
       <w:r>
         <w:t xml:space="preserve"> </w:t>
@@ -1262,13 +1012,13 @@
           <w:bCs/>
           <w:b/>
         </w:rPr>
-        <w:t xml:space="preserve">Mô tả:</w:t>
-      </w:r>
-      <w:r>
-        <w:t xml:space="preserve"> </w:t>
-      </w:r>
-      <w:r>
-        <w:t xml:space="preserve">Ghi nhận một khoản chi tiêu mới vào hệ thống.</w:t>
+        <w:t xml:space="preserve">Use case bắt đầu khi:</w:t>
+      </w:r>
+      <w:r>
+        <w:t xml:space="preserve"> </w:t>
+      </w:r>
+      <w:r>
+        <w:t xml:space="preserve">Một nhóm người dùng (ví dụ: nhóm bạn đi du lịch, sinh viên ở chung) có phát sinh một khoản chi tiêu chung do một người đứng ra trả trước.</w:t>
       </w:r>
       <w:r>
         <w:t xml:space="preserve"> </w:t>
@@ -1284,13 +1034,13 @@
           <w:bCs/>
           <w:b/>
         </w:rPr>
-        <w:t xml:space="preserve">Tác nhân:</w:t>
-      </w:r>
-      <w:r>
-        <w:t xml:space="preserve"> </w:t>
-      </w:r>
-      <w:r>
-        <w:t xml:space="preserve">Người dùng.</w:t>
+        <w:t xml:space="preserve">Mục tiêu của use case là:</w:t>
+      </w:r>
+      <w:r>
+        <w:t xml:space="preserve"> </w:t>
+      </w:r>
+      <w:r>
+        <w:t xml:space="preserve">Tự động chia đều chi phí và tính toán công nợ giữa các thành viên một cách bình đẳng.</w:t>
       </w:r>
       <w:r>
         <w:t xml:space="preserve"> </w:t>
@@ -1306,13 +1056,37 @@
           <w:bCs/>
           <w:b/>
         </w:rPr>
-        <w:t xml:space="preserve">Tiền điều kiện:</w:t>
-      </w:r>
-      <w:r>
-        <w:t xml:space="preserve"> </w:t>
-      </w:r>
-      <w:r>
-        <w:t xml:space="preserve">Người dùng đã đăng nhập thành công.</w:t>
+        <w:t xml:space="preserve">Các bước cơ bản:</w:t>
+      </w:r>
+      <w:r>
+        <w:t xml:space="preserve"> </w:t>
+      </w:r>
+      <w:r>
+        <w:t xml:space="preserve">1. Người dùng tạo một không gian Nhóm và thêm các thành viên khác vào nhóm thông qua email/ID.</w:t>
+      </w:r>
+      <w:r>
+        <w:t xml:space="preserve"> </w:t>
+      </w:r>
+      <w:r>
+        <w:t xml:space="preserve">2. Bất kỳ thành viên nào trong nhóm cũng có thể truy cập vào Nhóm và tiến hành thêm Giao dịch nhóm.</w:t>
+      </w:r>
+      <w:r>
+        <w:t xml:space="preserve"> </w:t>
+      </w:r>
+      <w:r>
+        <w:t xml:space="preserve">3. Người dùng nhập số tiền, chọn người đã trả tiền (PaidBy) và lưu lại.</w:t>
+      </w:r>
+      <w:r>
+        <w:t xml:space="preserve"> </w:t>
+      </w:r>
+      <w:r>
+        <w:t xml:space="preserve">4. Hệ thống tính toán chia đều chi phí cho tất cả thành viên trong nhóm.</w:t>
+      </w:r>
+      <w:r>
+        <w:t xml:space="preserve"> </w:t>
+      </w:r>
+      <w:r>
+        <w:t xml:space="preserve">5. Hệ thống hiển thị bảng công nợ (Ai nợ ai bao nhiêu tiền) ngay trên màn hình chi tiết nhóm để mọi người cùng thấy.</w:t>
       </w:r>
       <w:r>
         <w:t xml:space="preserve"> </w:t>
@@ -1328,103 +1102,7 @@
           <w:bCs/>
           <w:b/>
         </w:rPr>
-        <w:t xml:space="preserve">Luồng sự kiện chính:</w:t>
-      </w:r>
-      <w:r>
-        <w:t xml:space="preserve"> </w:t>
-      </w:r>
-      <w:r>
-        <w:t xml:space="preserve">1. Người dùng chọn biểu tượng</w:t>
-      </w:r>
-      <w:r>
-        <w:t xml:space="preserve"> </w:t>
-      </w:r>
-      <w:r>
-        <w:t xml:space="preserve">“</w:t>
-      </w:r>
-      <w:r>
-        <w:t xml:space="preserve">Thêm giao dịch</w:t>
-      </w:r>
-      <w:r>
-        <w:t xml:space="preserve">”</w:t>
-      </w:r>
-      <w:r>
-        <w:t xml:space="preserve"> </w:t>
-      </w:r>
-      <w:r>
-        <w:t xml:space="preserve">(+).</w:t>
-      </w:r>
-      <w:r>
-        <w:t xml:space="preserve"> </w:t>
-      </w:r>
-      <w:r>
-        <w:t xml:space="preserve">2. Hệ thống hiển thị biểu mẫu (Form) nhập liệu.</w:t>
-      </w:r>
-      <w:r>
-        <w:t xml:space="preserve"> </w:t>
-      </w:r>
-      <w:r>
-        <w:t xml:space="preserve">3. Người dùng nhập số tiền (bắt buộc &gt; 0), chọn danh mục chi tiêu, nhập ghi chú, chọn nhóm liên quan (nếu là chi tiêu chung).</w:t>
-      </w:r>
-      <w:r>
-        <w:t xml:space="preserve"> </w:t>
-      </w:r>
-      <w:r>
-        <w:t xml:space="preserve">4. Người dùng nhấn nút</w:t>
-      </w:r>
-      <w:r>
-        <w:t xml:space="preserve"> </w:t>
-      </w:r>
-      <w:r>
-        <w:t xml:space="preserve">“</w:t>
-      </w:r>
-      <w:r>
-        <w:t xml:space="preserve">Lưu</w:t>
-      </w:r>
-      <w:r>
-        <w:t xml:space="preserve">”</w:t>
-      </w:r>
-      <w:r>
-        <w:t xml:space="preserve">.</w:t>
-      </w:r>
-      <w:r>
-        <w:t xml:space="preserve"> </w:t>
-      </w:r>
-      <w:r>
-        <w:t xml:space="preserve">5. Hệ thống gọi phương thức</w:t>
-      </w:r>
-      <w:r>
-        <w:t xml:space="preserve"> </w:t>
-      </w:r>
-      <w:r>
-        <w:rPr>
-          <w:rStyle w:val="VerbatimChar"/>
-        </w:rPr>
-        <w:t xml:space="preserve">executeWriteWithParams</w:t>
-      </w:r>
-      <w:r>
-        <w:t xml:space="preserve"> </w:t>
-      </w:r>
-      <w:r>
-        <w:t xml:space="preserve">truyền tham số vào truy vấn SQL để lưu vào bảng</w:t>
-      </w:r>
-      <w:r>
-        <w:t xml:space="preserve"> </w:t>
-      </w:r>
-      <w:r>
-        <w:rPr>
-          <w:rStyle w:val="VerbatimChar"/>
-        </w:rPr>
-        <w:t xml:space="preserve">Expenses</w:t>
-      </w:r>
-      <w:r>
-        <w:t xml:space="preserve">.</w:t>
-      </w:r>
-      <w:r>
-        <w:t xml:space="preserve"> </w:t>
-      </w:r>
-      <w:r>
-        <w:t xml:space="preserve">6. Hệ thống cập nhật lại biểu đồ thống kê và hiển thị thông báo thành công.</w:t>
+        <w:t xml:space="preserve">Các dòng thay thế:</w:t>
       </w:r>
       <w:r>
         <w:t xml:space="preserve"> </w:t>
@@ -1435,30 +1113,52 @@
       <w:r>
         <w:t xml:space="preserve"> </w:t>
       </w:r>
+      <w:r>
+        <w:rPr>
+          <w:iCs/>
+          <w:i/>
+        </w:rPr>
+        <w:t xml:space="preserve">Tại bước 1:</w:t>
+      </w:r>
+      <w:r>
+        <w:t xml:space="preserve"> </w:t>
+      </w:r>
+      <w:r>
+        <w:t xml:space="preserve">Nếu người dùng mời một người chưa có tài khoản trên hệ thống, hệ thống sẽ yêu cầu người đó tải app và đăng nhập trước.</w:t>
+      </w:r>
+    </w:p>
+    <w:p>
+      <w:pPr>
+        <w:pStyle w:val="BodyText"/>
+      </w:pPr>
       <w:r>
         <w:rPr>
           <w:bCs/>
           <w:b/>
         </w:rPr>
-        <w:t xml:space="preserve">Luồng ngoại lệ:</w:t>
-      </w:r>
-      <w:r>
-        <w:t xml:space="preserve"> </w:t>
-      </w:r>
-      <w:r>
-        <w:t xml:space="preserve">Nếu số tiền để trống hoặc bằng 0, hệ thống báo lỗi đỏ tại trường nhập liệu và chặn thao tác lưu.</w:t>
-      </w:r>
-    </w:p>
-    <w:p>
-      <w:pPr>
-        <w:pStyle w:val="BodyText"/>
-      </w:pPr>
+        <w:t xml:space="preserve">3. Tham vấn tài chính tự động</w:t>
+      </w:r>
+      <w:r>
+        <w:t xml:space="preserve"> </w:t>
+      </w:r>
+      <w:r>
+        <w:t xml:space="preserve">-</w:t>
+      </w:r>
+      <w:r>
+        <w:t xml:space="preserve"> </w:t>
+      </w:r>
       <w:r>
         <w:rPr>
           <w:bCs/>
           <w:b/>
         </w:rPr>
-        <w:t xml:space="preserve">Đặc tả UC-03: Trợ lý ảo Chatbot AI</w:t>
+        <w:t xml:space="preserve">Use case nghiệp vụ:</w:t>
+      </w:r>
+      <w:r>
+        <w:t xml:space="preserve"> </w:t>
+      </w:r>
+      <w:r>
+        <w:t xml:space="preserve">Tham vấn tài chính tự động</w:t>
       </w:r>
       <w:r>
         <w:t xml:space="preserve"> </w:t>
@@ -1474,13 +1174,13 @@
           <w:bCs/>
           <w:b/>
         </w:rPr>
-        <w:t xml:space="preserve">Mô tả:</w:t>
-      </w:r>
-      <w:r>
-        <w:t xml:space="preserve"> </w:t>
-      </w:r>
-      <w:r>
-        <w:t xml:space="preserve">Cho phép người dùng trao đổi với AI để được tư vấn tài chính.</w:t>
+        <w:t xml:space="preserve">Use case bắt đầu khi:</w:t>
+      </w:r>
+      <w:r>
+        <w:t xml:space="preserve"> </w:t>
+      </w:r>
+      <w:r>
+        <w:t xml:space="preserve">Người dùng gặp khó khăn trong việc lập kế hoạch chi tiêu hoặc cần lời khuyên về thói quen tài chính.</w:t>
       </w:r>
       <w:r>
         <w:t xml:space="preserve"> </w:t>
@@ -1496,13 +1196,13 @@
           <w:bCs/>
           <w:b/>
         </w:rPr>
-        <w:t xml:space="preserve">Tác nhân:</w:t>
-      </w:r>
-      <w:r>
-        <w:t xml:space="preserve"> </w:t>
-      </w:r>
-      <w:r>
-        <w:t xml:space="preserve">Người dùng.</w:t>
+        <w:t xml:space="preserve">Mục tiêu của use case là:</w:t>
+      </w:r>
+      <w:r>
+        <w:t xml:space="preserve"> </w:t>
+      </w:r>
+      <w:r>
+        <w:t xml:space="preserve">Cung cấp các lời khuyên thông minh, phản hồi ngay lập tức để hỗ trợ quyết định tài chính của người dùng thông qua AI.</w:t>
       </w:r>
       <w:r>
         <w:t xml:space="preserve"> </w:t>
@@ -1518,46 +1218,31 @@
           <w:bCs/>
           <w:b/>
         </w:rPr>
-        <w:t xml:space="preserve">Luồng sự kiện chính:</w:t>
-      </w:r>
-      <w:r>
-        <w:t xml:space="preserve"> </w:t>
-      </w:r>
-      <w:r>
-        <w:t xml:space="preserve">1. Người dùng truy cập vào màn hình Chatbot AI.</w:t>
-      </w:r>
-      <w:r>
-        <w:t xml:space="preserve"> </w:t>
-      </w:r>
-      <w:r>
-        <w:t xml:space="preserve">2. Người dùng nhập nội dung câu hỏi vào ô tin nhắn và nhấn gửi.</w:t>
-      </w:r>
-      <w:r>
-        <w:t xml:space="preserve"> </w:t>
-      </w:r>
-      <w:r>
-        <w:t xml:space="preserve">3. Hệ thống gửi truy vấn đến dịch vụ AI, đồng thời lưu tin nhắn của người dùng vào bảng</w:t>
-      </w:r>
-      <w:r>
-        <w:t xml:space="preserve"> </w:t>
-      </w:r>
-      <w:r>
-        <w:rPr>
-          <w:rStyle w:val="VerbatimChar"/>
-        </w:rPr>
-        <w:t xml:space="preserve">ChatMessages</w:t>
-      </w:r>
-      <w:r>
-        <w:t xml:space="preserve"> </w:t>
-      </w:r>
-      <w:r>
-        <w:t xml:space="preserve">(</w:t>
-      </w:r>
-      <w:r>
-        <w:rPr>
-          <w:rStyle w:val="VerbatimChar"/>
-        </w:rPr>
-        <w:t xml:space="preserve">IsUser = 1</w:t>
+        <w:t xml:space="preserve">Các bước cơ bản:</w:t>
+      </w:r>
+      <w:r>
+        <w:t xml:space="preserve"> </w:t>
+      </w:r>
+      <w:r>
+        <w:t xml:space="preserve">1. Người dùng mở giao diện Chatbot AI trong ứng dụng.</w:t>
+      </w:r>
+      <w:r>
+        <w:t xml:space="preserve"> </w:t>
+      </w:r>
+      <w:r>
+        <w:t xml:space="preserve">2. Người dùng nhập câu hỏi (ví dụ:</w:t>
+      </w:r>
+      <w:r>
+        <w:t xml:space="preserve"> </w:t>
+      </w:r>
+      <w:r>
+        <w:t xml:space="preserve">“</w:t>
+      </w:r>
+      <w:r>
+        <w:t xml:space="preserve">Làm sao để tiết kiệm tiền ăn tháng này?</w:t>
+      </w:r>
+      <w:r>
+        <w:t xml:space="preserve">”</w:t>
       </w:r>
       <w:r>
         <w:t xml:space="preserve">).</w:t>
@@ -1566,42 +1251,248 @@
         <w:t xml:space="preserve"> </w:t>
       </w:r>
       <w:r>
-        <w:t xml:space="preserve">4. Hệ thống nhận phản hồi từ AI, hiển thị lên màn hình và lưu tin nhắn phản hồi vào bảng</w:t>
-      </w:r>
-      <w:r>
-        <w:t xml:space="preserve"> </w:t>
-      </w:r>
-      <w:r>
-        <w:rPr>
-          <w:rStyle w:val="VerbatimChar"/>
-        </w:rPr>
-        <w:t xml:space="preserve">ChatMessages</w:t>
-      </w:r>
-      <w:r>
-        <w:t xml:space="preserve"> </w:t>
-      </w:r>
-      <w:r>
-        <w:t xml:space="preserve">(</w:t>
-      </w:r>
-      <w:r>
-        <w:rPr>
-          <w:rStyle w:val="VerbatimChar"/>
-        </w:rPr>
-        <w:t xml:space="preserve">IsUser = 0</w:t>
-      </w:r>
-      <w:r>
-        <w:t xml:space="preserve">).</w:t>
+        <w:t xml:space="preserve">3. Hệ thống gửi câu hỏi đến dịch vụ AI.</w:t>
+      </w:r>
+      <w:r>
+        <w:t xml:space="preserve"> </w:t>
+      </w:r>
+      <w:r>
+        <w:t xml:space="preserve">4. AI xử lý, sinh ra lời khuyên phù hợp và hệ thống hiển thị câu trả lời lên màn hình dạng bong bóng chat.</w:t>
+      </w:r>
+      <w:r>
+        <w:t xml:space="preserve"> </w:t>
+      </w:r>
+      <w:r>
+        <w:t xml:space="preserve">-</w:t>
+      </w:r>
+      <w:r>
+        <w:t xml:space="preserve"> </w:t>
+      </w:r>
+      <w:r>
+        <w:rPr>
+          <w:bCs/>
+          <w:b/>
+        </w:rPr>
+        <w:t xml:space="preserve">Các dòng thay thế:</w:t>
+      </w:r>
+      <w:r>
+        <w:t xml:space="preserve"> </w:t>
+      </w:r>
+      <w:r>
+        <w:t xml:space="preserve">-</w:t>
+      </w:r>
+      <w:r>
+        <w:t xml:space="preserve"> </w:t>
+      </w:r>
+      <w:r>
+        <w:rPr>
+          <w:iCs/>
+          <w:i/>
+        </w:rPr>
+        <w:t xml:space="preserve">Tại bước 3:</w:t>
+      </w:r>
+      <w:r>
+        <w:t xml:space="preserve"> </w:t>
+      </w:r>
+      <w:r>
+        <w:t xml:space="preserve">Nếu hệ thống mất kết nối mạng, Chatbot sẽ hiển thị thông báo lỗi kết nối và yêu cầu người dùng thử lại sau.</w:t>
+      </w:r>
+    </w:p>
+    <w:p>
+      <w:pPr>
+        <w:pStyle w:val="BodyText"/>
+      </w:pPr>
+      <w:r>
+        <w:rPr>
+          <w:bCs/>
+          <w:b/>
+        </w:rPr>
+        <w:t xml:space="preserve">4. Lập và theo dõi mục tiêu tiết kiệm</w:t>
+      </w:r>
+      <w:r>
+        <w:t xml:space="preserve"> </w:t>
+      </w:r>
+      <w:r>
+        <w:t xml:space="preserve">-</w:t>
+      </w:r>
+      <w:r>
+        <w:t xml:space="preserve"> </w:t>
+      </w:r>
+      <w:r>
+        <w:rPr>
+          <w:bCs/>
+          <w:b/>
+        </w:rPr>
+        <w:t xml:space="preserve">Use case nghiệp vụ:</w:t>
+      </w:r>
+      <w:r>
+        <w:t xml:space="preserve"> </w:t>
+      </w:r>
+      <w:r>
+        <w:t xml:space="preserve">Lập và theo dõi mục tiêu tiết kiệm</w:t>
+      </w:r>
+      <w:r>
+        <w:t xml:space="preserve"> </w:t>
+      </w:r>
+      <w:r>
+        <w:t xml:space="preserve">-</w:t>
+      </w:r>
+      <w:r>
+        <w:t xml:space="preserve"> </w:t>
+      </w:r>
+      <w:r>
+        <w:rPr>
+          <w:bCs/>
+          <w:b/>
+        </w:rPr>
+        <w:t xml:space="preserve">Use case bắt đầu khi:</w:t>
+      </w:r>
+      <w:r>
+        <w:t xml:space="preserve"> </w:t>
+      </w:r>
+      <w:r>
+        <w:t xml:space="preserve">Người dùng muốn để dành một khoản tiền cho mục đích cụ thể (ví dụ: Mua xe, Đi du lịch).</w:t>
+      </w:r>
+      <w:r>
+        <w:t xml:space="preserve"> </w:t>
+      </w:r>
+      <w:r>
+        <w:t xml:space="preserve">-</w:t>
+      </w:r>
+      <w:r>
+        <w:t xml:space="preserve"> </w:t>
+      </w:r>
+      <w:r>
+        <w:rPr>
+          <w:bCs/>
+          <w:b/>
+        </w:rPr>
+        <w:t xml:space="preserve">Mục tiêu của use case là:</w:t>
+      </w:r>
+      <w:r>
+        <w:t xml:space="preserve"> </w:t>
+      </w:r>
+      <w:r>
+        <w:t xml:space="preserve">Giúp người dùng tạo mục tiêu và theo dõi tiến độ tích lũy theo thời gian.</w:t>
+      </w:r>
+      <w:r>
+        <w:t xml:space="preserve"> </w:t>
+      </w:r>
+      <w:r>
+        <w:t xml:space="preserve">-</w:t>
+      </w:r>
+      <w:r>
+        <w:t xml:space="preserve"> </w:t>
+      </w:r>
+      <w:r>
+        <w:rPr>
+          <w:bCs/>
+          <w:b/>
+        </w:rPr>
+        <w:t xml:space="preserve">Các bước cơ bản:</w:t>
+      </w:r>
+      <w:r>
+        <w:t xml:space="preserve"> </w:t>
+      </w:r>
+      <w:r>
+        <w:t xml:space="preserve">1. Người dùng truy cập chức năng Mục tiêu tiết kiệm và chọn</w:t>
+      </w:r>
+      <w:r>
+        <w:t xml:space="preserve"> </w:t>
+      </w:r>
+      <w:r>
+        <w:t xml:space="preserve">“</w:t>
+      </w:r>
+      <w:r>
+        <w:t xml:space="preserve">Tạo mới</w:t>
+      </w:r>
+      <w:r>
+        <w:t xml:space="preserve">”</w:t>
+      </w:r>
+      <w:r>
+        <w:t xml:space="preserve">.</w:t>
+      </w:r>
+      <w:r>
+        <w:t xml:space="preserve"> </w:t>
+      </w:r>
+      <w:r>
+        <w:t xml:space="preserve">2. Người dùng nhập tên mục tiêu, số tiền cần đạt và ngày đến hạn.</w:t>
+      </w:r>
+      <w:r>
+        <w:t xml:space="preserve"> </w:t>
+      </w:r>
+      <w:r>
+        <w:t xml:space="preserve">3. Hệ thống lưu mục tiêu và khởi tạo tiến độ ở mức 0%.</w:t>
+      </w:r>
+      <w:r>
+        <w:t xml:space="preserve"> </w:t>
+      </w:r>
+      <w:r>
+        <w:t xml:space="preserve">4. Hàng tuần/tháng, người dùng cập nhật số tiền đã tích lũy thêm.</w:t>
+      </w:r>
+      <w:r>
+        <w:t xml:space="preserve"> </w:t>
+      </w:r>
+      <w:r>
+        <w:t xml:space="preserve">5. Hệ thống tính toán lại % hoàn thành và hiển thị thanh tiến độ (Progress bar).</w:t>
+      </w:r>
+      <w:r>
+        <w:t xml:space="preserve"> </w:t>
+      </w:r>
+      <w:r>
+        <w:t xml:space="preserve">-</w:t>
+      </w:r>
+      <w:r>
+        <w:t xml:space="preserve"> </w:t>
+      </w:r>
+      <w:r>
+        <w:rPr>
+          <w:bCs/>
+          <w:b/>
+        </w:rPr>
+        <w:t xml:space="preserve">Các dòng thay thế:</w:t>
+      </w:r>
+      <w:r>
+        <w:t xml:space="preserve"> </w:t>
+      </w:r>
+      <w:r>
+        <w:t xml:space="preserve">-</w:t>
+      </w:r>
+      <w:r>
+        <w:t xml:space="preserve"> </w:t>
+      </w:r>
+      <w:r>
+        <w:rPr>
+          <w:iCs/>
+          <w:i/>
+        </w:rPr>
+        <w:t xml:space="preserve">Tại bước 4:</w:t>
+      </w:r>
+      <w:r>
+        <w:t xml:space="preserve"> </w:t>
+      </w:r>
+      <w:r>
+        <w:t xml:space="preserve">Nếu số tiền tích lũy vượt quá mục tiêu, hệ thống sẽ chúc mừng người dùng đã hoàn thành mục tiêu sớm hạn.</w:t>
       </w:r>
     </w:p>
     <w:bookmarkEnd w:id="37"/>
     <w:bookmarkEnd w:id="38"/>
-    <w:bookmarkStart w:id="39" w:name="sơ-đồ-lớp-mức-phân-tích"/>
+    <w:bookmarkStart w:id="44" w:name="mô-hình-hóa-chức-năng"/>
     <w:p>
       <w:pPr>
         <w:pStyle w:val="Heading2"/>
       </w:pPr>
       <w:r>
-        <w:t xml:space="preserve">2.4 SƠ ĐỒ LỚP MỨC PHÂN TÍCH</w:t>
+        <w:t xml:space="preserve">2.3. MÔ HÌNH HÓA CHỨC NĂNG</w:t>
+      </w:r>
+    </w:p>
+    <w:bookmarkStart w:id="42" w:name="sơ-đồ-use-case-hệ-thống"/>
+    <w:p>
+      <w:pPr>
+        <w:pStyle w:val="Heading3"/>
+      </w:pPr>
+      <w:r>
+        <w:t xml:space="preserve">2.3.1. Sơ đồ Use Case hệ thống</w:t>
       </w:r>
     </w:p>
     <w:p>
@@ -1609,29 +1500,120 @@
         <w:pStyle w:val="FirstParagraph"/>
       </w:pPr>
       <w:r>
-        <w:t xml:space="preserve">Hệ thống được tổ chức với các lớp thực thể (Entity) đóng vai trò chứa dữ liệu và các lớp điều khiển (Controller/Provider) xử lý logic.</w:t>
-      </w:r>
-      <w:r>
-        <w:t xml:space="preserve"> </w:t>
-      </w:r>
-      <w:r>
-        <w:t xml:space="preserve">-</w:t>
-      </w:r>
-      <w:r>
-        <w:t xml:space="preserve"> </w:t>
-      </w:r>
+        <w:t xml:space="preserve">Dựa trên nghiệp vụ, hệ thống bao gồm các Use Case cốt lõi sau:</w:t>
+      </w:r>
+      <w:r>
+        <w:t xml:space="preserve"> </w:t>
+      </w:r>
+      <w:r>
+        <w:t xml:space="preserve">1. Đăng nhập / Đăng ký</w:t>
+      </w:r>
+      <w:r>
+        <w:t xml:space="preserve"> </w:t>
+      </w:r>
+      <w:r>
+        <w:t xml:space="preserve">2. Thêm mới giao dịch thu/chi</w:t>
+      </w:r>
+      <w:r>
+        <w:t xml:space="preserve"> </w:t>
+      </w:r>
+      <w:r>
+        <w:t xml:space="preserve">3. Chỉnh sửa / Xóa giao dịch</w:t>
+      </w:r>
+      <w:r>
+        <w:t xml:space="preserve"> </w:t>
+      </w:r>
+      <w:r>
+        <w:t xml:space="preserve">4. Quản lý mục tiêu tiết kiệm</w:t>
+      </w:r>
+      <w:r>
+        <w:t xml:space="preserve"> </w:t>
+      </w:r>
+      <w:r>
+        <w:t xml:space="preserve">5. Quản lý Nhóm (Tạo, Thêm/Xóa thành viên)</w:t>
+      </w:r>
+      <w:r>
+        <w:t xml:space="preserve"> </w:t>
+      </w:r>
+      <w:r>
+        <w:t xml:space="preserve">6. Trợ lý ảo Chatbot AI</w:t>
+      </w:r>
+    </w:p>
+    <w:p>
+      <w:pPr>
+        <w:pStyle w:val="CaptionedFigure"/>
+      </w:pPr>
+      <w:r>
+        <w:drawing>
+          <wp:inline>
+            <wp:extent cx="5397500" cy="5601641"/>
+            <wp:effectExtent b="0" l="0" r="0" t="0"/>
+            <wp:docPr descr="diagram" title="" id="40" name="Picture"/>
+            <a:graphic>
+              <a:graphicData uri="http://schemas.openxmlformats.org/drawingml/2006/picture">
+                <pic:pic>
+                  <pic:nvPicPr>
+                    <pic:cNvPr descr="./thesis_content_with_images-2.png" id="41" name="Picture"/>
+                    <pic:cNvPicPr>
+                      <a:picLocks noChangeArrowheads="1" noChangeAspect="1"/>
+                    </pic:cNvPicPr>
+                  </pic:nvPicPr>
+                  <pic:blipFill>
+                    <a:blip r:embed="rId39"/>
+                    <a:stretch>
+                      <a:fillRect/>
+                    </a:stretch>
+                  </pic:blipFill>
+                  <pic:spPr bwMode="auto">
+                    <a:xfrm>
+                      <a:off x="0" y="0"/>
+                      <a:ext cx="5397500" cy="5601641"/>
+                    </a:xfrm>
+                    <a:prstGeom prst="rect">
+                      <a:avLst/>
+                    </a:prstGeom>
+                    <a:noFill/>
+                    <a:ln w="9525">
+                      <a:noFill/>
+                      <a:headEnd/>
+                      <a:tailEnd/>
+                    </a:ln>
+                  </pic:spPr>
+                </pic:pic>
+              </a:graphicData>
+            </a:graphic>
+          </wp:inline>
+        </w:drawing>
+      </w:r>
+    </w:p>
+    <w:p>
+      <w:pPr>
+        <w:pStyle w:val="ImageCaption"/>
+      </w:pPr>
+      <w:r>
+        <w:t xml:space="preserve">diagram</w:t>
+      </w:r>
+    </w:p>
+    <w:bookmarkEnd w:id="42"/>
+    <w:bookmarkStart w:id="43" w:name="đặc-tả-use-case-hệ-thống"/>
+    <w:p>
+      <w:pPr>
+        <w:pStyle w:val="Heading3"/>
+      </w:pPr>
+      <w:r>
+        <w:t xml:space="preserve">2.3.2. Đặc tả Use Case hệ thống</w:t>
+      </w:r>
+    </w:p>
+    <w:p>
+      <w:pPr>
+        <w:pStyle w:val="FirstParagraph"/>
+      </w:pPr>
       <w:r>
         <w:rPr>
           <w:bCs/>
           <w:b/>
         </w:rPr>
-        <w:t xml:space="preserve">Lớp UserModel:</w:t>
-      </w:r>
-      <w:r>
-        <w:t xml:space="preserve"> </w:t>
-      </w:r>
-      <w:r>
-        <w:t xml:space="preserve">Lưu trữ ID, DisplayName, Email.</w:t>
+        <w:t xml:space="preserve">Đặc tả UC-01: Đăng nhập bằng Google (Hybrid Auth)</w:t>
       </w:r>
       <w:r>
         <w:t xml:space="preserve"> </w:t>
@@ -1647,13 +1629,13 @@
           <w:bCs/>
           <w:b/>
         </w:rPr>
-        <w:t xml:space="preserve">Lớp ExpenseModel:</w:t>
-      </w:r>
-      <w:r>
-        <w:t xml:space="preserve"> </w:t>
-      </w:r>
-      <w:r>
-        <w:t xml:space="preserve">Chứa Amount, Description, Date, Category, GroupId.</w:t>
+        <w:t xml:space="preserve">Mô tả:</w:t>
+      </w:r>
+      <w:r>
+        <w:t xml:space="preserve"> </w:t>
+      </w:r>
+      <w:r>
+        <w:t xml:space="preserve">Cho phép người dùng sử dụng tài khoản Google để đăng nhập, hệ thống sẽ đồng bộ thông tin xác thực xuống SQL Server.</w:t>
       </w:r>
       <w:r>
         <w:t xml:space="preserve"> </w:t>
@@ -1669,13 +1651,13 @@
           <w:bCs/>
           <w:b/>
         </w:rPr>
-        <w:t xml:space="preserve">Lớp GroupModel:</w:t>
-      </w:r>
-      <w:r>
-        <w:t xml:space="preserve"> </w:t>
-      </w:r>
-      <w:r>
-        <w:t xml:space="preserve">Chứa thông tin ngân sách (Budget) và danh sách Member.</w:t>
+        <w:t xml:space="preserve">Tác nhân:</w:t>
+      </w:r>
+      <w:r>
+        <w:t xml:space="preserve"> </w:t>
+      </w:r>
+      <w:r>
+        <w:t xml:space="preserve">Người dùng.</w:t>
       </w:r>
       <w:r>
         <w:t xml:space="preserve"> </w:t>
@@ -1691,6 +1673,560 @@
           <w:bCs/>
           <w:b/>
         </w:rPr>
+        <w:t xml:space="preserve">Tiền điều kiện:</w:t>
+      </w:r>
+      <w:r>
+        <w:t xml:space="preserve"> </w:t>
+      </w:r>
+      <w:r>
+        <w:t xml:space="preserve">Thiết bị có kết nối mạng internet.</w:t>
+      </w:r>
+      <w:r>
+        <w:t xml:space="preserve"> </w:t>
+      </w:r>
+      <w:r>
+        <w:t xml:space="preserve">-</w:t>
+      </w:r>
+      <w:r>
+        <w:t xml:space="preserve"> </w:t>
+      </w:r>
+      <w:r>
+        <w:rPr>
+          <w:bCs/>
+          <w:b/>
+        </w:rPr>
+        <w:t xml:space="preserve">Luồng sự kiện chính:</w:t>
+      </w:r>
+      <w:r>
+        <w:t xml:space="preserve"> </w:t>
+      </w:r>
+      <w:r>
+        <w:t xml:space="preserve">1. Người dùng bấm nút</w:t>
+      </w:r>
+      <w:r>
+        <w:t xml:space="preserve"> </w:t>
+      </w:r>
+      <w:r>
+        <w:t xml:space="preserve">“</w:t>
+      </w:r>
+      <w:r>
+        <w:t xml:space="preserve">Đăng nhập với Google</w:t>
+      </w:r>
+      <w:r>
+        <w:t xml:space="preserve">”</w:t>
+      </w:r>
+      <w:r>
+        <w:t xml:space="preserve">.</w:t>
+      </w:r>
+      <w:r>
+        <w:t xml:space="preserve"> </w:t>
+      </w:r>
+      <w:r>
+        <w:t xml:space="preserve">2. Ứng dụng chuyển hướng sang giao diện xác thực của Google Firebase.</w:t>
+      </w:r>
+      <w:r>
+        <w:t xml:space="preserve"> </w:t>
+      </w:r>
+      <w:r>
+        <w:t xml:space="preserve">3. Người dùng chọn tài khoản và cấp quyền.</w:t>
+      </w:r>
+      <w:r>
+        <w:t xml:space="preserve"> </w:t>
+      </w:r>
+      <w:r>
+        <w:t xml:space="preserve">4. Firebase trả về UID và thông tin (Email, Tên, Ảnh đại diện).</w:t>
+      </w:r>
+      <w:r>
+        <w:t xml:space="preserve"> </w:t>
+      </w:r>
+      <w:r>
+        <w:t xml:space="preserve">5. Ứng dụng gọi dịch vụ SQL Server (hàm</w:t>
+      </w:r>
+      <w:r>
+        <w:t xml:space="preserve"> </w:t>
+      </w:r>
+      <w:r>
+        <w:rPr>
+          <w:rStyle w:val="VerbatimChar"/>
+        </w:rPr>
+        <w:t xml:space="preserve">_syncUserToSql</w:t>
+      </w:r>
+      <w:r>
+        <w:t xml:space="preserve">) để kiểm tra. Nếu UID chưa tồn tại, thêm mới vào bảng</w:t>
+      </w:r>
+      <w:r>
+        <w:t xml:space="preserve"> </w:t>
+      </w:r>
+      <w:r>
+        <w:rPr>
+          <w:rStyle w:val="VerbatimChar"/>
+        </w:rPr>
+        <w:t xml:space="preserve">Users</w:t>
+      </w:r>
+      <w:r>
+        <w:t xml:space="preserve">; nếu đã có, tiến hành cập nhật thông tin mới nhất.</w:t>
+      </w:r>
+      <w:r>
+        <w:t xml:space="preserve"> </w:t>
+      </w:r>
+      <w:r>
+        <w:t xml:space="preserve">6. Hệ thống chuyển hướng người dùng vào màn hình chính (Dashboard).</w:t>
+      </w:r>
+    </w:p>
+    <w:p>
+      <w:pPr>
+        <w:pStyle w:val="BodyText"/>
+      </w:pPr>
+      <w:r>
+        <w:rPr>
+          <w:bCs/>
+          <w:b/>
+        </w:rPr>
+        <w:t xml:space="preserve">Đặc tả UC-02: Thêm mới giao dịch chi tiêu</w:t>
+      </w:r>
+      <w:r>
+        <w:t xml:space="preserve"> </w:t>
+      </w:r>
+      <w:r>
+        <w:t xml:space="preserve">-</w:t>
+      </w:r>
+      <w:r>
+        <w:t xml:space="preserve"> </w:t>
+      </w:r>
+      <w:r>
+        <w:rPr>
+          <w:bCs/>
+          <w:b/>
+        </w:rPr>
+        <w:t xml:space="preserve">Mô tả:</w:t>
+      </w:r>
+      <w:r>
+        <w:t xml:space="preserve"> </w:t>
+      </w:r>
+      <w:r>
+        <w:t xml:space="preserve">Ghi nhận một khoản chi tiêu mới vào hệ thống.</w:t>
+      </w:r>
+      <w:r>
+        <w:t xml:space="preserve"> </w:t>
+      </w:r>
+      <w:r>
+        <w:t xml:space="preserve">-</w:t>
+      </w:r>
+      <w:r>
+        <w:t xml:space="preserve"> </w:t>
+      </w:r>
+      <w:r>
+        <w:rPr>
+          <w:bCs/>
+          <w:b/>
+        </w:rPr>
+        <w:t xml:space="preserve">Tác nhân:</w:t>
+      </w:r>
+      <w:r>
+        <w:t xml:space="preserve"> </w:t>
+      </w:r>
+      <w:r>
+        <w:t xml:space="preserve">Người dùng.</w:t>
+      </w:r>
+      <w:r>
+        <w:t xml:space="preserve"> </w:t>
+      </w:r>
+      <w:r>
+        <w:t xml:space="preserve">-</w:t>
+      </w:r>
+      <w:r>
+        <w:t xml:space="preserve"> </w:t>
+      </w:r>
+      <w:r>
+        <w:rPr>
+          <w:bCs/>
+          <w:b/>
+        </w:rPr>
+        <w:t xml:space="preserve">Tiền điều kiện:</w:t>
+      </w:r>
+      <w:r>
+        <w:t xml:space="preserve"> </w:t>
+      </w:r>
+      <w:r>
+        <w:t xml:space="preserve">Người dùng đã đăng nhập thành công.</w:t>
+      </w:r>
+      <w:r>
+        <w:t xml:space="preserve"> </w:t>
+      </w:r>
+      <w:r>
+        <w:t xml:space="preserve">-</w:t>
+      </w:r>
+      <w:r>
+        <w:t xml:space="preserve"> </w:t>
+      </w:r>
+      <w:r>
+        <w:rPr>
+          <w:bCs/>
+          <w:b/>
+        </w:rPr>
+        <w:t xml:space="preserve">Luồng sự kiện chính:</w:t>
+      </w:r>
+      <w:r>
+        <w:t xml:space="preserve"> </w:t>
+      </w:r>
+      <w:r>
+        <w:t xml:space="preserve">1. Người dùng chọn biểu tượng</w:t>
+      </w:r>
+      <w:r>
+        <w:t xml:space="preserve"> </w:t>
+      </w:r>
+      <w:r>
+        <w:t xml:space="preserve">“</w:t>
+      </w:r>
+      <w:r>
+        <w:t xml:space="preserve">Thêm giao dịch</w:t>
+      </w:r>
+      <w:r>
+        <w:t xml:space="preserve">”</w:t>
+      </w:r>
+      <w:r>
+        <w:t xml:space="preserve"> </w:t>
+      </w:r>
+      <w:r>
+        <w:t xml:space="preserve">(+).</w:t>
+      </w:r>
+      <w:r>
+        <w:t xml:space="preserve"> </w:t>
+      </w:r>
+      <w:r>
+        <w:t xml:space="preserve">2. Hệ thống hiển thị biểu mẫu (Form) nhập liệu.</w:t>
+      </w:r>
+      <w:r>
+        <w:t xml:space="preserve"> </w:t>
+      </w:r>
+      <w:r>
+        <w:t xml:space="preserve">3. Người dùng nhập số tiền (bắt buộc &gt; 0), chọn danh mục chi tiêu, nhập ghi chú, chọn nhóm liên quan (nếu là chi tiêu chung).</w:t>
+      </w:r>
+      <w:r>
+        <w:t xml:space="preserve"> </w:t>
+      </w:r>
+      <w:r>
+        <w:t xml:space="preserve">4. Người dùng nhấn nút</w:t>
+      </w:r>
+      <w:r>
+        <w:t xml:space="preserve"> </w:t>
+      </w:r>
+      <w:r>
+        <w:t xml:space="preserve">“</w:t>
+      </w:r>
+      <w:r>
+        <w:t xml:space="preserve">Lưu</w:t>
+      </w:r>
+      <w:r>
+        <w:t xml:space="preserve">”</w:t>
+      </w:r>
+      <w:r>
+        <w:t xml:space="preserve">.</w:t>
+      </w:r>
+      <w:r>
+        <w:t xml:space="preserve"> </w:t>
+      </w:r>
+      <w:r>
+        <w:t xml:space="preserve">5. Hệ thống gọi phương thức</w:t>
+      </w:r>
+      <w:r>
+        <w:t xml:space="preserve"> </w:t>
+      </w:r>
+      <w:r>
+        <w:rPr>
+          <w:rStyle w:val="VerbatimChar"/>
+        </w:rPr>
+        <w:t xml:space="preserve">executeWriteWithParams</w:t>
+      </w:r>
+      <w:r>
+        <w:t xml:space="preserve"> </w:t>
+      </w:r>
+      <w:r>
+        <w:t xml:space="preserve">truyền tham số vào truy vấn SQL để lưu vào bảng</w:t>
+      </w:r>
+      <w:r>
+        <w:t xml:space="preserve"> </w:t>
+      </w:r>
+      <w:r>
+        <w:rPr>
+          <w:rStyle w:val="VerbatimChar"/>
+        </w:rPr>
+        <w:t xml:space="preserve">Expenses</w:t>
+      </w:r>
+      <w:r>
+        <w:t xml:space="preserve">.</w:t>
+      </w:r>
+      <w:r>
+        <w:t xml:space="preserve"> </w:t>
+      </w:r>
+      <w:r>
+        <w:t xml:space="preserve">6. Hệ thống cập nhật lại biểu đồ thống kê và hiển thị thông báo thành công.</w:t>
+      </w:r>
+      <w:r>
+        <w:t xml:space="preserve"> </w:t>
+      </w:r>
+      <w:r>
+        <w:t xml:space="preserve">-</w:t>
+      </w:r>
+      <w:r>
+        <w:t xml:space="preserve"> </w:t>
+      </w:r>
+      <w:r>
+        <w:rPr>
+          <w:bCs/>
+          <w:b/>
+        </w:rPr>
+        <w:t xml:space="preserve">Luồng ngoại lệ:</w:t>
+      </w:r>
+      <w:r>
+        <w:t xml:space="preserve"> </w:t>
+      </w:r>
+      <w:r>
+        <w:t xml:space="preserve">Nếu số tiền để trống hoặc bằng 0, hệ thống báo lỗi đỏ tại trường nhập liệu và chặn thao tác lưu.</w:t>
+      </w:r>
+    </w:p>
+    <w:p>
+      <w:pPr>
+        <w:pStyle w:val="BodyText"/>
+      </w:pPr>
+      <w:r>
+        <w:rPr>
+          <w:bCs/>
+          <w:b/>
+        </w:rPr>
+        <w:t xml:space="preserve">Đặc tả UC-03: Trợ lý ảo Chatbot AI</w:t>
+      </w:r>
+      <w:r>
+        <w:t xml:space="preserve"> </w:t>
+      </w:r>
+      <w:r>
+        <w:t xml:space="preserve">-</w:t>
+      </w:r>
+      <w:r>
+        <w:t xml:space="preserve"> </w:t>
+      </w:r>
+      <w:r>
+        <w:rPr>
+          <w:bCs/>
+          <w:b/>
+        </w:rPr>
+        <w:t xml:space="preserve">Mô tả:</w:t>
+      </w:r>
+      <w:r>
+        <w:t xml:space="preserve"> </w:t>
+      </w:r>
+      <w:r>
+        <w:t xml:space="preserve">Cho phép người dùng trao đổi với AI để được tư vấn tài chính.</w:t>
+      </w:r>
+      <w:r>
+        <w:t xml:space="preserve"> </w:t>
+      </w:r>
+      <w:r>
+        <w:t xml:space="preserve">-</w:t>
+      </w:r>
+      <w:r>
+        <w:t xml:space="preserve"> </w:t>
+      </w:r>
+      <w:r>
+        <w:rPr>
+          <w:bCs/>
+          <w:b/>
+        </w:rPr>
+        <w:t xml:space="preserve">Tác nhân:</w:t>
+      </w:r>
+      <w:r>
+        <w:t xml:space="preserve"> </w:t>
+      </w:r>
+      <w:r>
+        <w:t xml:space="preserve">Người dùng.</w:t>
+      </w:r>
+      <w:r>
+        <w:t xml:space="preserve"> </w:t>
+      </w:r>
+      <w:r>
+        <w:t xml:space="preserve">-</w:t>
+      </w:r>
+      <w:r>
+        <w:t xml:space="preserve"> </w:t>
+      </w:r>
+      <w:r>
+        <w:rPr>
+          <w:bCs/>
+          <w:b/>
+        </w:rPr>
+        <w:t xml:space="preserve">Luồng sự kiện chính:</w:t>
+      </w:r>
+      <w:r>
+        <w:t xml:space="preserve"> </w:t>
+      </w:r>
+      <w:r>
+        <w:t xml:space="preserve">1. Người dùng truy cập vào màn hình Chatbot AI.</w:t>
+      </w:r>
+      <w:r>
+        <w:t xml:space="preserve"> </w:t>
+      </w:r>
+      <w:r>
+        <w:t xml:space="preserve">2. Người dùng nhập nội dung câu hỏi vào ô tin nhắn và nhấn gửi.</w:t>
+      </w:r>
+      <w:r>
+        <w:t xml:space="preserve"> </w:t>
+      </w:r>
+      <w:r>
+        <w:t xml:space="preserve">3. Hệ thống gửi truy vấn đến dịch vụ AI, đồng thời lưu tin nhắn của người dùng vào bảng</w:t>
+      </w:r>
+      <w:r>
+        <w:t xml:space="preserve"> </w:t>
+      </w:r>
+      <w:r>
+        <w:rPr>
+          <w:rStyle w:val="VerbatimChar"/>
+        </w:rPr>
+        <w:t xml:space="preserve">ChatMessages</w:t>
+      </w:r>
+      <w:r>
+        <w:t xml:space="preserve"> </w:t>
+      </w:r>
+      <w:r>
+        <w:t xml:space="preserve">(</w:t>
+      </w:r>
+      <w:r>
+        <w:rPr>
+          <w:rStyle w:val="VerbatimChar"/>
+        </w:rPr>
+        <w:t xml:space="preserve">IsUser = 1</w:t>
+      </w:r>
+      <w:r>
+        <w:t xml:space="preserve">).</w:t>
+      </w:r>
+      <w:r>
+        <w:t xml:space="preserve"> </w:t>
+      </w:r>
+      <w:r>
+        <w:t xml:space="preserve">4. Hệ thống nhận phản hồi từ AI, hiển thị lên màn hình và lưu tin nhắn phản hồi vào bảng</w:t>
+      </w:r>
+      <w:r>
+        <w:t xml:space="preserve"> </w:t>
+      </w:r>
+      <w:r>
+        <w:rPr>
+          <w:rStyle w:val="VerbatimChar"/>
+        </w:rPr>
+        <w:t xml:space="preserve">ChatMessages</w:t>
+      </w:r>
+      <w:r>
+        <w:t xml:space="preserve"> </w:t>
+      </w:r>
+      <w:r>
+        <w:t xml:space="preserve">(</w:t>
+      </w:r>
+      <w:r>
+        <w:rPr>
+          <w:rStyle w:val="VerbatimChar"/>
+        </w:rPr>
+        <w:t xml:space="preserve">IsUser = 0</w:t>
+      </w:r>
+      <w:r>
+        <w:t xml:space="preserve">).</w:t>
+      </w:r>
+    </w:p>
+    <w:bookmarkEnd w:id="43"/>
+    <w:bookmarkEnd w:id="44"/>
+    <w:bookmarkStart w:id="48" w:name="sơ-đồ-lớp-mức-phân-tích"/>
+    <w:p>
+      <w:pPr>
+        <w:pStyle w:val="Heading2"/>
+      </w:pPr>
+      <w:r>
+        <w:t xml:space="preserve">2.4 SƠ ĐỒ LỚP MỨC PHÂN TÍCH</w:t>
+      </w:r>
+    </w:p>
+    <w:p>
+      <w:pPr>
+        <w:pStyle w:val="FirstParagraph"/>
+      </w:pPr>
+      <w:r>
+        <w:t xml:space="preserve">Hệ thống được tổ chức với các lớp thực thể (Entity) đóng vai trò chứa dữ liệu và các lớp điều khiển (Controller/Provider) xử lý logic.</w:t>
+      </w:r>
+      <w:r>
+        <w:t xml:space="preserve"> </w:t>
+      </w:r>
+      <w:r>
+        <w:t xml:space="preserve">-</w:t>
+      </w:r>
+      <w:r>
+        <w:t xml:space="preserve"> </w:t>
+      </w:r>
+      <w:r>
+        <w:rPr>
+          <w:bCs/>
+          <w:b/>
+        </w:rPr>
+        <w:t xml:space="preserve">Lớp UserModel:</w:t>
+      </w:r>
+      <w:r>
+        <w:t xml:space="preserve"> </w:t>
+      </w:r>
+      <w:r>
+        <w:t xml:space="preserve">Lưu trữ ID, DisplayName, Email.</w:t>
+      </w:r>
+      <w:r>
+        <w:t xml:space="preserve"> </w:t>
+      </w:r>
+      <w:r>
+        <w:t xml:space="preserve">-</w:t>
+      </w:r>
+      <w:r>
+        <w:t xml:space="preserve"> </w:t>
+      </w:r>
+      <w:r>
+        <w:rPr>
+          <w:bCs/>
+          <w:b/>
+        </w:rPr>
+        <w:t xml:space="preserve">Lớp ExpenseModel:</w:t>
+      </w:r>
+      <w:r>
+        <w:t xml:space="preserve"> </w:t>
+      </w:r>
+      <w:r>
+        <w:t xml:space="preserve">Chứa Amount, Description, Date, Category, GroupId.</w:t>
+      </w:r>
+      <w:r>
+        <w:t xml:space="preserve"> </w:t>
+      </w:r>
+      <w:r>
+        <w:t xml:space="preserve">-</w:t>
+      </w:r>
+      <w:r>
+        <w:t xml:space="preserve"> </w:t>
+      </w:r>
+      <w:r>
+        <w:rPr>
+          <w:bCs/>
+          <w:b/>
+        </w:rPr>
+        <w:t xml:space="preserve">Lớp GroupModel:</w:t>
+      </w:r>
+      <w:r>
+        <w:t xml:space="preserve"> </w:t>
+      </w:r>
+      <w:r>
+        <w:t xml:space="preserve">Chứa thông tin ngân sách (Budget) và danh sách Member.</w:t>
+      </w:r>
+      <w:r>
+        <w:t xml:space="preserve"> </w:t>
+      </w:r>
+      <w:r>
+        <w:t xml:space="preserve">-</w:t>
+      </w:r>
+      <w:r>
+        <w:t xml:space="preserve"> </w:t>
+      </w:r>
+      <w:r>
+        <w:rPr>
+          <w:bCs/>
+          <w:b/>
+        </w:rPr>
         <w:t xml:space="preserve">Lớp SqlServerHelper:</w:t>
       </w:r>
       <w:r>
@@ -1702,647 +2238,61 @@
     </w:p>
     <w:p>
       <w:pPr>
-        <w:pStyle w:val="SourceCode"/>
-      </w:pPr>
-      <w:r>
-        <w:rPr>
-          <w:rStyle w:val="VerbatimChar"/>
-        </w:rPr>
-        <w:t xml:space="preserve">classDiagram</w:t>
-      </w:r>
-      <w:r>
-        <w:br/>
-      </w:r>
-      <w:r>
-        <w:rPr>
-          <w:rStyle w:val="VerbatimChar"/>
-        </w:rPr>
-        <w:t xml:space="preserve">    class User {</w:t>
-      </w:r>
-      <w:r>
-        <w:br/>
-      </w:r>
-      <w:r>
-        <w:rPr>
-          <w:rStyle w:val="VerbatimChar"/>
-        </w:rPr>
-        <w:t xml:space="preserve">        - Id: String</w:t>
-      </w:r>
-      <w:r>
-        <w:br/>
-      </w:r>
-      <w:r>
-        <w:rPr>
-          <w:rStyle w:val="VerbatimChar"/>
-        </w:rPr>
-        <w:t xml:space="preserve">        - DisplayName: String</w:t>
-      </w:r>
-      <w:r>
-        <w:br/>
-      </w:r>
-      <w:r>
-        <w:rPr>
-          <w:rStyle w:val="VerbatimChar"/>
-        </w:rPr>
-        <w:t xml:space="preserve">        - Email: String</w:t>
-      </w:r>
-      <w:r>
-        <w:br/>
-      </w:r>
-      <w:r>
-        <w:rPr>
-          <w:rStyle w:val="VerbatimChar"/>
-        </w:rPr>
-        <w:t xml:space="preserve">        - PhotoUrl: String</w:t>
-      </w:r>
-      <w:r>
-        <w:br/>
-      </w:r>
-      <w:r>
-        <w:rPr>
-          <w:rStyle w:val="VerbatimChar"/>
-        </w:rPr>
-        <w:t xml:space="preserve">        - PasswordHash: String</w:t>
-      </w:r>
-      <w:r>
-        <w:br/>
-      </w:r>
-      <w:r>
-        <w:rPr>
-          <w:rStyle w:val="VerbatimChar"/>
-        </w:rPr>
-        <w:t xml:space="preserve">        - CreatedAt: DateTime</w:t>
-      </w:r>
-      <w:r>
-        <w:br/>
-      </w:r>
-      <w:r>
-        <w:rPr>
-          <w:rStyle w:val="VerbatimChar"/>
-        </w:rPr>
-        <w:t xml:space="preserve">        - LastLogin: DateTime</w:t>
-      </w:r>
-      <w:r>
-        <w:br/>
-      </w:r>
-      <w:r>
-        <w:rPr>
-          <w:rStyle w:val="VerbatimChar"/>
-        </w:rPr>
-        <w:t xml:space="preserve">        + signIn()</w:t>
-      </w:r>
-      <w:r>
-        <w:br/>
-      </w:r>
-      <w:r>
-        <w:rPr>
-          <w:rStyle w:val="VerbatimChar"/>
-        </w:rPr>
-        <w:t xml:space="preserve">        + signOut()</w:t>
-      </w:r>
-      <w:r>
-        <w:br/>
-      </w:r>
-      <w:r>
-        <w:rPr>
-          <w:rStyle w:val="VerbatimChar"/>
-        </w:rPr>
-        <w:t xml:space="preserve">    }</w:t>
-      </w:r>
-      <w:r>
-        <w:br/>
-      </w:r>
-      <w:r>
-        <w:rPr>
-          <w:rStyle w:val="VerbatimChar"/>
-        </w:rPr>
-        <w:t xml:space="preserve">    </w:t>
-      </w:r>
-      <w:r>
-        <w:br/>
-      </w:r>
-      <w:r>
-        <w:rPr>
-          <w:rStyle w:val="VerbatimChar"/>
-        </w:rPr>
-        <w:t xml:space="preserve">    class Expense {</w:t>
-      </w:r>
-      <w:r>
-        <w:br/>
-      </w:r>
-      <w:r>
-        <w:rPr>
-          <w:rStyle w:val="VerbatimChar"/>
-        </w:rPr>
-        <w:t xml:space="preserve">        - Id: String</w:t>
-      </w:r>
-      <w:r>
-        <w:br/>
-      </w:r>
-      <w:r>
-        <w:rPr>
-          <w:rStyle w:val="VerbatimChar"/>
-        </w:rPr>
-        <w:t xml:space="preserve">        - GroupId: String</w:t>
-      </w:r>
-      <w:r>
-        <w:br/>
-      </w:r>
-      <w:r>
-        <w:rPr>
-          <w:rStyle w:val="VerbatimChar"/>
-        </w:rPr>
-        <w:t xml:space="preserve">        - Amount: Float</w:t>
-      </w:r>
-      <w:r>
-        <w:br/>
-      </w:r>
-      <w:r>
-        <w:rPr>
-          <w:rStyle w:val="VerbatimChar"/>
-        </w:rPr>
-        <w:t xml:space="preserve">        - Description: String</w:t>
-      </w:r>
-      <w:r>
-        <w:br/>
-      </w:r>
-      <w:r>
-        <w:rPr>
-          <w:rStyle w:val="VerbatimChar"/>
-        </w:rPr>
-        <w:t xml:space="preserve">        - Category: String</w:t>
-      </w:r>
-      <w:r>
-        <w:br/>
-      </w:r>
-      <w:r>
-        <w:rPr>
-          <w:rStyle w:val="VerbatimChar"/>
-        </w:rPr>
-        <w:t xml:space="preserve">        - PaidBy: String</w:t>
-      </w:r>
-      <w:r>
-        <w:br/>
-      </w:r>
-      <w:r>
-        <w:rPr>
-          <w:rStyle w:val="VerbatimChar"/>
-        </w:rPr>
-        <w:t xml:space="preserve">        - Date: DateTime</w:t>
-      </w:r>
-      <w:r>
-        <w:br/>
-      </w:r>
-      <w:r>
-        <w:rPr>
-          <w:rStyle w:val="VerbatimChar"/>
-        </w:rPr>
-        <w:t xml:space="preserve">        - Currency: String</w:t>
-      </w:r>
-      <w:r>
-        <w:br/>
-      </w:r>
-      <w:r>
-        <w:rPr>
-          <w:rStyle w:val="VerbatimChar"/>
-        </w:rPr>
-        <w:t xml:space="preserve">        - ExchangeRate: Float</w:t>
-      </w:r>
-      <w:r>
-        <w:br/>
-      </w:r>
-      <w:r>
-        <w:rPr>
-          <w:rStyle w:val="VerbatimChar"/>
-        </w:rPr>
-        <w:t xml:space="preserve">        + createExpense()</w:t>
-      </w:r>
-      <w:r>
-        <w:br/>
-      </w:r>
-      <w:r>
-        <w:rPr>
-          <w:rStyle w:val="VerbatimChar"/>
-        </w:rPr>
-        <w:t xml:space="preserve">        + updateExpense()</w:t>
-      </w:r>
-      <w:r>
-        <w:br/>
-      </w:r>
-      <w:r>
-        <w:rPr>
-          <w:rStyle w:val="VerbatimChar"/>
-        </w:rPr>
-        <w:t xml:space="preserve">        + deleteExpense()</w:t>
-      </w:r>
-      <w:r>
-        <w:br/>
-      </w:r>
-      <w:r>
-        <w:rPr>
-          <w:rStyle w:val="VerbatimChar"/>
-        </w:rPr>
-        <w:t xml:space="preserve">    }</w:t>
-      </w:r>
-      <w:r>
-        <w:br/>
-      </w:r>
-      <w:r>
-        <w:rPr>
-          <w:rStyle w:val="VerbatimChar"/>
-        </w:rPr>
-        <w:t xml:space="preserve">    </w:t>
-      </w:r>
-      <w:r>
-        <w:br/>
-      </w:r>
-      <w:r>
-        <w:rPr>
-          <w:rStyle w:val="VerbatimChar"/>
-        </w:rPr>
-        <w:t xml:space="preserve">    class Group {</w:t>
-      </w:r>
-      <w:r>
-        <w:br/>
-      </w:r>
-      <w:r>
-        <w:rPr>
-          <w:rStyle w:val="VerbatimChar"/>
-        </w:rPr>
-        <w:t xml:space="preserve">        - Id: String</w:t>
-      </w:r>
-      <w:r>
-        <w:br/>
-      </w:r>
-      <w:r>
-        <w:rPr>
-          <w:rStyle w:val="VerbatimChar"/>
-        </w:rPr>
-        <w:t xml:space="preserve">        - Name: String</w:t>
-      </w:r>
-      <w:r>
-        <w:br/>
-      </w:r>
-      <w:r>
-        <w:rPr>
-          <w:rStyle w:val="VerbatimChar"/>
-        </w:rPr>
-        <w:t xml:space="preserve">        - Budget: Float</w:t>
-      </w:r>
-      <w:r>
-        <w:br/>
-      </w:r>
-      <w:r>
-        <w:rPr>
-          <w:rStyle w:val="VerbatimChar"/>
-        </w:rPr>
-        <w:t xml:space="preserve">        - CreatedAt: DateTime</w:t>
-      </w:r>
-      <w:r>
-        <w:br/>
-      </w:r>
-      <w:r>
-        <w:rPr>
-          <w:rStyle w:val="VerbatimChar"/>
-        </w:rPr>
-        <w:t xml:space="preserve">        + createGroup()</w:t>
-      </w:r>
-      <w:r>
-        <w:br/>
-      </w:r>
-      <w:r>
-        <w:rPr>
-          <w:rStyle w:val="VerbatimChar"/>
-        </w:rPr>
-        <w:t xml:space="preserve">        + deleteGroup()</w:t>
-      </w:r>
-      <w:r>
-        <w:br/>
-      </w:r>
-      <w:r>
-        <w:rPr>
-          <w:rStyle w:val="VerbatimChar"/>
-        </w:rPr>
-        <w:t xml:space="preserve">    }</w:t>
-      </w:r>
-      <w:r>
-        <w:br/>
-      </w:r>
-      <w:r>
-        <w:br/>
-      </w:r>
-      <w:r>
-        <w:rPr>
-          <w:rStyle w:val="VerbatimChar"/>
-        </w:rPr>
-        <w:t xml:space="preserve">    class GroupMember {</w:t>
-      </w:r>
-      <w:r>
-        <w:br/>
-      </w:r>
-      <w:r>
-        <w:rPr>
-          <w:rStyle w:val="VerbatimChar"/>
-        </w:rPr>
-        <w:t xml:space="preserve">        - GroupId: String</w:t>
-      </w:r>
-      <w:r>
-        <w:br/>
-      </w:r>
-      <w:r>
-        <w:rPr>
-          <w:rStyle w:val="VerbatimChar"/>
-        </w:rPr>
-        <w:t xml:space="preserve">        - UserId: String</w:t>
-      </w:r>
-      <w:r>
-        <w:br/>
-      </w:r>
-      <w:r>
-        <w:rPr>
-          <w:rStyle w:val="VerbatimChar"/>
-        </w:rPr>
-        <w:t xml:space="preserve">        - Role: String</w:t>
-      </w:r>
-      <w:r>
-        <w:br/>
-      </w:r>
-      <w:r>
-        <w:rPr>
-          <w:rStyle w:val="VerbatimChar"/>
-        </w:rPr>
-        <w:t xml:space="preserve">        - JoinedAt: DateTime</w:t>
-      </w:r>
-      <w:r>
-        <w:br/>
-      </w:r>
-      <w:r>
-        <w:rPr>
-          <w:rStyle w:val="VerbatimChar"/>
-        </w:rPr>
-        <w:t xml:space="preserve">        + addMember()</w:t>
-      </w:r>
-      <w:r>
-        <w:br/>
-      </w:r>
-      <w:r>
-        <w:rPr>
-          <w:rStyle w:val="VerbatimChar"/>
-        </w:rPr>
-        <w:t xml:space="preserve">        + removeMember()</w:t>
-      </w:r>
-      <w:r>
-        <w:br/>
-      </w:r>
-      <w:r>
-        <w:rPr>
-          <w:rStyle w:val="VerbatimChar"/>
-        </w:rPr>
-        <w:t xml:space="preserve">    }</w:t>
-      </w:r>
-      <w:r>
-        <w:br/>
-      </w:r>
-      <w:r>
-        <w:rPr>
-          <w:rStyle w:val="VerbatimChar"/>
-        </w:rPr>
-        <w:t xml:space="preserve">    </w:t>
-      </w:r>
-      <w:r>
-        <w:br/>
-      </w:r>
-      <w:r>
-        <w:rPr>
-          <w:rStyle w:val="VerbatimChar"/>
-        </w:rPr>
-        <w:t xml:space="preserve">    class SavingsGoal {</w:t>
-      </w:r>
-      <w:r>
-        <w:br/>
-      </w:r>
-      <w:r>
-        <w:rPr>
-          <w:rStyle w:val="VerbatimChar"/>
-        </w:rPr>
-        <w:t xml:space="preserve">        - Id: String</w:t>
-      </w:r>
-      <w:r>
-        <w:br/>
-      </w:r>
-      <w:r>
-        <w:rPr>
-          <w:rStyle w:val="VerbatimChar"/>
-        </w:rPr>
-        <w:t xml:space="preserve">        - UserId: String</w:t>
-      </w:r>
-      <w:r>
-        <w:br/>
-      </w:r>
-      <w:r>
-        <w:rPr>
-          <w:rStyle w:val="VerbatimChar"/>
-        </w:rPr>
-        <w:t xml:space="preserve">        - Name: String</w:t>
-      </w:r>
-      <w:r>
-        <w:br/>
-      </w:r>
-      <w:r>
-        <w:rPr>
-          <w:rStyle w:val="VerbatimChar"/>
-        </w:rPr>
-        <w:t xml:space="preserve">        - TargetAmount: Float</w:t>
-      </w:r>
-      <w:r>
-        <w:br/>
-      </w:r>
-      <w:r>
-        <w:rPr>
-          <w:rStyle w:val="VerbatimChar"/>
-        </w:rPr>
-        <w:t xml:space="preserve">        - CurrentAmount: Float</w:t>
-      </w:r>
-      <w:r>
-        <w:br/>
-      </w:r>
-      <w:r>
-        <w:rPr>
-          <w:rStyle w:val="VerbatimChar"/>
-        </w:rPr>
-        <w:t xml:space="preserve">        - Deadline: DateTime</w:t>
-      </w:r>
-      <w:r>
-        <w:br/>
-      </w:r>
-      <w:r>
-        <w:rPr>
-          <w:rStyle w:val="VerbatimChar"/>
-        </w:rPr>
-        <w:t xml:space="preserve">        - CreatedAt: DateTime</w:t>
-      </w:r>
-      <w:r>
-        <w:br/>
-      </w:r>
-      <w:r>
-        <w:rPr>
-          <w:rStyle w:val="VerbatimChar"/>
-        </w:rPr>
-        <w:t xml:space="preserve">        + createGoal()</w:t>
-      </w:r>
-      <w:r>
-        <w:br/>
-      </w:r>
-      <w:r>
-        <w:rPr>
-          <w:rStyle w:val="VerbatimChar"/>
-        </w:rPr>
-        <w:t xml:space="preserve">        + updateProgress()</w:t>
-      </w:r>
-      <w:r>
-        <w:br/>
-      </w:r>
-      <w:r>
-        <w:rPr>
-          <w:rStyle w:val="VerbatimChar"/>
-        </w:rPr>
-        <w:t xml:space="preserve">    }</w:t>
-      </w:r>
-      <w:r>
-        <w:br/>
-      </w:r>
-      <w:r>
-        <w:br/>
-      </w:r>
-      <w:r>
-        <w:rPr>
-          <w:rStyle w:val="VerbatimChar"/>
-        </w:rPr>
-        <w:t xml:space="preserve">    class ChatMessage {</w:t>
-      </w:r>
-      <w:r>
-        <w:br/>
-      </w:r>
-      <w:r>
-        <w:rPr>
-          <w:rStyle w:val="VerbatimChar"/>
-        </w:rPr>
-        <w:t xml:space="preserve">        - Id: String</w:t>
-      </w:r>
-      <w:r>
-        <w:br/>
-      </w:r>
-      <w:r>
-        <w:rPr>
-          <w:rStyle w:val="VerbatimChar"/>
-        </w:rPr>
-        <w:t xml:space="preserve">        - UserId: String</w:t>
-      </w:r>
-      <w:r>
-        <w:br/>
-      </w:r>
-      <w:r>
-        <w:rPr>
-          <w:rStyle w:val="VerbatimChar"/>
-        </w:rPr>
-        <w:t xml:space="preserve">        - MessageText: String</w:t>
-      </w:r>
-      <w:r>
-        <w:br/>
-      </w:r>
-      <w:r>
-        <w:rPr>
-          <w:rStyle w:val="VerbatimChar"/>
-        </w:rPr>
-        <w:t xml:space="preserve">        - IsUser: Boolean</w:t>
-      </w:r>
-      <w:r>
-        <w:br/>
-      </w:r>
-      <w:r>
-        <w:rPr>
-          <w:rStyle w:val="VerbatimChar"/>
-        </w:rPr>
-        <w:t xml:space="preserve">        - CreatedAt: DateTime</w:t>
-      </w:r>
-      <w:r>
-        <w:br/>
-      </w:r>
-      <w:r>
-        <w:rPr>
-          <w:rStyle w:val="VerbatimChar"/>
-        </w:rPr>
-        <w:t xml:space="preserve">        + saveMessage()</w:t>
-      </w:r>
-      <w:r>
-        <w:br/>
-      </w:r>
-      <w:r>
-        <w:rPr>
-          <w:rStyle w:val="VerbatimChar"/>
-        </w:rPr>
-        <w:t xml:space="preserve">    }</w:t>
-      </w:r>
-      <w:r>
-        <w:br/>
-      </w:r>
-      <w:r>
-        <w:br/>
-      </w:r>
-      <w:r>
-        <w:rPr>
-          <w:rStyle w:val="VerbatimChar"/>
-        </w:rPr>
-        <w:t xml:space="preserve">    User "1" -- "*" Expense : PaidBy &gt;</w:t>
-      </w:r>
-      <w:r>
-        <w:br/>
-      </w:r>
-      <w:r>
-        <w:rPr>
-          <w:rStyle w:val="VerbatimChar"/>
-        </w:rPr>
-        <w:t xml:space="preserve">    User "1" -- "*" SavingsGoal : Owns &gt;</w:t>
-      </w:r>
-      <w:r>
-        <w:br/>
-      </w:r>
-      <w:r>
-        <w:rPr>
-          <w:rStyle w:val="VerbatimChar"/>
-        </w:rPr>
-        <w:t xml:space="preserve">    User "1" -- "*" ChatMessage : Sends &gt;</w:t>
-      </w:r>
-      <w:r>
-        <w:br/>
-      </w:r>
-      <w:r>
-        <w:rPr>
-          <w:rStyle w:val="VerbatimChar"/>
-        </w:rPr>
-        <w:t xml:space="preserve">    Group "1" -- "*" Expense : Contains &gt;</w:t>
-      </w:r>
-      <w:r>
-        <w:br/>
-      </w:r>
-      <w:r>
-        <w:rPr>
-          <w:rStyle w:val="VerbatimChar"/>
-        </w:rPr>
-        <w:t xml:space="preserve">    Group "1" -- "*" GroupMember : Has &gt;</w:t>
-      </w:r>
-      <w:r>
-        <w:br/>
-      </w:r>
-      <w:r>
-        <w:rPr>
-          <w:rStyle w:val="VerbatimChar"/>
-        </w:rPr>
-        <w:t xml:space="preserve">    User "1" -- "*" GroupMember : Acts As &gt;</w:t>
-      </w:r>
-    </w:p>
-    <w:bookmarkEnd w:id="39"/>
-    <w:bookmarkStart w:id="40" w:name="kết-chương-1"/>
+        <w:pStyle w:val="CaptionedFigure"/>
+      </w:pPr>
+      <w:r>
+        <w:drawing>
+          <wp:inline>
+            <wp:extent cx="5397500" cy="3937971"/>
+            <wp:effectExtent b="0" l="0" r="0" t="0"/>
+            <wp:docPr descr="diagram" title="" id="46" name="Picture"/>
+            <a:graphic>
+              <a:graphicData uri="http://schemas.openxmlformats.org/drawingml/2006/picture">
+                <pic:pic>
+                  <pic:nvPicPr>
+                    <pic:cNvPr descr="./thesis_content_with_images-3.png" id="47" name="Picture"/>
+                    <pic:cNvPicPr>
+                      <a:picLocks noChangeArrowheads="1" noChangeAspect="1"/>
+                    </pic:cNvPicPr>
+                  </pic:nvPicPr>
+                  <pic:blipFill>
+                    <a:blip r:embed="rId45"/>
+                    <a:stretch>
+                      <a:fillRect/>
+                    </a:stretch>
+                  </pic:blipFill>
+                  <pic:spPr bwMode="auto">
+                    <a:xfrm>
+                      <a:off x="0" y="0"/>
+                      <a:ext cx="5397500" cy="3937971"/>
+                    </a:xfrm>
+                    <a:prstGeom prst="rect">
+                      <a:avLst/>
+                    </a:prstGeom>
+                    <a:noFill/>
+                    <a:ln w="9525">
+                      <a:noFill/>
+                      <a:headEnd/>
+                      <a:tailEnd/>
+                    </a:ln>
+                  </pic:spPr>
+                </pic:pic>
+              </a:graphicData>
+            </a:graphic>
+          </wp:inline>
+        </w:drawing>
+      </w:r>
+    </w:p>
+    <w:p>
+      <w:pPr>
+        <w:pStyle w:val="ImageCaption"/>
+      </w:pPr>
+      <w:r>
+        <w:t xml:space="preserve">diagram</w:t>
+      </w:r>
+    </w:p>
+    <w:bookmarkEnd w:id="48"/>
+    <w:bookmarkStart w:id="49" w:name="kết-chương-1"/>
     <w:p>
       <w:pPr>
         <w:pStyle w:val="Heading2"/>
@@ -2359,9 +2309,9 @@
         <w:t xml:space="preserve">Chương 2 đã thực hiện phân tích chi tiết hệ thống phần mềm Quản lý chi tiêu, từ việc định hình mô hình nghiệp vụ cho tới việc đặc tả chức năng chi tiết thông qua các Use Case cốt lõi. Sơ đồ lớp mức phân tích cũng đã bước đầu phác thảo được cấu trúc dữ liệu và mối quan hệ giữa các thành phần thực thể trong hệ thống. Những kết quả phân tích này là cơ sở trực tiếp và nền tảng vững chắc để tiến tới quá trình thiết kế chi tiết CSDL và cấu trúc mã nguồn trong Chương 3.</w:t>
       </w:r>
     </w:p>
-    <w:bookmarkEnd w:id="40"/>
-    <w:bookmarkEnd w:id="41"/>
-    <w:bookmarkStart w:id="50" w:name="chương-3-thiết-kế-hệ-thống"/>
+    <w:bookmarkEnd w:id="49"/>
+    <w:bookmarkEnd w:id="50"/>
+    <w:bookmarkStart w:id="62" w:name="chương-3-thiết-kế-hệ-thống"/>
     <w:p>
       <w:pPr>
         <w:pStyle w:val="Heading1"/>
@@ -2370,7 +2320,7 @@
         <w:t xml:space="preserve">CHƯƠNG 3: THIẾT KẾ HỆ THỐNG</w:t>
       </w:r>
     </w:p>
-    <w:bookmarkStart w:id="44" w:name="sơ-đồ-lớp-thiết-kế"/>
+    <w:bookmarkStart w:id="56" w:name="sơ-đồ-lớp-thiết-kế"/>
     <w:p>
       <w:pPr>
         <w:pStyle w:val="Heading2"/>
@@ -2389,580 +2339,60 @@
     </w:p>
     <w:p>
       <w:pPr>
-        <w:pStyle w:val="SourceCode"/>
-      </w:pPr>
-      <w:r>
-        <w:rPr>
-          <w:rStyle w:val="VerbatimChar"/>
-        </w:rPr>
-        <w:t xml:space="preserve">classDiagram</w:t>
-      </w:r>
-      <w:r>
-        <w:br/>
-      </w:r>
-      <w:r>
-        <w:rPr>
-          <w:rStyle w:val="VerbatimChar"/>
-        </w:rPr>
-        <w:t xml:space="preserve">    class UserModel {</w:t>
-      </w:r>
-      <w:r>
-        <w:br/>
-      </w:r>
-      <w:r>
-        <w:rPr>
-          <w:rStyle w:val="VerbatimChar"/>
-        </w:rPr>
-        <w:t xml:space="preserve">        + String id</w:t>
-      </w:r>
-      <w:r>
-        <w:br/>
-      </w:r>
-      <w:r>
-        <w:rPr>
-          <w:rStyle w:val="VerbatimChar"/>
-        </w:rPr>
-        <w:t xml:space="preserve">        + String displayName</w:t>
-      </w:r>
-      <w:r>
-        <w:br/>
-      </w:r>
-      <w:r>
-        <w:rPr>
-          <w:rStyle w:val="VerbatimChar"/>
-        </w:rPr>
-        <w:t xml:space="preserve">        + String email</w:t>
-      </w:r>
-      <w:r>
-        <w:br/>
-      </w:r>
-      <w:r>
-        <w:rPr>
-          <w:rStyle w:val="VerbatimChar"/>
-        </w:rPr>
-        <w:t xml:space="preserve">        + String? photoUrl</w:t>
-      </w:r>
-      <w:r>
-        <w:br/>
-      </w:r>
-      <w:r>
-        <w:rPr>
-          <w:rStyle w:val="VerbatimChar"/>
-        </w:rPr>
-        <w:t xml:space="preserve">        + copyWith() UserModel</w:t>
-      </w:r>
-      <w:r>
-        <w:br/>
-      </w:r>
-      <w:r>
-        <w:rPr>
-          <w:rStyle w:val="VerbatimChar"/>
-        </w:rPr>
-        <w:t xml:space="preserve">        + fromMap(Map~String, dynamic~ data, String id) UserModel$</w:t>
-      </w:r>
-      <w:r>
-        <w:br/>
-      </w:r>
-      <w:r>
-        <w:rPr>
-          <w:rStyle w:val="VerbatimChar"/>
-        </w:rPr>
-        <w:t xml:space="preserve">        + toMap() Map~String, dynamic~</w:t>
-      </w:r>
-      <w:r>
-        <w:br/>
-      </w:r>
-      <w:r>
-        <w:rPr>
-          <w:rStyle w:val="VerbatimChar"/>
-        </w:rPr>
-        <w:t xml:space="preserve">    }</w:t>
-      </w:r>
-      <w:r>
-        <w:br/>
-      </w:r>
-      <w:r>
-        <w:br/>
-      </w:r>
-      <w:r>
-        <w:rPr>
-          <w:rStyle w:val="VerbatimChar"/>
-        </w:rPr>
-        <w:t xml:space="preserve">    class ExpenseModel {</w:t>
-      </w:r>
-      <w:r>
-        <w:br/>
-      </w:r>
-      <w:r>
-        <w:rPr>
-          <w:rStyle w:val="VerbatimChar"/>
-        </w:rPr>
-        <w:t xml:space="preserve">        + String id</w:t>
-      </w:r>
-      <w:r>
-        <w:br/>
-      </w:r>
-      <w:r>
-        <w:rPr>
-          <w:rStyle w:val="VerbatimChar"/>
-        </w:rPr>
-        <w:t xml:space="preserve">        + String groupId</w:t>
-      </w:r>
-      <w:r>
-        <w:br/>
-      </w:r>
-      <w:r>
-        <w:rPr>
-          <w:rStyle w:val="VerbatimChar"/>
-        </w:rPr>
-        <w:t xml:space="preserve">        + String description</w:t>
-      </w:r>
-      <w:r>
-        <w:br/>
-      </w:r>
-      <w:r>
-        <w:rPr>
-          <w:rStyle w:val="VerbatimChar"/>
-        </w:rPr>
-        <w:t xml:space="preserve">        + double amount</w:t>
-      </w:r>
-      <w:r>
-        <w:br/>
-      </w:r>
-      <w:r>
-        <w:rPr>
-          <w:rStyle w:val="VerbatimChar"/>
-        </w:rPr>
-        <w:t xml:space="preserve">        + String category</w:t>
-      </w:r>
-      <w:r>
-        <w:br/>
-      </w:r>
-      <w:r>
-        <w:rPr>
-          <w:rStyle w:val="VerbatimChar"/>
-        </w:rPr>
-        <w:t xml:space="preserve">        + String paidBy</w:t>
-      </w:r>
-      <w:r>
-        <w:br/>
-      </w:r>
-      <w:r>
-        <w:rPr>
-          <w:rStyle w:val="VerbatimChar"/>
-        </w:rPr>
-        <w:t xml:space="preserve">        + DateTime date</w:t>
-      </w:r>
-      <w:r>
-        <w:br/>
-      </w:r>
-      <w:r>
-        <w:rPr>
-          <w:rStyle w:val="VerbatimChar"/>
-        </w:rPr>
-        <w:t xml:space="preserve">        + String currency</w:t>
-      </w:r>
-      <w:r>
-        <w:br/>
-      </w:r>
-      <w:r>
-        <w:rPr>
-          <w:rStyle w:val="VerbatimChar"/>
-        </w:rPr>
-        <w:t xml:space="preserve">        + double exchangeRate</w:t>
-      </w:r>
-      <w:r>
-        <w:br/>
-      </w:r>
-      <w:r>
-        <w:rPr>
-          <w:rStyle w:val="VerbatimChar"/>
-        </w:rPr>
-        <w:t xml:space="preserve">        + copyWith() ExpenseModel</w:t>
-      </w:r>
-      <w:r>
-        <w:br/>
-      </w:r>
-      <w:r>
-        <w:rPr>
-          <w:rStyle w:val="VerbatimChar"/>
-        </w:rPr>
-        <w:t xml:space="preserve">        + fromMap(Map~String, dynamic~ data, String id) ExpenseModel$</w:t>
-      </w:r>
-      <w:r>
-        <w:br/>
-      </w:r>
-      <w:r>
-        <w:rPr>
-          <w:rStyle w:val="VerbatimChar"/>
-        </w:rPr>
-        <w:t xml:space="preserve">        + toMap() Map~String, dynamic~</w:t>
-      </w:r>
-      <w:r>
-        <w:br/>
-      </w:r>
-      <w:r>
-        <w:rPr>
-          <w:rStyle w:val="VerbatimChar"/>
-        </w:rPr>
-        <w:t xml:space="preserve">    }</w:t>
-      </w:r>
-      <w:r>
-        <w:br/>
-      </w:r>
-      <w:r>
-        <w:br/>
-      </w:r>
-      <w:r>
-        <w:rPr>
-          <w:rStyle w:val="VerbatimChar"/>
-        </w:rPr>
-        <w:t xml:space="preserve">    class GroupModel {</w:t>
-      </w:r>
-      <w:r>
-        <w:br/>
-      </w:r>
-      <w:r>
-        <w:rPr>
-          <w:rStyle w:val="VerbatimChar"/>
-        </w:rPr>
-        <w:t xml:space="preserve">        + String id</w:t>
-      </w:r>
-      <w:r>
-        <w:br/>
-      </w:r>
-      <w:r>
-        <w:rPr>
-          <w:rStyle w:val="VerbatimChar"/>
-        </w:rPr>
-        <w:t xml:space="preserve">        + String name</w:t>
-      </w:r>
-      <w:r>
-        <w:br/>
-      </w:r>
-      <w:r>
-        <w:rPr>
-          <w:rStyle w:val="VerbatimChar"/>
-        </w:rPr>
-        <w:t xml:space="preserve">        + double budget</w:t>
-      </w:r>
-      <w:r>
-        <w:br/>
-      </w:r>
-      <w:r>
-        <w:rPr>
-          <w:rStyle w:val="VerbatimChar"/>
-        </w:rPr>
-        <w:t xml:space="preserve">        + DateTime createdAt</w:t>
-      </w:r>
-      <w:r>
-        <w:br/>
-      </w:r>
-      <w:r>
-        <w:rPr>
-          <w:rStyle w:val="VerbatimChar"/>
-        </w:rPr>
-        <w:t xml:space="preserve">        + copyWith() GroupModel</w:t>
-      </w:r>
-      <w:r>
-        <w:br/>
-      </w:r>
-      <w:r>
-        <w:rPr>
-          <w:rStyle w:val="VerbatimChar"/>
-        </w:rPr>
-        <w:t xml:space="preserve">        + fromMap(Map~String, dynamic~ data, String id) GroupModel$</w:t>
-      </w:r>
-      <w:r>
-        <w:br/>
-      </w:r>
-      <w:r>
-        <w:rPr>
-          <w:rStyle w:val="VerbatimChar"/>
-        </w:rPr>
-        <w:t xml:space="preserve">        + toMap() Map~String, dynamic~</w:t>
-      </w:r>
-      <w:r>
-        <w:br/>
-      </w:r>
-      <w:r>
-        <w:rPr>
-          <w:rStyle w:val="VerbatimChar"/>
-        </w:rPr>
-        <w:t xml:space="preserve">    }</w:t>
-      </w:r>
-      <w:r>
-        <w:br/>
-      </w:r>
-      <w:r>
-        <w:rPr>
-          <w:rStyle w:val="VerbatimChar"/>
-        </w:rPr>
-        <w:t xml:space="preserve">    </w:t>
-      </w:r>
-      <w:r>
-        <w:br/>
-      </w:r>
-      <w:r>
-        <w:rPr>
-          <w:rStyle w:val="VerbatimChar"/>
-        </w:rPr>
-        <w:t xml:space="preserve">    class ChatMessageModel {</w:t>
-      </w:r>
-      <w:r>
-        <w:br/>
-      </w:r>
-      <w:r>
-        <w:rPr>
-          <w:rStyle w:val="VerbatimChar"/>
-        </w:rPr>
-        <w:t xml:space="preserve">        + String id</w:t>
-      </w:r>
-      <w:r>
-        <w:br/>
-      </w:r>
-      <w:r>
-        <w:rPr>
-          <w:rStyle w:val="VerbatimChar"/>
-        </w:rPr>
-        <w:t xml:space="preserve">        + String userId</w:t>
-      </w:r>
-      <w:r>
-        <w:br/>
-      </w:r>
-      <w:r>
-        <w:rPr>
-          <w:rStyle w:val="VerbatimChar"/>
-        </w:rPr>
-        <w:t xml:space="preserve">        + String messageText</w:t>
-      </w:r>
-      <w:r>
-        <w:br/>
-      </w:r>
-      <w:r>
-        <w:rPr>
-          <w:rStyle w:val="VerbatimChar"/>
-        </w:rPr>
-        <w:t xml:space="preserve">        + bool isUser</w:t>
-      </w:r>
-      <w:r>
-        <w:br/>
-      </w:r>
-      <w:r>
-        <w:rPr>
-          <w:rStyle w:val="VerbatimChar"/>
-        </w:rPr>
-        <w:t xml:space="preserve">        + DateTime createdAt</w:t>
-      </w:r>
-      <w:r>
-        <w:br/>
-      </w:r>
-      <w:r>
-        <w:rPr>
-          <w:rStyle w:val="VerbatimChar"/>
-        </w:rPr>
-        <w:t xml:space="preserve">        + fromMap(Map~String, dynamic~ data, String id) ChatMessageModel$</w:t>
-      </w:r>
-      <w:r>
-        <w:br/>
-      </w:r>
-      <w:r>
-        <w:rPr>
-          <w:rStyle w:val="VerbatimChar"/>
-        </w:rPr>
-        <w:t xml:space="preserve">        + toMap() Map~String, dynamic~</w:t>
-      </w:r>
-      <w:r>
-        <w:br/>
-      </w:r>
-      <w:r>
-        <w:rPr>
-          <w:rStyle w:val="VerbatimChar"/>
-        </w:rPr>
-        <w:t xml:space="preserve">    }</w:t>
-      </w:r>
-      <w:r>
-        <w:br/>
-      </w:r>
-      <w:r>
-        <w:br/>
-      </w:r>
-      <w:r>
-        <w:rPr>
-          <w:rStyle w:val="VerbatimChar"/>
-        </w:rPr>
-        <w:t xml:space="preserve">    class SqlServerHelper {</w:t>
-      </w:r>
-      <w:r>
-        <w:br/>
-      </w:r>
-      <w:r>
-        <w:rPr>
-          <w:rStyle w:val="VerbatimChar"/>
-        </w:rPr>
-        <w:t xml:space="preserve">        - MssqlConnection _connection</w:t>
-      </w:r>
-      <w:r>
-        <w:br/>
-      </w:r>
-      <w:r>
-        <w:rPr>
-          <w:rStyle w:val="VerbatimChar"/>
-        </w:rPr>
-        <w:t xml:space="preserve">        + connect() Future~void~</w:t>
-      </w:r>
-      <w:r>
-        <w:br/>
-      </w:r>
-      <w:r>
-        <w:rPr>
-          <w:rStyle w:val="VerbatimChar"/>
-        </w:rPr>
-        <w:t xml:space="preserve">        + disconnect() Future~void~</w:t>
-      </w:r>
-      <w:r>
-        <w:br/>
-      </w:r>
-      <w:r>
-        <w:rPr>
-          <w:rStyle w:val="VerbatimChar"/>
-        </w:rPr>
-        <w:t xml:space="preserve">        + executeQuery(String query) Future~String~</w:t>
-      </w:r>
-      <w:r>
-        <w:br/>
-      </w:r>
-      <w:r>
-        <w:rPr>
-          <w:rStyle w:val="VerbatimChar"/>
-        </w:rPr>
-        <w:t xml:space="preserve">        + executeWrite(String query) Future~String~</w:t>
-      </w:r>
-      <w:r>
-        <w:br/>
-      </w:r>
-      <w:r>
-        <w:rPr>
-          <w:rStyle w:val="VerbatimChar"/>
-        </w:rPr>
-        <w:t xml:space="preserve">        + executeWriteWithParams(String query, Map~String, dynamic~ params) Future~String~</w:t>
-      </w:r>
-      <w:r>
-        <w:br/>
-      </w:r>
-      <w:r>
-        <w:rPr>
-          <w:rStyle w:val="VerbatimChar"/>
-        </w:rPr>
-        <w:t xml:space="preserve">    }</w:t>
-      </w:r>
-      <w:r>
-        <w:br/>
-      </w:r>
-      <w:r>
-        <w:br/>
-      </w:r>
-      <w:r>
-        <w:rPr>
-          <w:rStyle w:val="VerbatimChar"/>
-        </w:rPr>
-        <w:t xml:space="preserve">    class AuthService {</w:t>
-      </w:r>
-      <w:r>
-        <w:br/>
-      </w:r>
-      <w:r>
-        <w:rPr>
-          <w:rStyle w:val="VerbatimChar"/>
-        </w:rPr>
-        <w:t xml:space="preserve">        - FirebaseAuth _auth</w:t>
-      </w:r>
-      <w:r>
-        <w:br/>
-      </w:r>
-      <w:r>
-        <w:rPr>
-          <w:rStyle w:val="VerbatimChar"/>
-        </w:rPr>
-        <w:t xml:space="preserve">        + signInWithGoogle() Future~UserCredential?~</w:t>
-      </w:r>
-      <w:r>
-        <w:br/>
-      </w:r>
-      <w:r>
-        <w:rPr>
-          <w:rStyle w:val="VerbatimChar"/>
-        </w:rPr>
-        <w:t xml:space="preserve">        + signOut() Future~void~</w:t>
-      </w:r>
-      <w:r>
-        <w:br/>
-      </w:r>
-      <w:r>
-        <w:rPr>
-          <w:rStyle w:val="VerbatimChar"/>
-        </w:rPr>
-        <w:t xml:space="preserve">        - syncUserToSql(User user) Future~void~</w:t>
-      </w:r>
-      <w:r>
-        <w:br/>
-      </w:r>
-      <w:r>
-        <w:rPr>
-          <w:rStyle w:val="VerbatimChar"/>
-        </w:rPr>
-        <w:t xml:space="preserve">    }</w:t>
-      </w:r>
-      <w:r>
-        <w:br/>
-      </w:r>
-      <w:r>
-        <w:br/>
-      </w:r>
-      <w:r>
-        <w:rPr>
-          <w:rStyle w:val="VerbatimChar"/>
-        </w:rPr>
-        <w:t xml:space="preserve">    UserModel "*" &lt;.. "1" SqlServerHelper : Fetched by</w:t>
-      </w:r>
-      <w:r>
-        <w:br/>
-      </w:r>
-      <w:r>
-        <w:rPr>
-          <w:rStyle w:val="VerbatimChar"/>
-        </w:rPr>
-        <w:t xml:space="preserve">    ExpenseModel "*" &lt;.. "1" SqlServerHelper : Saved by</w:t>
-      </w:r>
-      <w:r>
-        <w:br/>
-      </w:r>
-      <w:r>
-        <w:rPr>
-          <w:rStyle w:val="VerbatimChar"/>
-        </w:rPr>
-        <w:t xml:space="preserve">    GroupModel "*" &lt;.. "1" SqlServerHelper : Managed by</w:t>
-      </w:r>
-      <w:r>
-        <w:br/>
-      </w:r>
-      <w:r>
-        <w:rPr>
-          <w:rStyle w:val="VerbatimChar"/>
-        </w:rPr>
-        <w:t xml:space="preserve">    ChatMessageModel "*" &lt;.. "1" SqlServerHelper : Stored by</w:t>
-      </w:r>
-      <w:r>
-        <w:br/>
-      </w:r>
-      <w:r>
-        <w:rPr>
-          <w:rStyle w:val="VerbatimChar"/>
-        </w:rPr>
-        <w:t xml:space="preserve">    AuthService ..&gt; SqlServerHelper : Uses</w:t>
-      </w:r>
-    </w:p>
-    <w:bookmarkStart w:id="42" w:name="đặc-tả-lớp-thiết-kế"/>
+        <w:pStyle w:val="CaptionedFigure"/>
+      </w:pPr>
+      <w:r>
+        <w:drawing>
+          <wp:inline>
+            <wp:extent cx="5397500" cy="1383797"/>
+            <wp:effectExtent b="0" l="0" r="0" t="0"/>
+            <wp:docPr descr="diagram" title="" id="52" name="Picture"/>
+            <a:graphic>
+              <a:graphicData uri="http://schemas.openxmlformats.org/drawingml/2006/picture">
+                <pic:pic>
+                  <pic:nvPicPr>
+                    <pic:cNvPr descr="./thesis_content_with_images-4.png" id="53" name="Picture"/>
+                    <pic:cNvPicPr>
+                      <a:picLocks noChangeArrowheads="1" noChangeAspect="1"/>
+                    </pic:cNvPicPr>
+                  </pic:nvPicPr>
+                  <pic:blipFill>
+                    <a:blip r:embed="rId51"/>
+                    <a:stretch>
+                      <a:fillRect/>
+                    </a:stretch>
+                  </pic:blipFill>
+                  <pic:spPr bwMode="auto">
+                    <a:xfrm>
+                      <a:off x="0" y="0"/>
+                      <a:ext cx="5397500" cy="1383797"/>
+                    </a:xfrm>
+                    <a:prstGeom prst="rect">
+                      <a:avLst/>
+                    </a:prstGeom>
+                    <a:noFill/>
+                    <a:ln w="9525">
+                      <a:noFill/>
+                      <a:headEnd/>
+                      <a:tailEnd/>
+                    </a:ln>
+                  </pic:spPr>
+                </pic:pic>
+              </a:graphicData>
+            </a:graphic>
+          </wp:inline>
+        </w:drawing>
+      </w:r>
+    </w:p>
+    <w:p>
+      <w:pPr>
+        <w:pStyle w:val="ImageCaption"/>
+      </w:pPr>
+      <w:r>
+        <w:t xml:space="preserve">diagram</w:t>
+      </w:r>
+    </w:p>
+    <w:bookmarkStart w:id="54" w:name="đặc-tả-lớp-thiết-kế"/>
     <w:p>
       <w:pPr>
         <w:pStyle w:val="Heading3"/>
@@ -3224,8 +2654,8 @@
         <w:t xml:space="preserve">để tuần tự hóa và giải tuần tự hóa dữ liệu JSON nhận được từ cơ sở dữ liệu.</w:t>
       </w:r>
     </w:p>
-    <w:bookmarkEnd w:id="42"/>
-    <w:bookmarkStart w:id="43" w:name="ràng-buộc-toàn-vẹn"/>
+    <w:bookmarkEnd w:id="54"/>
+    <w:bookmarkStart w:id="55" w:name="ràng-buộc-toàn-vẹn"/>
     <w:p>
       <w:pPr>
         <w:pStyle w:val="Heading3"/>
@@ -3509,9 +2939,9 @@
         <w:t xml:space="preserve">bắt buộc phải là số dương (&gt; 0).</w:t>
       </w:r>
     </w:p>
-    <w:bookmarkEnd w:id="43"/>
-    <w:bookmarkEnd w:id="44"/>
-    <w:bookmarkStart w:id="45" w:name="mô-hình-dữ-liệu"/>
+    <w:bookmarkEnd w:id="55"/>
+    <w:bookmarkEnd w:id="56"/>
+    <w:bookmarkStart w:id="57" w:name="mô-hình-dữ-liệu"/>
     <w:p>
       <w:pPr>
         <w:pStyle w:val="Heading2"/>
@@ -4071,8 +3501,8 @@
         <w:t xml:space="preserve">(DATETIME): Mốc thời gian gửi.</w:t>
       </w:r>
     </w:p>
-    <w:bookmarkEnd w:id="45"/>
-    <w:bookmarkStart w:id="49" w:name="thiết-kế-mô-hình-3-lớp"/>
+    <w:bookmarkEnd w:id="57"/>
+    <w:bookmarkStart w:id="61" w:name="thiết-kế-mô-hình-3-lớp"/>
     <w:p>
       <w:pPr>
         <w:pStyle w:val="Heading2"/>
@@ -4089,7 +3519,7 @@
         <w:t xml:space="preserve">Ứng dụng Flutter được thiết kế bám sát kiến trúc phần mềm 3 lớp (3-Tier Architecture) giúp tách biệt rõ ràng giữa Giao diện, Xử lý logic và Dữ liệu:</w:t>
       </w:r>
     </w:p>
-    <w:bookmarkStart w:id="46" w:name="tầng-giao-diện-presentation-layer"/>
+    <w:bookmarkStart w:id="58" w:name="tầng-giao-diện-presentation-layer"/>
     <w:p>
       <w:pPr>
         <w:pStyle w:val="Heading3"/>
@@ -4106,8 +3536,8 @@
         <w:t xml:space="preserve">Chứa các thành phần UI (Widgets) như màn hình Đăng nhập, Dashboard biểu đồ, danh sách chi tiêu. Tầng này không chứa logic tính toán mà chỉ lắng nghe (Listen) sự thay đổi trạng thái từ tầng Logic bằng Riverpod. Nó nhận thao tác chạm (Tap), nhập liệu (Input) của người dùng và chuyển yêu cầu xuống dưới.</w:t>
       </w:r>
     </w:p>
-    <w:bookmarkEnd w:id="46"/>
-    <w:bookmarkStart w:id="47" w:name="Xacada823c67fe20eb80c44a8ec023bca920560e"/>
+    <w:bookmarkEnd w:id="58"/>
+    <w:bookmarkStart w:id="59" w:name="Xacada823c67fe20eb80c44a8ec023bca920560e"/>
     <w:p>
       <w:pPr>
         <w:pStyle w:val="Heading3"/>
@@ -4148,8 +3578,8 @@
         <w:t xml:space="preserve">). Tại đây chứa các quy tắc nghiệp vụ như kiểm tra tính hợp lệ của số tiền nhập vào, tính toán tổng số dư ngân sách hiện tại, và ra quyết định gọi phương thức thêm, sửa, xóa dữ liệu. Tầng này sẽ định dạng tham số và truyền xuống tầng Dữ liệu.</w:t>
       </w:r>
     </w:p>
-    <w:bookmarkEnd w:id="47"/>
-    <w:bookmarkStart w:id="48" w:name="tầng-truy-cập-dữ-liệu-data-access-layer"/>
+    <w:bookmarkEnd w:id="59"/>
+    <w:bookmarkStart w:id="60" w:name="tầng-truy-cập-dữ-liệu-data-access-layer"/>
     <w:p>
       <w:pPr>
         <w:pStyle w:val="Heading3"/>
@@ -4181,10 +3611,10 @@
         <w:t xml:space="preserve">hoạt động. Nhiệm vụ duy nhất của nó là nhận các câu lệnh SQL từ tầng Logic, chuyển đổi các tham số (Parameterized Data) thành chuỗi truy vấn an toàn và giao tiếp trực tiếp với Microsoft SQL Server thông qua cổng TCP (Port 1434). Sau khi nhận được kết quả (ResultSet), nó sẽ ánh xạ thành danh sách các đối tượng Model và trả ngược lên trên.</w:t>
       </w:r>
     </w:p>
-    <w:bookmarkEnd w:id="48"/>
-    <w:bookmarkEnd w:id="49"/>
-    <w:bookmarkEnd w:id="50"/>
-    <w:bookmarkStart w:id="62" w:name="chương-4-cài-đặt-hệ-thống"/>
+    <w:bookmarkEnd w:id="60"/>
+    <w:bookmarkEnd w:id="61"/>
+    <w:bookmarkEnd w:id="62"/>
+    <w:bookmarkStart w:id="74" w:name="chương-4-cài-đặt-hệ-thống"/>
     <w:p>
       <w:pPr>
         <w:pStyle w:val="Heading1"/>
@@ -4193,7 +3623,7 @@
         <w:t xml:space="preserve">CHƯƠNG 4: CÀI ĐẶT HỆ THỐNG</w:t>
       </w:r>
     </w:p>
-    <w:bookmarkStart w:id="51" w:name="công-cụ-và-môi-trường-phát-triển"/>
+    <w:bookmarkStart w:id="63" w:name="công-cụ-và-môi-trường-phát-triển"/>
     <w:p>
       <w:pPr>
         <w:pStyle w:val="Heading2"/>
@@ -4342,8 +3772,8 @@
         <w:t xml:space="preserve">Git và GitHub.</w:t>
       </w:r>
     </w:p>
-    <w:bookmarkEnd w:id="51"/>
-    <w:bookmarkStart w:id="52" w:name="tổ-chức-mã-nguồn"/>
+    <w:bookmarkEnd w:id="63"/>
+    <w:bookmarkStart w:id="64" w:name="tổ-chức-mã-nguồn"/>
     <w:p>
       <w:pPr>
         <w:pStyle w:val="Heading2"/>
@@ -4477,8 +3907,8 @@
         <w:t xml:space="preserve">: Quản lý giao diện và logic tương tác với Chatbot AI.</w:t>
       </w:r>
     </w:p>
-    <w:bookmarkEnd w:id="52"/>
-    <w:bookmarkStart w:id="57" w:name="cài-đặt-chức-năng-cốt-lõi"/>
+    <w:bookmarkEnd w:id="64"/>
+    <w:bookmarkStart w:id="69" w:name="cài-đặt-chức-năng-cốt-lõi"/>
     <w:p>
       <w:pPr>
         <w:pStyle w:val="Heading2"/>
@@ -4487,7 +3917,7 @@
         <w:t xml:space="preserve">4.3. Cài đặt chức năng cốt lõi</w:t>
       </w:r>
     </w:p>
-    <w:bookmarkStart w:id="53" w:name="cài-đặt-cơ-chế-hybrid-auth"/>
+    <w:bookmarkStart w:id="65" w:name="cài-đặt-cơ-chế-hybrid-auth"/>
     <w:p>
       <w:pPr>
         <w:pStyle w:val="Heading3"/>
@@ -4585,8 +4015,8 @@
         <w:t xml:space="preserve">lại thông tin phòng trường hợp người dùng đổi tên trên Google.</w:t>
       </w:r>
     </w:p>
-    <w:bookmarkEnd w:id="53"/>
-    <w:bookmarkStart w:id="54" w:name="cài-đặt-tính-năng-thêm-chi-tiêu-crud"/>
+    <w:bookmarkEnd w:id="65"/>
+    <w:bookmarkStart w:id="66" w:name="cài-đặt-tính-năng-thêm-chi-tiêu-crud"/>
     <w:p>
       <w:pPr>
         <w:pStyle w:val="Heading3"/>
@@ -4669,8 +4099,8 @@
         <w:t xml:space="preserve">INSERT INTO Expenses (Id, Amount, Description, Category, Date) VALUES (@id, @amount, @desc, @cat, @date)</w:t>
       </w:r>
     </w:p>
-    <w:bookmarkEnd w:id="54"/>
-    <w:bookmarkStart w:id="55" w:name="cài-đặt-chức-năng-chatbot-ai"/>
+    <w:bookmarkEnd w:id="66"/>
+    <w:bookmarkStart w:id="67" w:name="cài-đặt-chức-năng-chatbot-ai"/>
     <w:p>
       <w:pPr>
         <w:pStyle w:val="Heading3"/>
@@ -4723,8 +4153,8 @@
         <w:t xml:space="preserve">) và hiển thị trên màn hình, giúp người dùng có lịch sử tư vấn tài chính liên tục và liền mạch.</w:t>
       </w:r>
     </w:p>
-    <w:bookmarkEnd w:id="55"/>
-    <w:bookmarkStart w:id="56" w:name="cài-đặt-đồng-bộ-sql-server-docker"/>
+    <w:bookmarkEnd w:id="67"/>
+    <w:bookmarkStart w:id="68" w:name="cài-đặt-đồng-bộ-sql-server-docker"/>
     <w:p>
       <w:pPr>
         <w:pStyle w:val="Heading3"/>
@@ -4768,9 +4198,9 @@
         <w:t xml:space="preserve">. Port nội bộ 1433 được ánh xạ ra port 1434 của máy chủ Linux vật lý (IP: 192.168.100.160) để các thiết bị di động kết nối cùng mạng Wi-Fi có thể dễ dàng truy cập.</w:t>
       </w:r>
     </w:p>
-    <w:bookmarkEnd w:id="56"/>
-    <w:bookmarkEnd w:id="57"/>
-    <w:bookmarkStart w:id="60" w:name="cài-đặt-giao-diện"/>
+    <w:bookmarkEnd w:id="68"/>
+    <w:bookmarkEnd w:id="69"/>
+    <w:bookmarkStart w:id="72" w:name="cài-đặt-giao-diện"/>
     <w:p>
       <w:pPr>
         <w:pStyle w:val="Heading2"/>
@@ -4779,7 +4209,7 @@
         <w:t xml:space="preserve">4.4. Cài đặt giao diện</w:t>
       </w:r>
     </w:p>
-    <w:bookmarkStart w:id="58" w:name="màn-hình-đăng-nhập"/>
+    <w:bookmarkStart w:id="70" w:name="màn-hình-đăng-nhập"/>
     <w:p>
       <w:pPr>
         <w:pStyle w:val="Heading3"/>
@@ -4814,8 +4244,8 @@
         <w:t xml:space="preserve">nằm ở trung tâm. Sau khi bấm, hộp thoại chuẩn của Google hiện lên để người dùng chọn tài khoản. Logo ứng dụng và Slogan được bố trí ở nửa trên màn hình.</w:t>
       </w:r>
     </w:p>
-    <w:bookmarkEnd w:id="58"/>
-    <w:bookmarkStart w:id="59" w:name="màn-hình-dashboard-và-thống-kê"/>
+    <w:bookmarkEnd w:id="70"/>
+    <w:bookmarkStart w:id="71" w:name="màn-hình-dashboard-và-thống-kê"/>
     <w:p>
       <w:pPr>
         <w:pStyle w:val="Heading3"/>
@@ -4856,9 +4286,9 @@
         <w:t xml:space="preserve">. Người dùng có thể vuốt (Swipe to dismiss) để xóa giao dịch.</w:t>
       </w:r>
     </w:p>
-    <w:bookmarkEnd w:id="59"/>
-    <w:bookmarkEnd w:id="60"/>
-    <w:bookmarkStart w:id="61" w:name="kịch-bản-kiểm-thử-test-cases"/>
+    <w:bookmarkEnd w:id="71"/>
+    <w:bookmarkEnd w:id="72"/>
+    <w:bookmarkStart w:id="73" w:name="kịch-bản-kiểm-thử-test-cases"/>
     <w:p>
       <w:pPr>
         <w:pStyle w:val="Heading2"/>
@@ -5307,9 +4737,9 @@
         </w:tc>
       </w:tr>
     </w:tbl>
-    <w:bookmarkEnd w:id="61"/>
-    <w:bookmarkEnd w:id="62"/>
-    <w:bookmarkStart w:id="63" w:name="kết-luận"/>
+    <w:bookmarkEnd w:id="73"/>
+    <w:bookmarkEnd w:id="74"/>
+    <w:bookmarkStart w:id="75" w:name="kết-luận"/>
     <w:p>
       <w:pPr>
         <w:pStyle w:val="Heading1"/>
@@ -5352,8 +4782,8 @@
         <w:t xml:space="preserve">Tuy nhiên, do giới hạn về mặt nguồn lực, hệ thống vẫn còn một số điểm cần cải thiện trong tương lai. Kiến trúc kết nối trực tiếp từ App Mobile đến CSDL chỉ thực sự an toàn trong môi trường mạng nội bộ (LAN). Hướng phát triển ưu tiên trong giai đoạn tới là bổ sung một lớp Backend trung gian (như ASP.NET Core API) nhằm xử lý toàn bộ logic truy vấn, qua đó có thể đưa hệ thống lên các nền tảng Cloud public một cách an toàn nhất. Bên cạnh đó, việc tích hợp Trí tuệ nhân tạo (AI) để quét hóa đơn tự động và phân tích xu hướng chi tiêu cũng là những tính năng đầy hứa hẹn.</w:t>
       </w:r>
     </w:p>
-    <w:bookmarkEnd w:id="63"/>
-    <w:bookmarkStart w:id="64" w:name="tài-liệu-tham-khảo"/>
+    <w:bookmarkEnd w:id="75"/>
+    <w:bookmarkStart w:id="76" w:name="tài-liệu-tham-khảo"/>
     <w:p>
       <w:pPr>
         <w:pStyle w:val="Heading1"/>
@@ -5460,7 +4890,7 @@
         <w:t xml:space="preserve">Đại học Công Thương TP.HCM, 2025.</w:t>
       </w:r>
     </w:p>
-    <w:bookmarkEnd w:id="64"/>
+    <w:bookmarkEnd w:id="76"/>
     <w:sectPr>
       <w:footerReference r:id="rId13" w:type="default"/>
       <w:pgSz w:code="9" w:h="16840" w:w="11907"/>

</xml_diff>